<commit_message>
Add meeting request and clarify GPFK/BTL service split in BELAZ letter
</commit_message>
<xml_diff>
--- a/Письма/Письмо в БЕЛАЗ - ускорение поставки и модернизации УВТР.docx
+++ b/Письма/Письмо в БЕЛАЗ - ускорение поставки и модернизации УВТР.docx
@@ -800,7 +800,7 @@
           <w:bCs/>
           <w:color w:val="000000"/>
         </w:rPr>
-        <w:t>Вынуждены констатировать, что по состоянию на сегодняшний день проблема сохраняет массовый и системный характер уже на двух предприятиях, эксплуатирующих самосвалы БЕЛАЗ-7513Т: ООО «Полюс Сухой Лог» (11 машин) и АО «Полюс Красноярск» (11 машин). На ООО «Полюс Сухой Лог», несмотря на проведённую в марте–апреле 2026г. отзывную кампанию с полной заменой секций резисторов на всех 11 машинах (по 8 шт. на каждую), уже на 5 из 11 машин (Б-302, Б-303, Б-304, Б-307, Б-309) зафиксирован повторный выход секций из строя. На АО «Полюс Красноярск» с января по июнь 2026г. по 10 из 11 машин зафиксировано 35 отдельных случаев выхода из строя секций резисторов УВТР с заменой 119 секций — то есть фактически полный комплект секций на каждой машине заменён более одного раза за полугодие.</w:t>
+        <w:t>Вынуждены констатировать, что по состоянию на сегодняшний день проблема сохраняет массовый и системный характер уже на двух предприятиях, эксплуатирующих самосвалы БЕЛАЗ-7513Т: ООО «Полюс Сухой Лог» (11 машин, сервисная организация — АО «ГПФК») и АО «Полюс Красноярск» (11 машин, сервисная организация — БТЛ). На ООО «Полюс Сухой Лог», несмотря на проведённую в марте–апреле 2026г. отзывную кампанию с полной заменой секций резисторов на всех 11 машинах (по 8 шт. на каждую), уже на 5 из 11 машин (Б-302, Б-303, Б-304, Б-307, Б-309) зафиксирован повторный выход секций из строя. На АО «Полюс Красноярск» с января по июнь 2026г. по 10 из 11 машин зафиксировано 35 отдельных случаев выхода из строя секций резисторов УВТР с заменой 119 секций — то есть фактически полный комплект секций на каждой машине заменён более одного раза за полугодие.</w:t>
       </w:r>
     </w:p>
     <w:p>
@@ -896,7 +896,7 @@
           <w:bCs/>
           <w:color w:val="000000"/>
         </w:rPr>
-        <w:t>4. До завершения модернизации обеспечить бесперебойную поставку секций резисторов надлежащего качества из резервов АО «ГПФК» на оба предприятия, исключив простои техники в ожидании запасных частей.</w:t>
+        <w:t>4. До завершения модернизации обеспечить бесперебойную поставку секций резисторов надлежащего качества в резерв сервисных организаций — АО «ГПФК» (ООО «Полюс Сухой Лог») и БТЛ (АО «Полюс Красноярск»), исключив простои техники в ожидании запасных частей.</w:t>
       </w:r>
     </w:p>
     <w:p>
@@ -916,6 +916,25 @@
           <w:color w:val="000000"/>
         </w:rPr>
         <w:t>5. Направить технических специалистов завода на АО «Полюс Красноярск» для оценки технического состояния парка и участия в выработке графика модернизации, аналогично работам, проводимым на ООО «Полюс Сухой Лог».</w:t>
+      </w:r>
+    </w:p>
+    <w:p>
+      <w:pPr>
+        <w:spacing w:after="0" w:line="360" w:lineRule="auto"/>
+        <w:jc w:val="both"/>
+        <w:rPr>
+          <w:rFonts w:ascii="Arial" w:hAnsi="Arial" w:cs="Arial"/>
+          <w:bCs/>
+          <w:color w:val="000000"/>
+        </w:rPr>
+      </w:pPr>
+      <w:r>
+        <w:rPr>
+          <w:rFonts w:ascii="Arial" w:hAnsi="Arial" w:cs="Arial"/>
+          <w:bCs/>
+          <w:color w:val="000000"/>
+        </w:rPr>
+        <w:t>6. Организовать рабочую встречу в нашем офисе с участием представителей ОАО «БЕЛАЗ» и сервисных организаций (АО «ГПФК», БТЛ) для обсуждения сложившейся ситуации и вопросов дальнейшей совместной работы по эксплуатации и техническому обслуживанию парка самосвалов БЕЛАЗ.</w:t>
       </w:r>
     </w:p>
     <w:p>

</xml_diff>

<commit_message>
Restyle letter to match tone and structure of the first BELAZ letter
</commit_message>
<xml_diff>
--- a/Письма/Письмо в БЕЛАЗ - ускорение поставки и модернизации УВТР.docx
+++ b/Письма/Письмо в БЕЛАЗ - ускорение поставки и модернизации УВТР.docx
@@ -701,7 +701,7 @@
           <w:sz w:val="18"/>
           <w:szCs w:val="12"/>
         </w:rPr>
-        <w:t>Об ускорении поставки и тиражировании модернизированных шкафов УВТР на весь парк карьерных самосвалов БЕЛАЗ-7513Т</w:t>
+        <w:t>О сроках поставки и тиражировании модернизированных УВТР БЕЛАЗ-7513Т</w:t>
       </w:r>
     </w:p>
     <w:p>
@@ -780,7 +780,7 @@
           <w:bCs/>
           <w:color w:val="000000"/>
         </w:rPr>
-        <w:t>Ссылаясь на переписку по вопросу качества секций резисторов УВТР самосвалов БЕЛАЗ-7513Т — наше письмо исх. № 10.4/682 от 15.05.2026 «О ненадлежащем качестве секций резисторов УВТР БЕЛАЗ 7513Т» и ответ ОАО «БЕЛАЗ» исх. № 430-63/856 от 02.06.2026 «О секциях резисторов УВТР», — сообщаем следующее. В ответном письме ОАО «БЕЛАЗ» сообщило о решении отгрузить в адрес ООО «Полюс Сухой Лог» два опытных шкафа УВТР (мод. 7531N-2126002) взамен вышедших из строя, о командировании специалистов завода для наладки и контроля эксплуатации оборудования, а также о проведении превентивного демонтажа и осмотра секций резисторов при ТО и замене неисправных секций из резервов АО «ГПФК» до принятия окончательного решения.</w:t>
+        <w:t>В продолжение нашего письма исх. № 10.4/682 от 15.05.2026 «О ненадлежащем качестве секций резисторов УВТР БЕЛАЗ 7513Т» сообщаем следующее. В ответ на него ОАО «БЕЛАЗ» письмом исх. № 430-63/856 от 02.06.2026 сообщило о решении отгрузить в адрес ООО «Полюс Сухой Лог» два опытных шкафа УВТР (мод. 7531N-2126002) взамен вышедших из строя и провести опытно-промышленные испытания (ОПИ) с командированием специалистов завода.</w:t>
       </w:r>
     </w:p>
     <w:p>
@@ -800,7 +800,7 @@
           <w:bCs/>
           <w:color w:val="000000"/>
         </w:rPr>
-        <w:t>Вынуждены констатировать, что по состоянию на сегодняшний день проблема сохраняет массовый и системный характер уже на двух предприятиях, эксплуатирующих самосвалы БЕЛАЗ-7513Т: ООО «Полюс Сухой Лог» (11 машин, сервисная организация — АО «ГПФК») и АО «Полюс Красноярск» (11 машин, сервисная организация — БТЛ). На ООО «Полюс Сухой Лог», несмотря на проведённую в марте–апреле 2026г. отзывную кампанию с полной заменой секций резисторов на всех 11 машинах (по 8 шт. на каждую), уже на 5 из 11 машин (Б-302, Б-303, Б-304, Б-307, Б-309) зафиксирован повторный выход секций из строя. На АО «Полюс Красноярск» с января по июнь 2026г. по 10 из 11 машин зафиксировано 35 отдельных случаев выхода из строя секций резисторов УВТР с заменой 119 секций — то есть фактически полный комплект секций на каждой машине заменён более одного раза за полугодие.</w:t>
+        <w:t>Сообщаем Вам, что ситуация с техническим состоянием машин не улучшилась, а приобрела ещё более массовый характер и сегодня затрагивает уже два предприятия: ООО «Полюс Сухой Лог» (11 машин, сервисная организация АО «ГПФК») и АО «Полюс Красноярск» (11 машин, сервисная организация БТЛ). На ООО «Полюс Сухой Лог», несмотря на отзывную кампанию март–апрель 2026г. с полной заменой секций на всех 11 машинах, уже на 5 из них зафиксирован повторный выход секций из строя. На АО «Полюс Красноярск» с января по июнь 2026г. зафиксировано 35 случаев выхода из строя секций резисторов УВТР с заменой 119 секций на 10 из 11 машин.</w:t>
       </w:r>
     </w:p>
     <w:p>
@@ -820,12 +820,13 @@
           <w:bCs/>
           <w:color w:val="000000"/>
         </w:rPr>
-        <w:t>Как и ранее, каждый такой отказ напрямую влияет на работоспособность основной тормозной системы и создаёт риск для промышленной безопасности при эксплуатации техники. Предложенное решение — поставка 2-х опытных шкафов УВТР для проведения опытно-промышленных испытаний (ОПИ) — является верным шагом, однако его масштаб (2 комплекта на парк из 22 машин) и отсутствие озвученных сроков поставки и проведения испытаний не позволяют рассчитывать на решение проблемы в приемлемые сроки, и на основании вышеизложенного просим:</w:t>
+        <w:t>Каждый случай выгорания резисторов, как и прежде, приводит к внезапному отказу основной тормозной системы, что нарушает требования промышленной безопасности и делает невозможной дальнейшую безопасную эксплуатацию техники на обоих предприятиях.</w:t>
       </w:r>
     </w:p>
     <w:p>
       <w:pPr>
         <w:spacing w:after="0" w:line="360" w:lineRule="auto"/>
+        <w:ind w:firstLine="709"/>
         <w:jc w:val="both"/>
         <w:rPr>
           <w:rFonts w:ascii="Arial" w:hAnsi="Arial" w:cs="Arial"/>
@@ -839,7 +840,7 @@
           <w:bCs/>
           <w:color w:val="000000"/>
         </w:rPr>
-        <w:t>1. Предоставить конкретный график поставки 2-х опытных шкафов УВТР 7531N-2126002 и командирования специалистов завода для их монтажа, наладки и проведения ОПИ, с указанием точных дат.</w:t>
+        <w:t>Очевидно, что предложенное решение — поставка 2-х опытных шкафов УВТР для проведения ОПИ — несоразмерно масштабу проблемы на парке из 22 машин, и на основании вышеизложенного требуем:</w:t>
       </w:r>
     </w:p>
     <w:p>
@@ -858,7 +859,7 @@
           <w:bCs/>
           <w:color w:val="000000"/>
         </w:rPr>
-        <w:t>2. Сообщить программу и плановые сроки завершения ОПИ, а также критерии принятия решения о тиражировании модернизации на остальные машины парка.</w:t>
+        <w:t>1. В течение 5 рабочих дней предоставить график поставки 2-х опытных шкафов УВТР 7531N-2126002 и проведения ОПИ, с указанием точных дат.</w:t>
       </w:r>
     </w:p>
     <w:p>
@@ -877,7 +878,7 @@
           <w:bCs/>
           <w:color w:val="000000"/>
         </w:rPr>
-        <w:t>3. Учитывая массовый и подтверждённый характер отказов на обоих предприятиях, рассмотреть возможность ускоренного тиражирования модернизированных шкафов УВТР на весь эксплуатируемый парк (22 машины), не дожидаясь завершения полного цикла ОПИ, с представлением графика поставки и монтажа по каждому предприятию.</w:t>
+        <w:t>2. Сообщить сроки завершения ОПИ и критерии принятия решения о тиражировании модернизации на весь парк.</w:t>
       </w:r>
     </w:p>
     <w:p>
@@ -896,7 +897,7 @@
           <w:bCs/>
           <w:color w:val="000000"/>
         </w:rPr>
-        <w:t>4. До завершения модернизации обеспечить бесперебойную поставку секций резисторов надлежащего качества в резерв сервисных организаций — АО «ГПФК» (ООО «Полюс Сухой Лог») и БТЛ (АО «Полюс Красноярск»), исключив простои техники в ожидании запасных частей.</w:t>
+        <w:t>3. Обеспечить ускоренное тиражирование модернизированных шкафов УВТР на все 22 машины обоих предприятий, не дожидаясь завершения полного цикла ОПИ.</w:t>
       </w:r>
     </w:p>
     <w:p>
@@ -915,7 +916,7 @@
           <w:bCs/>
           <w:color w:val="000000"/>
         </w:rPr>
-        <w:t>5. Направить технических специалистов завода на АО «Полюс Красноярск» для оценки технического состояния парка и участия в выработке графика модернизации, аналогично работам, проводимым на ООО «Полюс Сухой Лог».</w:t>
+        <w:t>4. Гарантировать бесперебойную поставку секций резисторов надлежащего качества в резерв сервисных организаций АО «ГПФК» и БТЛ до завершения модернизации.</w:t>
       </w:r>
     </w:p>
     <w:p>
@@ -934,7 +935,7 @@
           <w:bCs/>
           <w:color w:val="000000"/>
         </w:rPr>
-        <w:t>6. Организовать рабочую встречу в нашем офисе с участием представителей ОАО «БЕЛАЗ» и сервисных организаций (АО «ГПФК», БТЛ) для обсуждения сложившейся ситуации и вопросов дальнейшей совместной работы по эксплуатации и техническому обслуживанию парка самосвалов БЕЛАЗ.</w:t>
+        <w:t>5. Направить технических специалистов завода на АО «Полюс Красноярск» для оценки технического состояния парка, аналогично работам на ООО «Полюс Сухой Лог».</w:t>
       </w:r>
     </w:p>
     <w:p>
@@ -947,6 +948,14 @@
           <w:color w:val="000000"/>
         </w:rPr>
       </w:pPr>
+      <w:r>
+        <w:rPr>
+          <w:rFonts w:ascii="Arial" w:hAnsi="Arial" w:cs="Arial"/>
+          <w:bCs/>
+          <w:color w:val="000000"/>
+        </w:rPr>
+        <w:t>6. Организовать рабочую встречу в нашем офисе с участием представителей ОАО «БЕЛАЗ» и сервисных организаций (АО «ГПФК», БТЛ) для обсуждения сложившейся ситуации и дальнейшей совместной работы по эксплуатации самосвалов БЕЛАЗ.</w:t>
+      </w:r>
     </w:p>
     <w:p>
       <w:pPr>
@@ -958,13 +967,24 @@
           <w:color w:val="000000"/>
         </w:rPr>
       </w:pPr>
+    </w:p>
+    <w:p>
+      <w:pPr>
+        <w:spacing w:after="0" w:line="360" w:lineRule="auto"/>
+        <w:jc w:val="both"/>
+        <w:rPr>
+          <w:rFonts w:ascii="Arial" w:hAnsi="Arial" w:cs="Arial"/>
+          <w:bCs/>
+          <w:color w:val="000000"/>
+        </w:rPr>
+      </w:pPr>
       <w:r>
         <w:rPr>
           <w:rFonts w:ascii="Arial" w:hAnsi="Arial" w:cs="Arial"/>
           <w:bCs/>
           <w:color w:val="000000"/>
         </w:rPr>
-        <w:t>Просим рассматривать данный вопрос в приоритетном порядке ввиду прямого влияния неисправности на безопасность эксплуатации тормозной системы, и предоставить ответ с указанием конкретных сроков в течение 5 рабочих дней с даты получения настоящего письма.</w:t>
+        <w:t>Текущая статистика отказов не только наносит колоссальный ущерб производственным процессам двух предприятий, но и вновь ставит под сомнение надежность бренда «БЕЛАЗ» как производителя безопасной техники.</w:t>
       </w:r>
     </w:p>
     <w:p>

</xml_diff>

<commit_message>
Restore prior letter version, rework opening, add appendix with per-site failure tables
</commit_message>
<xml_diff>
--- a/Письма/Письмо в БЕЛАЗ - ускорение поставки и модернизации УВТР.docx
+++ b/Письма/Письмо в БЕЛАЗ - ускорение поставки и модернизации УВТР.docx
@@ -701,7 +701,7 @@
           <w:sz w:val="18"/>
           <w:szCs w:val="12"/>
         </w:rPr>
-        <w:t>О сроках поставки и тиражировании модернизированных УВТР БЕЛАЗ-7513Т</w:t>
+        <w:t>Об ускорении поставки и тиражировании модернизированных шкафов УВТР на весь парк карьерных самосвалов БЕЛАЗ-7513Т</w:t>
       </w:r>
     </w:p>
     <w:p>
@@ -780,7 +780,7 @@
           <w:bCs/>
           <w:color w:val="000000"/>
         </w:rPr>
-        <w:t>В продолжение нашего письма исх. № 10.4/682 от 15.05.2026 «О ненадлежащем качестве секций резисторов УВТР БЕЛАЗ 7513Т» сообщаем следующее. В ответ на него ОАО «БЕЛАЗ» письмом исх. № 430-63/856 от 02.06.2026 сообщило о решении отгрузить в адрес ООО «Полюс Сухой Лог» два опытных шкафа УВТР (мод. 7531N-2126002) взамен вышедших из строя и провести опытно-промышленные испытания (ОПИ) с командированием специалистов завода.</w:t>
+        <w:t>В ответ на наше письмо исх. № 10.4/682 от 15.05.2026 «О ненадлежащем качестве секций резисторов УВТР БЕЛАЗ 7513Т» ОАО «БЕЛАЗ» письмом исх. № 430-63/856 от 02.06.2026 «О секциях резисторов УВТР» сообщило о решении отгрузить в адрес ООО «Полюс Сухой Лог» два опытных шкафа УВТР (мод. 7531N-2126002) взамен вышедших из строя, о командировании специалистов завода для наладки и контроля эксплуатации оборудования, а также о проведении превентивного демонтажа и осмотра секций резисторов при ТО и замене неисправных секций из резервов АО «ГПФК» до принятия окончательного решения. Благодарим за оперативную реакцию на наше обращение.</w:t>
       </w:r>
     </w:p>
     <w:p>
@@ -800,7 +800,7 @@
           <w:bCs/>
           <w:color w:val="000000"/>
         </w:rPr>
-        <w:t>Сообщаем Вам, что ситуация с техническим состоянием машин не улучшилась, а приобрела ещё более массовый характер и сегодня затрагивает уже два предприятия: ООО «Полюс Сухой Лог» (11 машин, сервисная организация АО «ГПФК») и АО «Полюс Красноярск» (11 машин, сервисная организация БТЛ). На ООО «Полюс Сухой Лог», несмотря на отзывную кампанию март–апрель 2026г. с полной заменой секций на всех 11 машинах, уже на 5 из них зафиксирован повторный выход секций из строя. На АО «Полюс Красноярск» с января по июнь 2026г. зафиксировано 35 случаев выхода из строя секций резисторов УВТР с заменой 119 секций на 10 из 11 машин.</w:t>
+        <w:t>Вынуждены констатировать, что по состоянию на сегодняшний день проблема сохраняет массовый и системный характер уже на двух предприятиях, эксплуатирующих самосвалы БЕЛАЗ-7513Т: ООО «Полюс Сухой Лог» (11 машин, сервисная организация — АО «ГПФК») и АО «Полюс Красноярск» (11 машин, сервисная организация — БТЛ). На ООО «Полюс Сухой Лог», несмотря на проведённую в марте–апреле 2026г. отзывную кампанию с полной заменой секций резисторов на всех 11 машинах (по 8 шт. на каждую), уже на 5 из 11 машин (Б-302, Б-303, Б-304, Б-307, Б-309) зафиксирован повторный выход секций из строя. На АО «Полюс Красноярск» с января по июнь 2026г. по 10 из 11 машин зафиксировано 35 отдельных случаев выхода из строя секций резисторов УВТР с заменой 119 секций — то есть фактически полный комплект секций на каждой машине заменён более одного раза за полугодие.</w:t>
       </w:r>
     </w:p>
     <w:p>
@@ -820,27 +820,7 @@
           <w:bCs/>
           <w:color w:val="000000"/>
         </w:rPr>
-        <w:t>Каждый случай выгорания резисторов, как и прежде, приводит к внезапному отказу основной тормозной системы, что нарушает требования промышленной безопасности и делает невозможной дальнейшую безопасную эксплуатацию техники на обоих предприятиях.</w:t>
-      </w:r>
-    </w:p>
-    <w:p>
-      <w:pPr>
-        <w:spacing w:after="0" w:line="360" w:lineRule="auto"/>
-        <w:ind w:firstLine="709"/>
-        <w:jc w:val="both"/>
-        <w:rPr>
-          <w:rFonts w:ascii="Arial" w:hAnsi="Arial" w:cs="Arial"/>
-          <w:bCs/>
-          <w:color w:val="000000"/>
-        </w:rPr>
-      </w:pPr>
-      <w:r>
-        <w:rPr>
-          <w:rFonts w:ascii="Arial" w:hAnsi="Arial" w:cs="Arial"/>
-          <w:bCs/>
-          <w:color w:val="000000"/>
-        </w:rPr>
-        <w:t>Очевидно, что предложенное решение — поставка 2-х опытных шкафов УВТР для проведения ОПИ — несоразмерно масштабу проблемы на парке из 22 машин, и на основании вышеизложенного требуем:</w:t>
+        <w:t>Как и ранее, каждый такой отказ напрямую влияет на работоспособность основной тормозной системы и создаёт риск для промышленной безопасности при эксплуатации техники. Предложенное решение — поставка 2-х опытных шкафов УВТР для проведения опытно-промышленных испытаний (ОПИ) — является верным шагом, однако его масштаб (2 комплекта на парк из 22 машин) и отсутствие озвученных сроков поставки и проведения испытаний не позволяют рассчитывать на решение проблемы в приемлемые сроки, и на основании вышеизложенного просим:</w:t>
       </w:r>
     </w:p>
     <w:p>
@@ -859,7 +839,7 @@
           <w:bCs/>
           <w:color w:val="000000"/>
         </w:rPr>
-        <w:t>1. В течение 5 рабочих дней предоставить график поставки 2-х опытных шкафов УВТР 7531N-2126002 и проведения ОПИ, с указанием точных дат.</w:t>
+        <w:t>1. Предоставить конкретный график поставки 2-х опытных шкафов УВТР 7531N-2126002 и командирования специалистов завода для их монтажа, наладки и проведения ОПИ, с указанием точных дат.</w:t>
       </w:r>
     </w:p>
     <w:p>
@@ -878,7 +858,7 @@
           <w:bCs/>
           <w:color w:val="000000"/>
         </w:rPr>
-        <w:t>2. Сообщить сроки завершения ОПИ и критерии принятия решения о тиражировании модернизации на весь парк.</w:t>
+        <w:t>2. Сообщить программу и плановые сроки завершения ОПИ, а также критерии принятия решения о тиражировании модернизации на остальные машины парка.</w:t>
       </w:r>
     </w:p>
     <w:p>
@@ -897,7 +877,7 @@
           <w:bCs/>
           <w:color w:val="000000"/>
         </w:rPr>
-        <w:t>3. Обеспечить ускоренное тиражирование модернизированных шкафов УВТР на все 22 машины обоих предприятий, не дожидаясь завершения полного цикла ОПИ.</w:t>
+        <w:t>3. Учитывая массовый и подтверждённый характер отказов на обоих предприятиях, рассмотреть возможность ускоренного тиражирования модернизированных шкафов УВТР на весь эксплуатируемый парк (22 машины), не дожидаясь завершения полного цикла ОПИ, с представлением графика поставки и монтажа по каждому предприятию.</w:t>
       </w:r>
     </w:p>
     <w:p>
@@ -916,7 +896,7 @@
           <w:bCs/>
           <w:color w:val="000000"/>
         </w:rPr>
-        <w:t>4. Гарантировать бесперебойную поставку секций резисторов надлежащего качества в резерв сервисных организаций АО «ГПФК» и БТЛ до завершения модернизации.</w:t>
+        <w:t>4. До завершения модернизации обеспечить бесперебойную поставку секций резисторов надлежащего качества в резерв сервисных организаций — АО «ГПФК» (ООО «Полюс Сухой Лог») и БТЛ (АО «Полюс Красноярск»), исключив простои техники в ожидании запасных частей.</w:t>
       </w:r>
     </w:p>
     <w:p>
@@ -935,7 +915,7 @@
           <w:bCs/>
           <w:color w:val="000000"/>
         </w:rPr>
-        <w:t>5. Направить технических специалистов завода на АО «Полюс Красноярск» для оценки технического состояния парка, аналогично работам на ООО «Полюс Сухой Лог».</w:t>
+        <w:t>5. Направить технических специалистов завода на АО «Полюс Красноярск» для оценки технического состояния парка и участия в выработке графика модернизации, аналогично работам, проводимым на ООО «Полюс Сухой Лог».</w:t>
       </w:r>
     </w:p>
     <w:p>
@@ -954,7 +934,7 @@
           <w:bCs/>
           <w:color w:val="000000"/>
         </w:rPr>
-        <w:t>6. Организовать рабочую встречу в нашем офисе с участием представителей ОАО «БЕЛАЗ» и сервисных организаций (АО «ГПФК», БТЛ) для обсуждения сложившейся ситуации и дальнейшей совместной работы по эксплуатации самосвалов БЕЛАЗ.</w:t>
+        <w:t>6. Организовать рабочую встречу в нашем офисе с участием представителей ОАО «БЕЛАЗ» и сервисных организаций (АО «ГПФК», БТЛ) для обсуждения сложившейся ситуации и вопросов дальнейшей совместной работы по эксплуатации и техническому обслуживанию парка самосвалов БЕЛАЗ.</w:t>
       </w:r>
     </w:p>
     <w:p>
@@ -984,7 +964,7 @@
           <w:bCs/>
           <w:color w:val="000000"/>
         </w:rPr>
-        <w:t>Текущая статистика отказов не только наносит колоссальный ущерб производственным процессам двух предприятий, но и вновь ставит под сомнение надежность бренда «БЕЛАЗ» как производителя безопасной техники.</w:t>
+        <w:t>Просим рассматривать данный вопрос в приоритетном порядке ввиду прямого влияния неисправности на безопасность эксплуатации тормозной системы, и предоставить ответ с указанием конкретных сроков в течение 5 рабочих дней с даты получения настоящего письма.</w:t>
       </w:r>
     </w:p>
     <w:p>
@@ -1027,6 +1007,25 @@
           <w:bCs/>
         </w:rPr>
       </w:pPr>
+    </w:p>
+    <w:p>
+      <w:pPr>
+        <w:spacing w:after="0" w:line="360" w:lineRule="auto"/>
+        <w:jc w:val="both"/>
+        <w:rPr>
+          <w:rFonts w:ascii="Arial" w:hAnsi="Arial" w:cs="Arial"/>
+          <w:bCs/>
+          <w:color w:val="000000"/>
+        </w:rPr>
+      </w:pPr>
+      <w:r>
+        <w:rPr>
+          <w:rFonts w:ascii="Arial" w:hAnsi="Arial" w:cs="Arial"/>
+          <w:bCs/>
+          <w:color w:val="000000"/>
+        </w:rPr>
+        <w:t>Приложение: сводная информация об отказах секций резисторов УВТР БЕЛАЗ-7513Т по предприятиям на 2 л. в 1 экз.</w:t>
+      </w:r>
     </w:p>
     <w:p>
       <w:pPr>
@@ -1077,6 +1076,3201 @@
           <w:bCs/>
         </w:rPr>
         <w:t>М.Л. Владимирский</w:t>
+      </w:r>
+    </w:p>
+    <w:p>
+      <w:r>
+        <w:br w:type="page"/>
+      </w:r>
+    </w:p>
+    <w:p>
+      <w:pPr>
+        <w:spacing w:after="40"/>
+        <w:jc w:val="center"/>
+      </w:pPr>
+      <w:r>
+        <w:rPr>
+          <w:rFonts w:ascii="Arial" w:hAnsi="Arial" w:cs="Arial"/>
+          <w:b/>
+          <w:i w:val="0"/>
+          <w:sz w:val="26"/>
+        </w:rPr>
+        <w:t>Приложение № 1</w:t>
+      </w:r>
+    </w:p>
+    <w:p>
+      <w:pPr>
+        <w:spacing w:after="280"/>
+        <w:jc w:val="center"/>
+      </w:pPr>
+      <w:r>
+        <w:rPr>
+          <w:rFonts w:ascii="Arial" w:hAnsi="Arial" w:cs="Arial"/>
+          <w:b w:val="0"/>
+          <w:i/>
+          <w:sz w:val="20"/>
+        </w:rPr>
+        <w:t>к письму АО «Развитие» исх. № ______ от __.__.2026</w:t>
+      </w:r>
+    </w:p>
+    <w:p>
+      <w:pPr>
+        <w:spacing w:after="320"/>
+        <w:jc w:val="center"/>
+      </w:pPr>
+      <w:r>
+        <w:rPr>
+          <w:rFonts w:ascii="Arial" w:hAnsi="Arial" w:cs="Arial"/>
+          <w:b/>
+          <w:i w:val="0"/>
+          <w:sz w:val="22"/>
+        </w:rPr>
+        <w:t>Сводная информация об отказах секций резисторов УВТР БЕЛАЗ-7513Т по предприятиям (по состоянию на 11.07.2026)</w:t>
+      </w:r>
+    </w:p>
+    <w:p>
+      <w:pPr>
+        <w:spacing w:after="160"/>
+      </w:pPr>
+      <w:r>
+        <w:rPr>
+          <w:rFonts w:ascii="Arial" w:hAnsi="Arial" w:cs="Arial"/>
+          <w:b/>
+          <w:i w:val="0"/>
+          <w:sz w:val="22"/>
+        </w:rPr>
+        <w:t>1. ООО «Полюс Сухой Лог» — 11 машин (сервисная организация АО «ГПФК»)</w:t>
+      </w:r>
+    </w:p>
+    <w:tbl>
+      <w:tblPr>
+        <w:tblStyle w:val="a3"/>
+        <w:tblW w:type="auto" w:w="0"/>
+        <w:tblLook w:firstColumn="1" w:firstRow="1" w:lastColumn="0" w:lastRow="0" w:noHBand="0" w:noVBand="1" w:val="04A0"/>
+      </w:tblPr>
+      <w:tblGrid>
+        <w:gridCol w:w="1701"/>
+        <w:gridCol w:w="1701"/>
+        <w:gridCol w:w="1701"/>
+        <w:gridCol w:w="1701"/>
+        <w:gridCol w:w="1701"/>
+        <w:gridCol w:w="1701"/>
+      </w:tblGrid>
+      <w:tr>
+        <w:tc>
+          <w:tcPr>
+            <w:tcW w:type="dxa" w:w="1701"/>
+          </w:tcPr>
+          <w:p>
+            <w:pPr>
+              <w:jc w:val="center"/>
+            </w:pPr>
+            <w:r/>
+            <w:r>
+              <w:rPr>
+                <w:rFonts w:ascii="Arial" w:hAnsi="Arial" w:cs="Arial"/>
+                <w:b/>
+                <w:i w:val="0"/>
+                <w:sz w:val="18"/>
+              </w:rPr>
+              <w:t>№</w:t>
+            </w:r>
+          </w:p>
+        </w:tc>
+        <w:tc>
+          <w:tcPr>
+            <w:tcW w:type="dxa" w:w="1701"/>
+          </w:tcPr>
+          <w:p>
+            <w:pPr>
+              <w:jc w:val="center"/>
+            </w:pPr>
+            <w:r/>
+            <w:r>
+              <w:rPr>
+                <w:rFonts w:ascii="Arial" w:hAnsi="Arial" w:cs="Arial"/>
+                <w:b/>
+                <w:i w:val="0"/>
+                <w:sz w:val="18"/>
+              </w:rPr>
+              <w:t>Гаражный №</w:t>
+            </w:r>
+          </w:p>
+        </w:tc>
+        <w:tc>
+          <w:tcPr>
+            <w:tcW w:type="dxa" w:w="1701"/>
+          </w:tcPr>
+          <w:p>
+            <w:pPr>
+              <w:jc w:val="center"/>
+            </w:pPr>
+            <w:r/>
+            <w:r>
+              <w:rPr>
+                <w:rFonts w:ascii="Arial" w:hAnsi="Arial" w:cs="Arial"/>
+                <w:b/>
+                <w:i w:val="0"/>
+                <w:sz w:val="18"/>
+              </w:rPr>
+              <w:t>Замена по отзывной</w:t>
+              <w:br/>
+              <w:t>кампании, дата</w:t>
+            </w:r>
+          </w:p>
+        </w:tc>
+        <w:tc>
+          <w:tcPr>
+            <w:tcW w:type="dxa" w:w="1701"/>
+          </w:tcPr>
+          <w:p>
+            <w:pPr>
+              <w:jc w:val="center"/>
+            </w:pPr>
+            <w:r/>
+            <w:r>
+              <w:rPr>
+                <w:rFonts w:ascii="Arial" w:hAnsi="Arial" w:cs="Arial"/>
+                <w:b/>
+                <w:i w:val="0"/>
+                <w:sz w:val="18"/>
+              </w:rPr>
+              <w:t>Секций,</w:t>
+              <w:br/>
+              <w:t>шт</w:t>
+            </w:r>
+          </w:p>
+        </w:tc>
+        <w:tc>
+          <w:tcPr>
+            <w:tcW w:type="dxa" w:w="1701"/>
+          </w:tcPr>
+          <w:p>
+            <w:pPr>
+              <w:jc w:val="center"/>
+            </w:pPr>
+            <w:r/>
+            <w:r>
+              <w:rPr>
+                <w:rFonts w:ascii="Arial" w:hAnsi="Arial" w:cs="Arial"/>
+                <w:b/>
+                <w:i w:val="0"/>
+                <w:sz w:val="18"/>
+              </w:rPr>
+              <w:t>Повторная замена</w:t>
+              <w:br/>
+              <w:t>после кампании, дата</w:t>
+            </w:r>
+          </w:p>
+        </w:tc>
+        <w:tc>
+          <w:tcPr>
+            <w:tcW w:type="dxa" w:w="1701"/>
+          </w:tcPr>
+          <w:p>
+            <w:pPr>
+              <w:jc w:val="center"/>
+            </w:pPr>
+            <w:r/>
+            <w:r>
+              <w:rPr>
+                <w:rFonts w:ascii="Arial" w:hAnsi="Arial" w:cs="Arial"/>
+                <w:b/>
+                <w:i w:val="0"/>
+                <w:sz w:val="18"/>
+              </w:rPr>
+              <w:t>Секций,</w:t>
+              <w:br/>
+              <w:t>шт</w:t>
+            </w:r>
+          </w:p>
+        </w:tc>
+      </w:tr>
+      <w:tr>
+        <w:tc>
+          <w:tcPr>
+            <w:tcW w:type="dxa" w:w="1701"/>
+          </w:tcPr>
+          <w:p>
+            <w:pPr>
+              <w:jc w:val="center"/>
+            </w:pPr>
+            <w:r/>
+            <w:r>
+              <w:rPr>
+                <w:rFonts w:ascii="Arial" w:hAnsi="Arial" w:cs="Arial"/>
+                <w:b w:val="0"/>
+                <w:i w:val="0"/>
+                <w:sz w:val="18"/>
+              </w:rPr>
+              <w:t>1</w:t>
+            </w:r>
+          </w:p>
+        </w:tc>
+        <w:tc>
+          <w:tcPr>
+            <w:tcW w:type="dxa" w:w="1701"/>
+          </w:tcPr>
+          <w:p>
+            <w:pPr>
+              <w:jc w:val="center"/>
+            </w:pPr>
+            <w:r/>
+            <w:r>
+              <w:rPr>
+                <w:rFonts w:ascii="Arial" w:hAnsi="Arial" w:cs="Arial"/>
+                <w:b w:val="0"/>
+                <w:i w:val="0"/>
+                <w:sz w:val="18"/>
+              </w:rPr>
+              <w:t>Б-301</w:t>
+            </w:r>
+          </w:p>
+        </w:tc>
+        <w:tc>
+          <w:tcPr>
+            <w:tcW w:type="dxa" w:w="1701"/>
+          </w:tcPr>
+          <w:p>
+            <w:pPr>
+              <w:jc w:val="center"/>
+            </w:pPr>
+            <w:r/>
+            <w:r>
+              <w:rPr>
+                <w:rFonts w:ascii="Arial" w:hAnsi="Arial" w:cs="Arial"/>
+                <w:b w:val="0"/>
+                <w:i w:val="0"/>
+                <w:sz w:val="18"/>
+              </w:rPr>
+              <w:t>13.04.2026</w:t>
+            </w:r>
+          </w:p>
+        </w:tc>
+        <w:tc>
+          <w:tcPr>
+            <w:tcW w:type="dxa" w:w="1701"/>
+          </w:tcPr>
+          <w:p>
+            <w:pPr>
+              <w:jc w:val="center"/>
+            </w:pPr>
+            <w:r/>
+            <w:r>
+              <w:rPr>
+                <w:rFonts w:ascii="Arial" w:hAnsi="Arial" w:cs="Arial"/>
+                <w:b w:val="0"/>
+                <w:i w:val="0"/>
+                <w:sz w:val="18"/>
+              </w:rPr>
+              <w:t>8</w:t>
+            </w:r>
+          </w:p>
+        </w:tc>
+        <w:tc>
+          <w:tcPr>
+            <w:tcW w:type="dxa" w:w="1701"/>
+          </w:tcPr>
+          <w:p>
+            <w:pPr>
+              <w:jc w:val="center"/>
+            </w:pPr>
+            <w:r/>
+            <w:r>
+              <w:rPr>
+                <w:rFonts w:ascii="Arial" w:hAnsi="Arial" w:cs="Arial"/>
+                <w:b w:val="0"/>
+                <w:i w:val="0"/>
+                <w:sz w:val="18"/>
+              </w:rPr>
+              <w:t>—</w:t>
+            </w:r>
+          </w:p>
+        </w:tc>
+        <w:tc>
+          <w:tcPr>
+            <w:tcW w:type="dxa" w:w="1701"/>
+          </w:tcPr>
+          <w:p>
+            <w:pPr>
+              <w:jc w:val="center"/>
+            </w:pPr>
+            <w:r/>
+            <w:r>
+              <w:rPr>
+                <w:rFonts w:ascii="Arial" w:hAnsi="Arial" w:cs="Arial"/>
+                <w:b w:val="0"/>
+                <w:i w:val="0"/>
+                <w:sz w:val="18"/>
+              </w:rPr>
+              <w:t>—</w:t>
+            </w:r>
+          </w:p>
+        </w:tc>
+      </w:tr>
+      <w:tr>
+        <w:tc>
+          <w:tcPr>
+            <w:tcW w:type="dxa" w:w="1701"/>
+          </w:tcPr>
+          <w:p>
+            <w:pPr>
+              <w:jc w:val="center"/>
+            </w:pPr>
+            <w:r/>
+            <w:r>
+              <w:rPr>
+                <w:rFonts w:ascii="Arial" w:hAnsi="Arial" w:cs="Arial"/>
+                <w:b w:val="0"/>
+                <w:i w:val="0"/>
+                <w:sz w:val="18"/>
+              </w:rPr>
+              <w:t>2</w:t>
+            </w:r>
+          </w:p>
+        </w:tc>
+        <w:tc>
+          <w:tcPr>
+            <w:tcW w:type="dxa" w:w="1701"/>
+          </w:tcPr>
+          <w:p>
+            <w:pPr>
+              <w:jc w:val="center"/>
+            </w:pPr>
+            <w:r/>
+            <w:r>
+              <w:rPr>
+                <w:rFonts w:ascii="Arial" w:hAnsi="Arial" w:cs="Arial"/>
+                <w:b w:val="0"/>
+                <w:i w:val="0"/>
+                <w:sz w:val="18"/>
+              </w:rPr>
+              <w:t>Б-302</w:t>
+            </w:r>
+          </w:p>
+        </w:tc>
+        <w:tc>
+          <w:tcPr>
+            <w:tcW w:type="dxa" w:w="1701"/>
+          </w:tcPr>
+          <w:p>
+            <w:pPr>
+              <w:jc w:val="center"/>
+            </w:pPr>
+            <w:r/>
+            <w:r>
+              <w:rPr>
+                <w:rFonts w:ascii="Arial" w:hAnsi="Arial" w:cs="Arial"/>
+                <w:b w:val="0"/>
+                <w:i w:val="0"/>
+                <w:sz w:val="18"/>
+              </w:rPr>
+              <w:t>31.03.2026</w:t>
+            </w:r>
+          </w:p>
+        </w:tc>
+        <w:tc>
+          <w:tcPr>
+            <w:tcW w:type="dxa" w:w="1701"/>
+          </w:tcPr>
+          <w:p>
+            <w:pPr>
+              <w:jc w:val="center"/>
+            </w:pPr>
+            <w:r/>
+            <w:r>
+              <w:rPr>
+                <w:rFonts w:ascii="Arial" w:hAnsi="Arial" w:cs="Arial"/>
+                <w:b w:val="0"/>
+                <w:i w:val="0"/>
+                <w:sz w:val="18"/>
+              </w:rPr>
+              <w:t>8</w:t>
+            </w:r>
+          </w:p>
+        </w:tc>
+        <w:tc>
+          <w:tcPr>
+            <w:tcW w:type="dxa" w:w="1701"/>
+          </w:tcPr>
+          <w:p>
+            <w:pPr>
+              <w:jc w:val="center"/>
+            </w:pPr>
+            <w:r/>
+            <w:r>
+              <w:rPr>
+                <w:rFonts w:ascii="Arial" w:hAnsi="Arial" w:cs="Arial"/>
+                <w:b w:val="0"/>
+                <w:i w:val="0"/>
+                <w:sz w:val="18"/>
+              </w:rPr>
+              <w:t>11.06.2026</w:t>
+            </w:r>
+          </w:p>
+        </w:tc>
+        <w:tc>
+          <w:tcPr>
+            <w:tcW w:type="dxa" w:w="1701"/>
+          </w:tcPr>
+          <w:p>
+            <w:pPr>
+              <w:jc w:val="center"/>
+            </w:pPr>
+            <w:r/>
+            <w:r>
+              <w:rPr>
+                <w:rFonts w:ascii="Arial" w:hAnsi="Arial" w:cs="Arial"/>
+                <w:b w:val="0"/>
+                <w:i w:val="0"/>
+                <w:sz w:val="18"/>
+              </w:rPr>
+              <w:t>4</w:t>
+            </w:r>
+          </w:p>
+        </w:tc>
+      </w:tr>
+      <w:tr>
+        <w:tc>
+          <w:tcPr>
+            <w:tcW w:type="dxa" w:w="1701"/>
+          </w:tcPr>
+          <w:p>
+            <w:pPr>
+              <w:jc w:val="center"/>
+            </w:pPr>
+            <w:r/>
+            <w:r>
+              <w:rPr>
+                <w:rFonts w:ascii="Arial" w:hAnsi="Arial" w:cs="Arial"/>
+                <w:b w:val="0"/>
+                <w:i w:val="0"/>
+                <w:sz w:val="18"/>
+              </w:rPr>
+              <w:t>3</w:t>
+            </w:r>
+          </w:p>
+        </w:tc>
+        <w:tc>
+          <w:tcPr>
+            <w:tcW w:type="dxa" w:w="1701"/>
+          </w:tcPr>
+          <w:p>
+            <w:pPr>
+              <w:jc w:val="center"/>
+            </w:pPr>
+            <w:r/>
+            <w:r>
+              <w:rPr>
+                <w:rFonts w:ascii="Arial" w:hAnsi="Arial" w:cs="Arial"/>
+                <w:b w:val="0"/>
+                <w:i w:val="0"/>
+                <w:sz w:val="18"/>
+              </w:rPr>
+              <w:t>Б-303</w:t>
+            </w:r>
+          </w:p>
+        </w:tc>
+        <w:tc>
+          <w:tcPr>
+            <w:tcW w:type="dxa" w:w="1701"/>
+          </w:tcPr>
+          <w:p>
+            <w:pPr>
+              <w:jc w:val="center"/>
+            </w:pPr>
+            <w:r/>
+            <w:r>
+              <w:rPr>
+                <w:rFonts w:ascii="Arial" w:hAnsi="Arial" w:cs="Arial"/>
+                <w:b w:val="0"/>
+                <w:i w:val="0"/>
+                <w:sz w:val="18"/>
+              </w:rPr>
+              <w:t>08.04.2026</w:t>
+            </w:r>
+          </w:p>
+        </w:tc>
+        <w:tc>
+          <w:tcPr>
+            <w:tcW w:type="dxa" w:w="1701"/>
+          </w:tcPr>
+          <w:p>
+            <w:pPr>
+              <w:jc w:val="center"/>
+            </w:pPr>
+            <w:r/>
+            <w:r>
+              <w:rPr>
+                <w:rFonts w:ascii="Arial" w:hAnsi="Arial" w:cs="Arial"/>
+                <w:b w:val="0"/>
+                <w:i w:val="0"/>
+                <w:sz w:val="18"/>
+              </w:rPr>
+              <w:t>8</w:t>
+            </w:r>
+          </w:p>
+        </w:tc>
+        <w:tc>
+          <w:tcPr>
+            <w:tcW w:type="dxa" w:w="1701"/>
+          </w:tcPr>
+          <w:p>
+            <w:pPr>
+              <w:jc w:val="center"/>
+            </w:pPr>
+            <w:r/>
+            <w:r>
+              <w:rPr>
+                <w:rFonts w:ascii="Arial" w:hAnsi="Arial" w:cs="Arial"/>
+                <w:b w:val="0"/>
+                <w:i w:val="0"/>
+                <w:sz w:val="18"/>
+              </w:rPr>
+              <w:t>23–25.05.2026</w:t>
+            </w:r>
+          </w:p>
+        </w:tc>
+        <w:tc>
+          <w:tcPr>
+            <w:tcW w:type="dxa" w:w="1701"/>
+          </w:tcPr>
+          <w:p>
+            <w:pPr>
+              <w:jc w:val="center"/>
+            </w:pPr>
+            <w:r/>
+            <w:r>
+              <w:rPr>
+                <w:rFonts w:ascii="Arial" w:hAnsi="Arial" w:cs="Arial"/>
+                <w:b w:val="0"/>
+                <w:i w:val="0"/>
+                <w:sz w:val="18"/>
+              </w:rPr>
+              <w:t>8</w:t>
+            </w:r>
+          </w:p>
+        </w:tc>
+      </w:tr>
+      <w:tr>
+        <w:tc>
+          <w:tcPr>
+            <w:tcW w:type="dxa" w:w="1701"/>
+          </w:tcPr>
+          <w:p>
+            <w:pPr>
+              <w:jc w:val="center"/>
+            </w:pPr>
+            <w:r/>
+            <w:r>
+              <w:rPr>
+                <w:rFonts w:ascii="Arial" w:hAnsi="Arial" w:cs="Arial"/>
+                <w:b w:val="0"/>
+                <w:i w:val="0"/>
+                <w:sz w:val="18"/>
+              </w:rPr>
+              <w:t>4</w:t>
+            </w:r>
+          </w:p>
+        </w:tc>
+        <w:tc>
+          <w:tcPr>
+            <w:tcW w:type="dxa" w:w="1701"/>
+          </w:tcPr>
+          <w:p>
+            <w:pPr>
+              <w:jc w:val="center"/>
+            </w:pPr>
+            <w:r/>
+            <w:r>
+              <w:rPr>
+                <w:rFonts w:ascii="Arial" w:hAnsi="Arial" w:cs="Arial"/>
+                <w:b w:val="0"/>
+                <w:i w:val="0"/>
+                <w:sz w:val="18"/>
+              </w:rPr>
+              <w:t>Б-304</w:t>
+            </w:r>
+          </w:p>
+        </w:tc>
+        <w:tc>
+          <w:tcPr>
+            <w:tcW w:type="dxa" w:w="1701"/>
+          </w:tcPr>
+          <w:p>
+            <w:pPr>
+              <w:jc w:val="center"/>
+            </w:pPr>
+            <w:r/>
+            <w:r>
+              <w:rPr>
+                <w:rFonts w:ascii="Arial" w:hAnsi="Arial" w:cs="Arial"/>
+                <w:b w:val="0"/>
+                <w:i w:val="0"/>
+                <w:sz w:val="18"/>
+              </w:rPr>
+              <w:t>02.04.2026</w:t>
+            </w:r>
+          </w:p>
+        </w:tc>
+        <w:tc>
+          <w:tcPr>
+            <w:tcW w:type="dxa" w:w="1701"/>
+          </w:tcPr>
+          <w:p>
+            <w:pPr>
+              <w:jc w:val="center"/>
+            </w:pPr>
+            <w:r/>
+            <w:r>
+              <w:rPr>
+                <w:rFonts w:ascii="Arial" w:hAnsi="Arial" w:cs="Arial"/>
+                <w:b w:val="0"/>
+                <w:i w:val="0"/>
+                <w:sz w:val="18"/>
+              </w:rPr>
+              <w:t>8</w:t>
+            </w:r>
+          </w:p>
+        </w:tc>
+        <w:tc>
+          <w:tcPr>
+            <w:tcW w:type="dxa" w:w="1701"/>
+          </w:tcPr>
+          <w:p>
+            <w:pPr>
+              <w:jc w:val="center"/>
+            </w:pPr>
+            <w:r/>
+            <w:r>
+              <w:rPr>
+                <w:rFonts w:ascii="Arial" w:hAnsi="Arial" w:cs="Arial"/>
+                <w:b w:val="0"/>
+                <w:i w:val="0"/>
+                <w:sz w:val="18"/>
+              </w:rPr>
+              <w:t>21.06.2026</w:t>
+            </w:r>
+          </w:p>
+        </w:tc>
+        <w:tc>
+          <w:tcPr>
+            <w:tcW w:type="dxa" w:w="1701"/>
+          </w:tcPr>
+          <w:p>
+            <w:pPr>
+              <w:jc w:val="center"/>
+            </w:pPr>
+            <w:r/>
+            <w:r>
+              <w:rPr>
+                <w:rFonts w:ascii="Arial" w:hAnsi="Arial" w:cs="Arial"/>
+                <w:b w:val="0"/>
+                <w:i w:val="0"/>
+                <w:sz w:val="18"/>
+              </w:rPr>
+              <w:t>1</w:t>
+            </w:r>
+          </w:p>
+        </w:tc>
+      </w:tr>
+      <w:tr>
+        <w:tc>
+          <w:tcPr>
+            <w:tcW w:type="dxa" w:w="1701"/>
+          </w:tcPr>
+          <w:p>
+            <w:pPr>
+              <w:jc w:val="center"/>
+            </w:pPr>
+            <w:r/>
+            <w:r>
+              <w:rPr>
+                <w:rFonts w:ascii="Arial" w:hAnsi="Arial" w:cs="Arial"/>
+                <w:b w:val="0"/>
+                <w:i w:val="0"/>
+                <w:sz w:val="18"/>
+              </w:rPr>
+              <w:t>5</w:t>
+            </w:r>
+          </w:p>
+        </w:tc>
+        <w:tc>
+          <w:tcPr>
+            <w:tcW w:type="dxa" w:w="1701"/>
+          </w:tcPr>
+          <w:p>
+            <w:pPr>
+              <w:jc w:val="center"/>
+            </w:pPr>
+            <w:r/>
+            <w:r>
+              <w:rPr>
+                <w:rFonts w:ascii="Arial" w:hAnsi="Arial" w:cs="Arial"/>
+                <w:b w:val="0"/>
+                <w:i w:val="0"/>
+                <w:sz w:val="18"/>
+              </w:rPr>
+              <w:t>Б-305</w:t>
+            </w:r>
+          </w:p>
+        </w:tc>
+        <w:tc>
+          <w:tcPr>
+            <w:tcW w:type="dxa" w:w="1701"/>
+          </w:tcPr>
+          <w:p>
+            <w:pPr>
+              <w:jc w:val="center"/>
+            </w:pPr>
+            <w:r/>
+            <w:r>
+              <w:rPr>
+                <w:rFonts w:ascii="Arial" w:hAnsi="Arial" w:cs="Arial"/>
+                <w:b w:val="0"/>
+                <w:i w:val="0"/>
+                <w:sz w:val="18"/>
+              </w:rPr>
+              <w:t>02.04.2026</w:t>
+            </w:r>
+          </w:p>
+        </w:tc>
+        <w:tc>
+          <w:tcPr>
+            <w:tcW w:type="dxa" w:w="1701"/>
+          </w:tcPr>
+          <w:p>
+            <w:pPr>
+              <w:jc w:val="center"/>
+            </w:pPr>
+            <w:r/>
+            <w:r>
+              <w:rPr>
+                <w:rFonts w:ascii="Arial" w:hAnsi="Arial" w:cs="Arial"/>
+                <w:b w:val="0"/>
+                <w:i w:val="0"/>
+                <w:sz w:val="18"/>
+              </w:rPr>
+              <w:t>8</w:t>
+            </w:r>
+          </w:p>
+        </w:tc>
+        <w:tc>
+          <w:tcPr>
+            <w:tcW w:type="dxa" w:w="1701"/>
+          </w:tcPr>
+          <w:p>
+            <w:pPr>
+              <w:jc w:val="center"/>
+            </w:pPr>
+            <w:r/>
+            <w:r>
+              <w:rPr>
+                <w:rFonts w:ascii="Arial" w:hAnsi="Arial" w:cs="Arial"/>
+                <w:b w:val="0"/>
+                <w:i w:val="0"/>
+                <w:sz w:val="18"/>
+              </w:rPr>
+              <w:t>—</w:t>
+            </w:r>
+          </w:p>
+        </w:tc>
+        <w:tc>
+          <w:tcPr>
+            <w:tcW w:type="dxa" w:w="1701"/>
+          </w:tcPr>
+          <w:p>
+            <w:pPr>
+              <w:jc w:val="center"/>
+            </w:pPr>
+            <w:r/>
+            <w:r>
+              <w:rPr>
+                <w:rFonts w:ascii="Arial" w:hAnsi="Arial" w:cs="Arial"/>
+                <w:b w:val="0"/>
+                <w:i w:val="0"/>
+                <w:sz w:val="18"/>
+              </w:rPr>
+              <w:t>—</w:t>
+            </w:r>
+          </w:p>
+        </w:tc>
+      </w:tr>
+      <w:tr>
+        <w:tc>
+          <w:tcPr>
+            <w:tcW w:type="dxa" w:w="1701"/>
+          </w:tcPr>
+          <w:p>
+            <w:pPr>
+              <w:jc w:val="center"/>
+            </w:pPr>
+            <w:r/>
+            <w:r>
+              <w:rPr>
+                <w:rFonts w:ascii="Arial" w:hAnsi="Arial" w:cs="Arial"/>
+                <w:b w:val="0"/>
+                <w:i w:val="0"/>
+                <w:sz w:val="18"/>
+              </w:rPr>
+              <w:t>6</w:t>
+            </w:r>
+          </w:p>
+        </w:tc>
+        <w:tc>
+          <w:tcPr>
+            <w:tcW w:type="dxa" w:w="1701"/>
+          </w:tcPr>
+          <w:p>
+            <w:pPr>
+              <w:jc w:val="center"/>
+            </w:pPr>
+            <w:r/>
+            <w:r>
+              <w:rPr>
+                <w:rFonts w:ascii="Arial" w:hAnsi="Arial" w:cs="Arial"/>
+                <w:b w:val="0"/>
+                <w:i w:val="0"/>
+                <w:sz w:val="18"/>
+              </w:rPr>
+              <w:t>Б-306</w:t>
+            </w:r>
+          </w:p>
+        </w:tc>
+        <w:tc>
+          <w:tcPr>
+            <w:tcW w:type="dxa" w:w="1701"/>
+          </w:tcPr>
+          <w:p>
+            <w:pPr>
+              <w:jc w:val="center"/>
+            </w:pPr>
+            <w:r/>
+            <w:r>
+              <w:rPr>
+                <w:rFonts w:ascii="Arial" w:hAnsi="Arial" w:cs="Arial"/>
+                <w:b w:val="0"/>
+                <w:i w:val="0"/>
+                <w:sz w:val="18"/>
+              </w:rPr>
+              <w:t>07.04.2026</w:t>
+            </w:r>
+          </w:p>
+        </w:tc>
+        <w:tc>
+          <w:tcPr>
+            <w:tcW w:type="dxa" w:w="1701"/>
+          </w:tcPr>
+          <w:p>
+            <w:pPr>
+              <w:jc w:val="center"/>
+            </w:pPr>
+            <w:r/>
+            <w:r>
+              <w:rPr>
+                <w:rFonts w:ascii="Arial" w:hAnsi="Arial" w:cs="Arial"/>
+                <w:b w:val="0"/>
+                <w:i w:val="0"/>
+                <w:sz w:val="18"/>
+              </w:rPr>
+              <w:t>8</w:t>
+            </w:r>
+          </w:p>
+        </w:tc>
+        <w:tc>
+          <w:tcPr>
+            <w:tcW w:type="dxa" w:w="1701"/>
+          </w:tcPr>
+          <w:p>
+            <w:pPr>
+              <w:jc w:val="center"/>
+            </w:pPr>
+            <w:r/>
+            <w:r>
+              <w:rPr>
+                <w:rFonts w:ascii="Arial" w:hAnsi="Arial" w:cs="Arial"/>
+                <w:b w:val="0"/>
+                <w:i w:val="0"/>
+                <w:sz w:val="18"/>
+              </w:rPr>
+              <w:t>—</w:t>
+            </w:r>
+          </w:p>
+        </w:tc>
+        <w:tc>
+          <w:tcPr>
+            <w:tcW w:type="dxa" w:w="1701"/>
+          </w:tcPr>
+          <w:p>
+            <w:pPr>
+              <w:jc w:val="center"/>
+            </w:pPr>
+            <w:r/>
+            <w:r>
+              <w:rPr>
+                <w:rFonts w:ascii="Arial" w:hAnsi="Arial" w:cs="Arial"/>
+                <w:b w:val="0"/>
+                <w:i w:val="0"/>
+                <w:sz w:val="18"/>
+              </w:rPr>
+              <w:t>—</w:t>
+            </w:r>
+          </w:p>
+        </w:tc>
+      </w:tr>
+      <w:tr>
+        <w:tc>
+          <w:tcPr>
+            <w:tcW w:type="dxa" w:w="1701"/>
+          </w:tcPr>
+          <w:p>
+            <w:pPr>
+              <w:jc w:val="center"/>
+            </w:pPr>
+            <w:r/>
+            <w:r>
+              <w:rPr>
+                <w:rFonts w:ascii="Arial" w:hAnsi="Arial" w:cs="Arial"/>
+                <w:b w:val="0"/>
+                <w:i w:val="0"/>
+                <w:sz w:val="18"/>
+              </w:rPr>
+              <w:t>7</w:t>
+            </w:r>
+          </w:p>
+        </w:tc>
+        <w:tc>
+          <w:tcPr>
+            <w:tcW w:type="dxa" w:w="1701"/>
+          </w:tcPr>
+          <w:p>
+            <w:pPr>
+              <w:jc w:val="center"/>
+            </w:pPr>
+            <w:r/>
+            <w:r>
+              <w:rPr>
+                <w:rFonts w:ascii="Arial" w:hAnsi="Arial" w:cs="Arial"/>
+                <w:b w:val="0"/>
+                <w:i w:val="0"/>
+                <w:sz w:val="18"/>
+              </w:rPr>
+              <w:t>Б-307</w:t>
+            </w:r>
+          </w:p>
+        </w:tc>
+        <w:tc>
+          <w:tcPr>
+            <w:tcW w:type="dxa" w:w="1701"/>
+          </w:tcPr>
+          <w:p>
+            <w:pPr>
+              <w:jc w:val="center"/>
+            </w:pPr>
+            <w:r/>
+            <w:r>
+              <w:rPr>
+                <w:rFonts w:ascii="Arial" w:hAnsi="Arial" w:cs="Arial"/>
+                <w:b w:val="0"/>
+                <w:i w:val="0"/>
+                <w:sz w:val="18"/>
+              </w:rPr>
+              <w:t>30.03.2026</w:t>
+            </w:r>
+          </w:p>
+        </w:tc>
+        <w:tc>
+          <w:tcPr>
+            <w:tcW w:type="dxa" w:w="1701"/>
+          </w:tcPr>
+          <w:p>
+            <w:pPr>
+              <w:jc w:val="center"/>
+            </w:pPr>
+            <w:r/>
+            <w:r>
+              <w:rPr>
+                <w:rFonts w:ascii="Arial" w:hAnsi="Arial" w:cs="Arial"/>
+                <w:b w:val="0"/>
+                <w:i w:val="0"/>
+                <w:sz w:val="18"/>
+              </w:rPr>
+              <w:t>8</w:t>
+            </w:r>
+          </w:p>
+        </w:tc>
+        <w:tc>
+          <w:tcPr>
+            <w:tcW w:type="dxa" w:w="1701"/>
+          </w:tcPr>
+          <w:p>
+            <w:pPr>
+              <w:jc w:val="center"/>
+            </w:pPr>
+            <w:r/>
+            <w:r>
+              <w:rPr>
+                <w:rFonts w:ascii="Arial" w:hAnsi="Arial" w:cs="Arial"/>
+                <w:b w:val="0"/>
+                <w:i w:val="0"/>
+                <w:sz w:val="18"/>
+              </w:rPr>
+              <w:t>18.05.2026</w:t>
+            </w:r>
+          </w:p>
+        </w:tc>
+        <w:tc>
+          <w:tcPr>
+            <w:tcW w:type="dxa" w:w="1701"/>
+          </w:tcPr>
+          <w:p>
+            <w:pPr>
+              <w:jc w:val="center"/>
+            </w:pPr>
+            <w:r/>
+            <w:r>
+              <w:rPr>
+                <w:rFonts w:ascii="Arial" w:hAnsi="Arial" w:cs="Arial"/>
+                <w:b w:val="0"/>
+                <w:i w:val="0"/>
+                <w:sz w:val="18"/>
+              </w:rPr>
+              <w:t>3</w:t>
+            </w:r>
+          </w:p>
+        </w:tc>
+      </w:tr>
+      <w:tr>
+        <w:tc>
+          <w:tcPr>
+            <w:tcW w:type="dxa" w:w="1701"/>
+          </w:tcPr>
+          <w:p>
+            <w:pPr>
+              <w:jc w:val="center"/>
+            </w:pPr>
+            <w:r/>
+            <w:r>
+              <w:rPr>
+                <w:rFonts w:ascii="Arial" w:hAnsi="Arial" w:cs="Arial"/>
+                <w:b w:val="0"/>
+                <w:i w:val="0"/>
+                <w:sz w:val="18"/>
+              </w:rPr>
+              <w:t>8</w:t>
+            </w:r>
+          </w:p>
+        </w:tc>
+        <w:tc>
+          <w:tcPr>
+            <w:tcW w:type="dxa" w:w="1701"/>
+          </w:tcPr>
+          <w:p>
+            <w:pPr>
+              <w:jc w:val="center"/>
+            </w:pPr>
+            <w:r/>
+            <w:r>
+              <w:rPr>
+                <w:rFonts w:ascii="Arial" w:hAnsi="Arial" w:cs="Arial"/>
+                <w:b w:val="0"/>
+                <w:i w:val="0"/>
+                <w:sz w:val="18"/>
+              </w:rPr>
+              <w:t>Б-308</w:t>
+            </w:r>
+          </w:p>
+        </w:tc>
+        <w:tc>
+          <w:tcPr>
+            <w:tcW w:type="dxa" w:w="1701"/>
+          </w:tcPr>
+          <w:p>
+            <w:pPr>
+              <w:jc w:val="center"/>
+            </w:pPr>
+            <w:r/>
+            <w:r>
+              <w:rPr>
+                <w:rFonts w:ascii="Arial" w:hAnsi="Arial" w:cs="Arial"/>
+                <w:b w:val="0"/>
+                <w:i w:val="0"/>
+                <w:sz w:val="18"/>
+              </w:rPr>
+              <w:t>06.04.2026</w:t>
+            </w:r>
+          </w:p>
+        </w:tc>
+        <w:tc>
+          <w:tcPr>
+            <w:tcW w:type="dxa" w:w="1701"/>
+          </w:tcPr>
+          <w:p>
+            <w:pPr>
+              <w:jc w:val="center"/>
+            </w:pPr>
+            <w:r/>
+            <w:r>
+              <w:rPr>
+                <w:rFonts w:ascii="Arial" w:hAnsi="Arial" w:cs="Arial"/>
+                <w:b w:val="0"/>
+                <w:i w:val="0"/>
+                <w:sz w:val="18"/>
+              </w:rPr>
+              <w:t>8</w:t>
+            </w:r>
+          </w:p>
+        </w:tc>
+        <w:tc>
+          <w:tcPr>
+            <w:tcW w:type="dxa" w:w="1701"/>
+          </w:tcPr>
+          <w:p>
+            <w:pPr>
+              <w:jc w:val="center"/>
+            </w:pPr>
+            <w:r/>
+            <w:r>
+              <w:rPr>
+                <w:rFonts w:ascii="Arial" w:hAnsi="Arial" w:cs="Arial"/>
+                <w:b w:val="0"/>
+                <w:i w:val="0"/>
+                <w:sz w:val="18"/>
+              </w:rPr>
+              <w:t>—</w:t>
+            </w:r>
+          </w:p>
+        </w:tc>
+        <w:tc>
+          <w:tcPr>
+            <w:tcW w:type="dxa" w:w="1701"/>
+          </w:tcPr>
+          <w:p>
+            <w:pPr>
+              <w:jc w:val="center"/>
+            </w:pPr>
+            <w:r/>
+            <w:r>
+              <w:rPr>
+                <w:rFonts w:ascii="Arial" w:hAnsi="Arial" w:cs="Arial"/>
+                <w:b w:val="0"/>
+                <w:i w:val="0"/>
+                <w:sz w:val="18"/>
+              </w:rPr>
+              <w:t>—</w:t>
+            </w:r>
+          </w:p>
+        </w:tc>
+      </w:tr>
+      <w:tr>
+        <w:tc>
+          <w:tcPr>
+            <w:tcW w:type="dxa" w:w="1701"/>
+          </w:tcPr>
+          <w:p>
+            <w:pPr>
+              <w:jc w:val="center"/>
+            </w:pPr>
+            <w:r/>
+            <w:r>
+              <w:rPr>
+                <w:rFonts w:ascii="Arial" w:hAnsi="Arial" w:cs="Arial"/>
+                <w:b w:val="0"/>
+                <w:i w:val="0"/>
+                <w:sz w:val="18"/>
+              </w:rPr>
+              <w:t>9</w:t>
+            </w:r>
+          </w:p>
+        </w:tc>
+        <w:tc>
+          <w:tcPr>
+            <w:tcW w:type="dxa" w:w="1701"/>
+          </w:tcPr>
+          <w:p>
+            <w:pPr>
+              <w:jc w:val="center"/>
+            </w:pPr>
+            <w:r/>
+            <w:r>
+              <w:rPr>
+                <w:rFonts w:ascii="Arial" w:hAnsi="Arial" w:cs="Arial"/>
+                <w:b w:val="0"/>
+                <w:i w:val="0"/>
+                <w:sz w:val="18"/>
+              </w:rPr>
+              <w:t>Б-309</w:t>
+            </w:r>
+          </w:p>
+        </w:tc>
+        <w:tc>
+          <w:tcPr>
+            <w:tcW w:type="dxa" w:w="1701"/>
+          </w:tcPr>
+          <w:p>
+            <w:pPr>
+              <w:jc w:val="center"/>
+            </w:pPr>
+            <w:r/>
+            <w:r>
+              <w:rPr>
+                <w:rFonts w:ascii="Arial" w:hAnsi="Arial" w:cs="Arial"/>
+                <w:b w:val="0"/>
+                <w:i w:val="0"/>
+                <w:sz w:val="18"/>
+              </w:rPr>
+              <w:t>16.04.2026</w:t>
+            </w:r>
+          </w:p>
+        </w:tc>
+        <w:tc>
+          <w:tcPr>
+            <w:tcW w:type="dxa" w:w="1701"/>
+          </w:tcPr>
+          <w:p>
+            <w:pPr>
+              <w:jc w:val="center"/>
+            </w:pPr>
+            <w:r/>
+            <w:r>
+              <w:rPr>
+                <w:rFonts w:ascii="Arial" w:hAnsi="Arial" w:cs="Arial"/>
+                <w:b w:val="0"/>
+                <w:i w:val="0"/>
+                <w:sz w:val="18"/>
+              </w:rPr>
+              <w:t>8</w:t>
+            </w:r>
+          </w:p>
+        </w:tc>
+        <w:tc>
+          <w:tcPr>
+            <w:tcW w:type="dxa" w:w="1701"/>
+          </w:tcPr>
+          <w:p>
+            <w:pPr>
+              <w:jc w:val="center"/>
+            </w:pPr>
+            <w:r/>
+            <w:r>
+              <w:rPr>
+                <w:rFonts w:ascii="Arial" w:hAnsi="Arial" w:cs="Arial"/>
+                <w:b w:val="0"/>
+                <w:i w:val="0"/>
+                <w:sz w:val="18"/>
+              </w:rPr>
+              <w:t>23.06.2026</w:t>
+            </w:r>
+          </w:p>
+        </w:tc>
+        <w:tc>
+          <w:tcPr>
+            <w:tcW w:type="dxa" w:w="1701"/>
+          </w:tcPr>
+          <w:p>
+            <w:pPr>
+              <w:jc w:val="center"/>
+            </w:pPr>
+            <w:r/>
+            <w:r>
+              <w:rPr>
+                <w:rFonts w:ascii="Arial" w:hAnsi="Arial" w:cs="Arial"/>
+                <w:b w:val="0"/>
+                <w:i w:val="0"/>
+                <w:sz w:val="18"/>
+              </w:rPr>
+              <w:t>2</w:t>
+            </w:r>
+          </w:p>
+        </w:tc>
+      </w:tr>
+      <w:tr>
+        <w:tc>
+          <w:tcPr>
+            <w:tcW w:type="dxa" w:w="1701"/>
+          </w:tcPr>
+          <w:p>
+            <w:pPr>
+              <w:jc w:val="center"/>
+            </w:pPr>
+            <w:r/>
+            <w:r>
+              <w:rPr>
+                <w:rFonts w:ascii="Arial" w:hAnsi="Arial" w:cs="Arial"/>
+                <w:b w:val="0"/>
+                <w:i w:val="0"/>
+                <w:sz w:val="18"/>
+              </w:rPr>
+              <w:t>10</w:t>
+            </w:r>
+          </w:p>
+        </w:tc>
+        <w:tc>
+          <w:tcPr>
+            <w:tcW w:type="dxa" w:w="1701"/>
+          </w:tcPr>
+          <w:p>
+            <w:pPr>
+              <w:jc w:val="center"/>
+            </w:pPr>
+            <w:r/>
+            <w:r>
+              <w:rPr>
+                <w:rFonts w:ascii="Arial" w:hAnsi="Arial" w:cs="Arial"/>
+                <w:b w:val="0"/>
+                <w:i w:val="0"/>
+                <w:sz w:val="18"/>
+              </w:rPr>
+              <w:t>Б-310</w:t>
+            </w:r>
+          </w:p>
+        </w:tc>
+        <w:tc>
+          <w:tcPr>
+            <w:tcW w:type="dxa" w:w="1701"/>
+          </w:tcPr>
+          <w:p>
+            <w:pPr>
+              <w:jc w:val="center"/>
+            </w:pPr>
+            <w:r/>
+            <w:r>
+              <w:rPr>
+                <w:rFonts w:ascii="Arial" w:hAnsi="Arial" w:cs="Arial"/>
+                <w:b w:val="0"/>
+                <w:i w:val="0"/>
+                <w:sz w:val="18"/>
+              </w:rPr>
+              <w:t>09.04.2026</w:t>
+            </w:r>
+          </w:p>
+        </w:tc>
+        <w:tc>
+          <w:tcPr>
+            <w:tcW w:type="dxa" w:w="1701"/>
+          </w:tcPr>
+          <w:p>
+            <w:pPr>
+              <w:jc w:val="center"/>
+            </w:pPr>
+            <w:r/>
+            <w:r>
+              <w:rPr>
+                <w:rFonts w:ascii="Arial" w:hAnsi="Arial" w:cs="Arial"/>
+                <w:b w:val="0"/>
+                <w:i w:val="0"/>
+                <w:sz w:val="18"/>
+              </w:rPr>
+              <w:t>8</w:t>
+            </w:r>
+          </w:p>
+        </w:tc>
+        <w:tc>
+          <w:tcPr>
+            <w:tcW w:type="dxa" w:w="1701"/>
+          </w:tcPr>
+          <w:p>
+            <w:pPr>
+              <w:jc w:val="center"/>
+            </w:pPr>
+            <w:r/>
+            <w:r>
+              <w:rPr>
+                <w:rFonts w:ascii="Arial" w:hAnsi="Arial" w:cs="Arial"/>
+                <w:b w:val="0"/>
+                <w:i w:val="0"/>
+                <w:sz w:val="18"/>
+              </w:rPr>
+              <w:t>—</w:t>
+            </w:r>
+          </w:p>
+        </w:tc>
+        <w:tc>
+          <w:tcPr>
+            <w:tcW w:type="dxa" w:w="1701"/>
+          </w:tcPr>
+          <w:p>
+            <w:pPr>
+              <w:jc w:val="center"/>
+            </w:pPr>
+            <w:r/>
+            <w:r>
+              <w:rPr>
+                <w:rFonts w:ascii="Arial" w:hAnsi="Arial" w:cs="Arial"/>
+                <w:b w:val="0"/>
+                <w:i w:val="0"/>
+                <w:sz w:val="18"/>
+              </w:rPr>
+              <w:t>—</w:t>
+            </w:r>
+          </w:p>
+        </w:tc>
+      </w:tr>
+      <w:tr>
+        <w:tc>
+          <w:tcPr>
+            <w:tcW w:type="dxa" w:w="1701"/>
+          </w:tcPr>
+          <w:p>
+            <w:pPr>
+              <w:jc w:val="center"/>
+            </w:pPr>
+            <w:r/>
+            <w:r>
+              <w:rPr>
+                <w:rFonts w:ascii="Arial" w:hAnsi="Arial" w:cs="Arial"/>
+                <w:b w:val="0"/>
+                <w:i w:val="0"/>
+                <w:sz w:val="18"/>
+              </w:rPr>
+              <w:t>11</w:t>
+            </w:r>
+          </w:p>
+        </w:tc>
+        <w:tc>
+          <w:tcPr>
+            <w:tcW w:type="dxa" w:w="1701"/>
+          </w:tcPr>
+          <w:p>
+            <w:pPr>
+              <w:jc w:val="center"/>
+            </w:pPr>
+            <w:r/>
+            <w:r>
+              <w:rPr>
+                <w:rFonts w:ascii="Arial" w:hAnsi="Arial" w:cs="Arial"/>
+                <w:b w:val="0"/>
+                <w:i w:val="0"/>
+                <w:sz w:val="18"/>
+              </w:rPr>
+              <w:t>Б-313</w:t>
+            </w:r>
+          </w:p>
+        </w:tc>
+        <w:tc>
+          <w:tcPr>
+            <w:tcW w:type="dxa" w:w="1701"/>
+          </w:tcPr>
+          <w:p>
+            <w:pPr>
+              <w:jc w:val="center"/>
+            </w:pPr>
+            <w:r/>
+            <w:r>
+              <w:rPr>
+                <w:rFonts w:ascii="Arial" w:hAnsi="Arial" w:cs="Arial"/>
+                <w:b w:val="0"/>
+                <w:i w:val="0"/>
+                <w:sz w:val="18"/>
+              </w:rPr>
+              <w:t>01.04.2026</w:t>
+            </w:r>
+          </w:p>
+        </w:tc>
+        <w:tc>
+          <w:tcPr>
+            <w:tcW w:type="dxa" w:w="1701"/>
+          </w:tcPr>
+          <w:p>
+            <w:pPr>
+              <w:jc w:val="center"/>
+            </w:pPr>
+            <w:r/>
+            <w:r>
+              <w:rPr>
+                <w:rFonts w:ascii="Arial" w:hAnsi="Arial" w:cs="Arial"/>
+                <w:b w:val="0"/>
+                <w:i w:val="0"/>
+                <w:sz w:val="18"/>
+              </w:rPr>
+              <w:t>8</w:t>
+            </w:r>
+          </w:p>
+        </w:tc>
+        <w:tc>
+          <w:tcPr>
+            <w:tcW w:type="dxa" w:w="1701"/>
+          </w:tcPr>
+          <w:p>
+            <w:pPr>
+              <w:jc w:val="center"/>
+            </w:pPr>
+            <w:r/>
+            <w:r>
+              <w:rPr>
+                <w:rFonts w:ascii="Arial" w:hAnsi="Arial" w:cs="Arial"/>
+                <w:b w:val="0"/>
+                <w:i w:val="0"/>
+                <w:sz w:val="18"/>
+              </w:rPr>
+              <w:t>—</w:t>
+            </w:r>
+          </w:p>
+        </w:tc>
+        <w:tc>
+          <w:tcPr>
+            <w:tcW w:type="dxa" w:w="1701"/>
+          </w:tcPr>
+          <w:p>
+            <w:pPr>
+              <w:jc w:val="center"/>
+            </w:pPr>
+            <w:r/>
+            <w:r>
+              <w:rPr>
+                <w:rFonts w:ascii="Arial" w:hAnsi="Arial" w:cs="Arial"/>
+                <w:b w:val="0"/>
+                <w:i w:val="0"/>
+                <w:sz w:val="18"/>
+              </w:rPr>
+              <w:t>—</w:t>
+            </w:r>
+          </w:p>
+        </w:tc>
+      </w:tr>
+      <w:tr>
+        <w:tc>
+          <w:tcPr>
+            <w:tcW w:type="dxa" w:w="1701"/>
+          </w:tcPr>
+          <w:p>
+            <w:pPr>
+              <w:jc w:val="center"/>
+            </w:pPr>
+            <w:r/>
+            <w:r>
+              <w:rPr>
+                <w:rFonts w:ascii="Arial" w:hAnsi="Arial" w:cs="Arial"/>
+                <w:b w:val="0"/>
+                <w:i w:val="0"/>
+                <w:sz w:val="18"/>
+              </w:rPr>
+            </w:r>
+          </w:p>
+        </w:tc>
+        <w:tc>
+          <w:tcPr>
+            <w:tcW w:type="dxa" w:w="1701"/>
+          </w:tcPr>
+          <w:p>
+            <w:pPr>
+              <w:jc w:val="center"/>
+            </w:pPr>
+            <w:r/>
+            <w:r>
+              <w:rPr>
+                <w:rFonts w:ascii="Arial" w:hAnsi="Arial" w:cs="Arial"/>
+                <w:b w:val="0"/>
+                <w:i w:val="0"/>
+                <w:sz w:val="18"/>
+              </w:rPr>
+              <w:t>ИТОГО</w:t>
+            </w:r>
+          </w:p>
+        </w:tc>
+        <w:tc>
+          <w:tcPr>
+            <w:tcW w:type="dxa" w:w="1701"/>
+          </w:tcPr>
+          <w:p>
+            <w:pPr>
+              <w:jc w:val="center"/>
+            </w:pPr>
+            <w:r/>
+            <w:r>
+              <w:rPr>
+                <w:rFonts w:ascii="Arial" w:hAnsi="Arial" w:cs="Arial"/>
+                <w:b w:val="0"/>
+                <w:i w:val="0"/>
+                <w:sz w:val="18"/>
+              </w:rPr>
+            </w:r>
+          </w:p>
+        </w:tc>
+        <w:tc>
+          <w:tcPr>
+            <w:tcW w:type="dxa" w:w="1701"/>
+          </w:tcPr>
+          <w:p>
+            <w:pPr>
+              <w:jc w:val="center"/>
+            </w:pPr>
+            <w:r/>
+            <w:r>
+              <w:rPr>
+                <w:rFonts w:ascii="Arial" w:hAnsi="Arial" w:cs="Arial"/>
+                <w:b w:val="0"/>
+                <w:i w:val="0"/>
+                <w:sz w:val="18"/>
+              </w:rPr>
+              <w:t>88</w:t>
+            </w:r>
+          </w:p>
+        </w:tc>
+        <w:tc>
+          <w:tcPr>
+            <w:tcW w:type="dxa" w:w="1701"/>
+          </w:tcPr>
+          <w:p>
+            <w:pPr>
+              <w:jc w:val="center"/>
+            </w:pPr>
+            <w:r/>
+            <w:r>
+              <w:rPr>
+                <w:rFonts w:ascii="Arial" w:hAnsi="Arial" w:cs="Arial"/>
+                <w:b w:val="0"/>
+                <w:i w:val="0"/>
+                <w:sz w:val="18"/>
+              </w:rPr>
+              <w:t>5 из 11 машин</w:t>
+            </w:r>
+          </w:p>
+        </w:tc>
+        <w:tc>
+          <w:tcPr>
+            <w:tcW w:type="dxa" w:w="1701"/>
+          </w:tcPr>
+          <w:p>
+            <w:pPr>
+              <w:jc w:val="center"/>
+            </w:pPr>
+            <w:r/>
+            <w:r>
+              <w:rPr>
+                <w:rFonts w:ascii="Arial" w:hAnsi="Arial" w:cs="Arial"/>
+                <w:b w:val="0"/>
+                <w:i w:val="0"/>
+                <w:sz w:val="18"/>
+              </w:rPr>
+              <w:t>18</w:t>
+            </w:r>
+          </w:p>
+        </w:tc>
+      </w:tr>
+    </w:tbl>
+    <w:p>
+      <w:pPr>
+        <w:spacing w:after="360"/>
+      </w:pPr>
+      <w:r>
+        <w:rPr>
+          <w:rFonts w:ascii="Arial" w:hAnsi="Arial" w:cs="Arial"/>
+          <w:b w:val="0"/>
+          <w:i w:val="0"/>
+          <w:sz w:val="20"/>
+        </w:rPr>
+        <w:t>Несмотря на полную замену секций резисторов на всех 11 машинах в рамках отзывной кампании (март–апрель 2026г., 88 секций), уже на 5 из 11 машин зафиксирован повторный выход секций из строя (ещё 18 секций) в течение 1–3 месяцев после замены.</w:t>
+      </w:r>
+    </w:p>
+    <w:p>
+      <w:pPr>
+        <w:spacing w:after="160"/>
+      </w:pPr>
+      <w:r>
+        <w:rPr>
+          <w:rFonts w:ascii="Arial" w:hAnsi="Arial" w:cs="Arial"/>
+          <w:b/>
+          <w:i w:val="0"/>
+          <w:sz w:val="22"/>
+        </w:rPr>
+        <w:t>2. АО «Полюс Красноярск» — 11 машин (сервисная организация БТЛ)</w:t>
+      </w:r>
+    </w:p>
+    <w:tbl>
+      <w:tblPr>
+        <w:tblStyle w:val="a3"/>
+        <w:tblW w:type="auto" w:w="0"/>
+        <w:tblLook w:firstColumn="1" w:firstRow="1" w:lastColumn="0" w:lastRow="0" w:noHBand="0" w:noVBand="1" w:val="04A0"/>
+      </w:tblPr>
+      <w:tblGrid>
+        <w:gridCol w:w="1701"/>
+        <w:gridCol w:w="1701"/>
+        <w:gridCol w:w="1701"/>
+        <w:gridCol w:w="1701"/>
+        <w:gridCol w:w="1701"/>
+        <w:gridCol w:w="1701"/>
+      </w:tblGrid>
+      <w:tr>
+        <w:tc>
+          <w:tcPr>
+            <w:tcW w:type="dxa" w:w="1701"/>
+          </w:tcPr>
+          <w:p>
+            <w:pPr>
+              <w:jc w:val="center"/>
+            </w:pPr>
+            <w:r/>
+            <w:r>
+              <w:rPr>
+                <w:rFonts w:ascii="Arial" w:hAnsi="Arial" w:cs="Arial"/>
+                <w:b/>
+                <w:i w:val="0"/>
+                <w:sz w:val="18"/>
+              </w:rPr>
+              <w:t>№</w:t>
+            </w:r>
+          </w:p>
+        </w:tc>
+        <w:tc>
+          <w:tcPr>
+            <w:tcW w:type="dxa" w:w="1701"/>
+          </w:tcPr>
+          <w:p>
+            <w:pPr>
+              <w:jc w:val="center"/>
+            </w:pPr>
+            <w:r/>
+            <w:r>
+              <w:rPr>
+                <w:rFonts w:ascii="Arial" w:hAnsi="Arial" w:cs="Arial"/>
+                <w:b/>
+                <w:i w:val="0"/>
+                <w:sz w:val="18"/>
+              </w:rPr>
+              <w:t>Машина №</w:t>
+            </w:r>
+          </w:p>
+        </w:tc>
+        <w:tc>
+          <w:tcPr>
+            <w:tcW w:type="dxa" w:w="1701"/>
+          </w:tcPr>
+          <w:p>
+            <w:pPr>
+              <w:jc w:val="center"/>
+            </w:pPr>
+            <w:r/>
+            <w:r>
+              <w:rPr>
+                <w:rFonts w:ascii="Arial" w:hAnsi="Arial" w:cs="Arial"/>
+                <w:b/>
+                <w:i w:val="0"/>
+                <w:sz w:val="18"/>
+              </w:rPr>
+              <w:t>Кол-во замен</w:t>
+              <w:br/>
+              <w:t>(событий)</w:t>
+            </w:r>
+          </w:p>
+        </w:tc>
+        <w:tc>
+          <w:tcPr>
+            <w:tcW w:type="dxa" w:w="1701"/>
+          </w:tcPr>
+          <w:p>
+            <w:pPr>
+              <w:jc w:val="center"/>
+            </w:pPr>
+            <w:r/>
+            <w:r>
+              <w:rPr>
+                <w:rFonts w:ascii="Arial" w:hAnsi="Arial" w:cs="Arial"/>
+                <w:b/>
+                <w:i w:val="0"/>
+                <w:sz w:val="18"/>
+              </w:rPr>
+              <w:t>Секций</w:t>
+              <w:br/>
+              <w:t>заменено, шт</w:t>
+            </w:r>
+          </w:p>
+        </w:tc>
+        <w:tc>
+          <w:tcPr>
+            <w:tcW w:type="dxa" w:w="1701"/>
+          </w:tcPr>
+          <w:p>
+            <w:pPr>
+              <w:jc w:val="center"/>
+            </w:pPr>
+            <w:r/>
+            <w:r>
+              <w:rPr>
+                <w:rFonts w:ascii="Arial" w:hAnsi="Arial" w:cs="Arial"/>
+                <w:b/>
+                <w:i w:val="0"/>
+                <w:sz w:val="18"/>
+              </w:rPr>
+              <w:t>Первая замена</w:t>
+            </w:r>
+          </w:p>
+        </w:tc>
+        <w:tc>
+          <w:tcPr>
+            <w:tcW w:type="dxa" w:w="1701"/>
+          </w:tcPr>
+          <w:p>
+            <w:pPr>
+              <w:jc w:val="center"/>
+            </w:pPr>
+            <w:r/>
+            <w:r>
+              <w:rPr>
+                <w:rFonts w:ascii="Arial" w:hAnsi="Arial" w:cs="Arial"/>
+                <w:b/>
+                <w:i w:val="0"/>
+                <w:sz w:val="18"/>
+              </w:rPr>
+              <w:t>Последняя замена</w:t>
+            </w:r>
+          </w:p>
+        </w:tc>
+      </w:tr>
+      <w:tr>
+        <w:tc>
+          <w:tcPr>
+            <w:tcW w:type="dxa" w:w="1701"/>
+          </w:tcPr>
+          <w:p>
+            <w:pPr>
+              <w:jc w:val="center"/>
+            </w:pPr>
+            <w:r/>
+            <w:r>
+              <w:rPr>
+                <w:rFonts w:ascii="Arial" w:hAnsi="Arial" w:cs="Arial"/>
+                <w:b w:val="0"/>
+                <w:i w:val="0"/>
+                <w:sz w:val="18"/>
+              </w:rPr>
+              <w:t>1</w:t>
+            </w:r>
+          </w:p>
+        </w:tc>
+        <w:tc>
+          <w:tcPr>
+            <w:tcW w:type="dxa" w:w="1701"/>
+          </w:tcPr>
+          <w:p>
+            <w:pPr>
+              <w:jc w:val="center"/>
+            </w:pPr>
+            <w:r/>
+            <w:r>
+              <w:rPr>
+                <w:rFonts w:ascii="Arial" w:hAnsi="Arial" w:cs="Arial"/>
+                <w:b w:val="0"/>
+                <w:i w:val="0"/>
+                <w:sz w:val="18"/>
+              </w:rPr>
+              <w:t>1653</w:t>
+            </w:r>
+          </w:p>
+        </w:tc>
+        <w:tc>
+          <w:tcPr>
+            <w:tcW w:type="dxa" w:w="1701"/>
+          </w:tcPr>
+          <w:p>
+            <w:pPr>
+              <w:jc w:val="center"/>
+            </w:pPr>
+            <w:r/>
+            <w:r>
+              <w:rPr>
+                <w:rFonts w:ascii="Arial" w:hAnsi="Arial" w:cs="Arial"/>
+                <w:b w:val="0"/>
+                <w:i w:val="0"/>
+                <w:sz w:val="18"/>
+              </w:rPr>
+              <w:t>7</w:t>
+            </w:r>
+          </w:p>
+        </w:tc>
+        <w:tc>
+          <w:tcPr>
+            <w:tcW w:type="dxa" w:w="1701"/>
+          </w:tcPr>
+          <w:p>
+            <w:pPr>
+              <w:jc w:val="center"/>
+            </w:pPr>
+            <w:r/>
+            <w:r>
+              <w:rPr>
+                <w:rFonts w:ascii="Arial" w:hAnsi="Arial" w:cs="Arial"/>
+                <w:b w:val="0"/>
+                <w:i w:val="0"/>
+                <w:sz w:val="18"/>
+              </w:rPr>
+              <w:t>20</w:t>
+            </w:r>
+          </w:p>
+        </w:tc>
+        <w:tc>
+          <w:tcPr>
+            <w:tcW w:type="dxa" w:w="1701"/>
+          </w:tcPr>
+          <w:p>
+            <w:pPr>
+              <w:jc w:val="center"/>
+            </w:pPr>
+            <w:r/>
+            <w:r>
+              <w:rPr>
+                <w:rFonts w:ascii="Arial" w:hAnsi="Arial" w:cs="Arial"/>
+                <w:b w:val="0"/>
+                <w:i w:val="0"/>
+                <w:sz w:val="18"/>
+              </w:rPr>
+              <w:t>17.01.2026</w:t>
+            </w:r>
+          </w:p>
+        </w:tc>
+        <w:tc>
+          <w:tcPr>
+            <w:tcW w:type="dxa" w:w="1701"/>
+          </w:tcPr>
+          <w:p>
+            <w:pPr>
+              <w:jc w:val="center"/>
+            </w:pPr>
+            <w:r/>
+            <w:r>
+              <w:rPr>
+                <w:rFonts w:ascii="Arial" w:hAnsi="Arial" w:cs="Arial"/>
+                <w:b w:val="0"/>
+                <w:i w:val="0"/>
+                <w:sz w:val="18"/>
+              </w:rPr>
+              <w:t>27.06.2026</w:t>
+            </w:r>
+          </w:p>
+        </w:tc>
+      </w:tr>
+      <w:tr>
+        <w:tc>
+          <w:tcPr>
+            <w:tcW w:type="dxa" w:w="1701"/>
+          </w:tcPr>
+          <w:p>
+            <w:pPr>
+              <w:jc w:val="center"/>
+            </w:pPr>
+            <w:r/>
+            <w:r>
+              <w:rPr>
+                <w:rFonts w:ascii="Arial" w:hAnsi="Arial" w:cs="Arial"/>
+                <w:b w:val="0"/>
+                <w:i w:val="0"/>
+                <w:sz w:val="18"/>
+              </w:rPr>
+              <w:t>2</w:t>
+            </w:r>
+          </w:p>
+        </w:tc>
+        <w:tc>
+          <w:tcPr>
+            <w:tcW w:type="dxa" w:w="1701"/>
+          </w:tcPr>
+          <w:p>
+            <w:pPr>
+              <w:jc w:val="center"/>
+            </w:pPr>
+            <w:r/>
+            <w:r>
+              <w:rPr>
+                <w:rFonts w:ascii="Arial" w:hAnsi="Arial" w:cs="Arial"/>
+                <w:b w:val="0"/>
+                <w:i w:val="0"/>
+                <w:sz w:val="18"/>
+              </w:rPr>
+              <w:t>1654</w:t>
+            </w:r>
+          </w:p>
+        </w:tc>
+        <w:tc>
+          <w:tcPr>
+            <w:tcW w:type="dxa" w:w="1701"/>
+          </w:tcPr>
+          <w:p>
+            <w:pPr>
+              <w:jc w:val="center"/>
+            </w:pPr>
+            <w:r/>
+            <w:r>
+              <w:rPr>
+                <w:rFonts w:ascii="Arial" w:hAnsi="Arial" w:cs="Arial"/>
+                <w:b w:val="0"/>
+                <w:i w:val="0"/>
+                <w:sz w:val="18"/>
+              </w:rPr>
+              <w:t>3</w:t>
+            </w:r>
+          </w:p>
+        </w:tc>
+        <w:tc>
+          <w:tcPr>
+            <w:tcW w:type="dxa" w:w="1701"/>
+          </w:tcPr>
+          <w:p>
+            <w:pPr>
+              <w:jc w:val="center"/>
+            </w:pPr>
+            <w:r/>
+            <w:r>
+              <w:rPr>
+                <w:rFonts w:ascii="Arial" w:hAnsi="Arial" w:cs="Arial"/>
+                <w:b w:val="0"/>
+                <w:i w:val="0"/>
+                <w:sz w:val="18"/>
+              </w:rPr>
+              <w:t>13</w:t>
+            </w:r>
+          </w:p>
+        </w:tc>
+        <w:tc>
+          <w:tcPr>
+            <w:tcW w:type="dxa" w:w="1701"/>
+          </w:tcPr>
+          <w:p>
+            <w:pPr>
+              <w:jc w:val="center"/>
+            </w:pPr>
+            <w:r/>
+            <w:r>
+              <w:rPr>
+                <w:rFonts w:ascii="Arial" w:hAnsi="Arial" w:cs="Arial"/>
+                <w:b w:val="0"/>
+                <w:i w:val="0"/>
+                <w:sz w:val="18"/>
+              </w:rPr>
+              <w:t>07.01.2026</w:t>
+            </w:r>
+          </w:p>
+        </w:tc>
+        <w:tc>
+          <w:tcPr>
+            <w:tcW w:type="dxa" w:w="1701"/>
+          </w:tcPr>
+          <w:p>
+            <w:pPr>
+              <w:jc w:val="center"/>
+            </w:pPr>
+            <w:r/>
+            <w:r>
+              <w:rPr>
+                <w:rFonts w:ascii="Arial" w:hAnsi="Arial" w:cs="Arial"/>
+                <w:b w:val="0"/>
+                <w:i w:val="0"/>
+                <w:sz w:val="18"/>
+              </w:rPr>
+              <w:t>21.03.2026</w:t>
+            </w:r>
+          </w:p>
+        </w:tc>
+      </w:tr>
+      <w:tr>
+        <w:tc>
+          <w:tcPr>
+            <w:tcW w:type="dxa" w:w="1701"/>
+          </w:tcPr>
+          <w:p>
+            <w:pPr>
+              <w:jc w:val="center"/>
+            </w:pPr>
+            <w:r/>
+            <w:r>
+              <w:rPr>
+                <w:rFonts w:ascii="Arial" w:hAnsi="Arial" w:cs="Arial"/>
+                <w:b w:val="0"/>
+                <w:i w:val="0"/>
+                <w:sz w:val="18"/>
+              </w:rPr>
+              <w:t>3</w:t>
+            </w:r>
+          </w:p>
+        </w:tc>
+        <w:tc>
+          <w:tcPr>
+            <w:tcW w:type="dxa" w:w="1701"/>
+          </w:tcPr>
+          <w:p>
+            <w:pPr>
+              <w:jc w:val="center"/>
+            </w:pPr>
+            <w:r/>
+            <w:r>
+              <w:rPr>
+                <w:rFonts w:ascii="Arial" w:hAnsi="Arial" w:cs="Arial"/>
+                <w:b w:val="0"/>
+                <w:i w:val="0"/>
+                <w:sz w:val="18"/>
+              </w:rPr>
+              <w:t>1655</w:t>
+            </w:r>
+          </w:p>
+        </w:tc>
+        <w:tc>
+          <w:tcPr>
+            <w:tcW w:type="dxa" w:w="1701"/>
+          </w:tcPr>
+          <w:p>
+            <w:pPr>
+              <w:jc w:val="center"/>
+            </w:pPr>
+            <w:r/>
+            <w:r>
+              <w:rPr>
+                <w:rFonts w:ascii="Arial" w:hAnsi="Arial" w:cs="Arial"/>
+                <w:b w:val="0"/>
+                <w:i w:val="0"/>
+                <w:sz w:val="18"/>
+              </w:rPr>
+              <w:t>8</w:t>
+            </w:r>
+          </w:p>
+        </w:tc>
+        <w:tc>
+          <w:tcPr>
+            <w:tcW w:type="dxa" w:w="1701"/>
+          </w:tcPr>
+          <w:p>
+            <w:pPr>
+              <w:jc w:val="center"/>
+            </w:pPr>
+            <w:r/>
+            <w:r>
+              <w:rPr>
+                <w:rFonts w:ascii="Arial" w:hAnsi="Arial" w:cs="Arial"/>
+                <w:b w:val="0"/>
+                <w:i w:val="0"/>
+                <w:sz w:val="18"/>
+              </w:rPr>
+              <w:t>21</w:t>
+            </w:r>
+          </w:p>
+        </w:tc>
+        <w:tc>
+          <w:tcPr>
+            <w:tcW w:type="dxa" w:w="1701"/>
+          </w:tcPr>
+          <w:p>
+            <w:pPr>
+              <w:jc w:val="center"/>
+            </w:pPr>
+            <w:r/>
+            <w:r>
+              <w:rPr>
+                <w:rFonts w:ascii="Arial" w:hAnsi="Arial" w:cs="Arial"/>
+                <w:b w:val="0"/>
+                <w:i w:val="0"/>
+                <w:sz w:val="18"/>
+              </w:rPr>
+              <w:t>05.01.2026</w:t>
+            </w:r>
+          </w:p>
+        </w:tc>
+        <w:tc>
+          <w:tcPr>
+            <w:tcW w:type="dxa" w:w="1701"/>
+          </w:tcPr>
+          <w:p>
+            <w:pPr>
+              <w:jc w:val="center"/>
+            </w:pPr>
+            <w:r/>
+            <w:r>
+              <w:rPr>
+                <w:rFonts w:ascii="Arial" w:hAnsi="Arial" w:cs="Arial"/>
+                <w:b w:val="0"/>
+                <w:i w:val="0"/>
+                <w:sz w:val="18"/>
+              </w:rPr>
+              <w:t>26.06.2026</w:t>
+            </w:r>
+          </w:p>
+        </w:tc>
+      </w:tr>
+      <w:tr>
+        <w:tc>
+          <w:tcPr>
+            <w:tcW w:type="dxa" w:w="1701"/>
+          </w:tcPr>
+          <w:p>
+            <w:pPr>
+              <w:jc w:val="center"/>
+            </w:pPr>
+            <w:r/>
+            <w:r>
+              <w:rPr>
+                <w:rFonts w:ascii="Arial" w:hAnsi="Arial" w:cs="Arial"/>
+                <w:b w:val="0"/>
+                <w:i w:val="0"/>
+                <w:sz w:val="18"/>
+              </w:rPr>
+              <w:t>4</w:t>
+            </w:r>
+          </w:p>
+        </w:tc>
+        <w:tc>
+          <w:tcPr>
+            <w:tcW w:type="dxa" w:w="1701"/>
+          </w:tcPr>
+          <w:p>
+            <w:pPr>
+              <w:jc w:val="center"/>
+            </w:pPr>
+            <w:r/>
+            <w:r>
+              <w:rPr>
+                <w:rFonts w:ascii="Arial" w:hAnsi="Arial" w:cs="Arial"/>
+                <w:b w:val="0"/>
+                <w:i w:val="0"/>
+                <w:sz w:val="18"/>
+              </w:rPr>
+              <w:t>1656</w:t>
+            </w:r>
+          </w:p>
+        </w:tc>
+        <w:tc>
+          <w:tcPr>
+            <w:tcW w:type="dxa" w:w="1701"/>
+          </w:tcPr>
+          <w:p>
+            <w:pPr>
+              <w:jc w:val="center"/>
+            </w:pPr>
+            <w:r/>
+            <w:r>
+              <w:rPr>
+                <w:rFonts w:ascii="Arial" w:hAnsi="Arial" w:cs="Arial"/>
+                <w:b w:val="0"/>
+                <w:i w:val="0"/>
+                <w:sz w:val="18"/>
+              </w:rPr>
+              <w:t>4</w:t>
+            </w:r>
+          </w:p>
+        </w:tc>
+        <w:tc>
+          <w:tcPr>
+            <w:tcW w:type="dxa" w:w="1701"/>
+          </w:tcPr>
+          <w:p>
+            <w:pPr>
+              <w:jc w:val="center"/>
+            </w:pPr>
+            <w:r/>
+            <w:r>
+              <w:rPr>
+                <w:rFonts w:ascii="Arial" w:hAnsi="Arial" w:cs="Arial"/>
+                <w:b w:val="0"/>
+                <w:i w:val="0"/>
+                <w:sz w:val="18"/>
+              </w:rPr>
+              <w:t>16</w:t>
+            </w:r>
+          </w:p>
+        </w:tc>
+        <w:tc>
+          <w:tcPr>
+            <w:tcW w:type="dxa" w:w="1701"/>
+          </w:tcPr>
+          <w:p>
+            <w:pPr>
+              <w:jc w:val="center"/>
+            </w:pPr>
+            <w:r/>
+            <w:r>
+              <w:rPr>
+                <w:rFonts w:ascii="Arial" w:hAnsi="Arial" w:cs="Arial"/>
+                <w:b w:val="0"/>
+                <w:i w:val="0"/>
+                <w:sz w:val="18"/>
+              </w:rPr>
+              <w:t>13.01.2026</w:t>
+            </w:r>
+          </w:p>
+        </w:tc>
+        <w:tc>
+          <w:tcPr>
+            <w:tcW w:type="dxa" w:w="1701"/>
+          </w:tcPr>
+          <w:p>
+            <w:pPr>
+              <w:jc w:val="center"/>
+            </w:pPr>
+            <w:r/>
+            <w:r>
+              <w:rPr>
+                <w:rFonts w:ascii="Arial" w:hAnsi="Arial" w:cs="Arial"/>
+                <w:b w:val="0"/>
+                <w:i w:val="0"/>
+                <w:sz w:val="18"/>
+              </w:rPr>
+              <w:t>14.04.2026</w:t>
+            </w:r>
+          </w:p>
+        </w:tc>
+      </w:tr>
+      <w:tr>
+        <w:tc>
+          <w:tcPr>
+            <w:tcW w:type="dxa" w:w="1701"/>
+          </w:tcPr>
+          <w:p>
+            <w:pPr>
+              <w:jc w:val="center"/>
+            </w:pPr>
+            <w:r/>
+            <w:r>
+              <w:rPr>
+                <w:rFonts w:ascii="Arial" w:hAnsi="Arial" w:cs="Arial"/>
+                <w:b w:val="0"/>
+                <w:i w:val="0"/>
+                <w:sz w:val="18"/>
+              </w:rPr>
+              <w:t>5</w:t>
+            </w:r>
+          </w:p>
+        </w:tc>
+        <w:tc>
+          <w:tcPr>
+            <w:tcW w:type="dxa" w:w="1701"/>
+          </w:tcPr>
+          <w:p>
+            <w:pPr>
+              <w:jc w:val="center"/>
+            </w:pPr>
+            <w:r/>
+            <w:r>
+              <w:rPr>
+                <w:rFonts w:ascii="Arial" w:hAnsi="Arial" w:cs="Arial"/>
+                <w:b w:val="0"/>
+                <w:i w:val="0"/>
+                <w:sz w:val="18"/>
+              </w:rPr>
+              <w:t>1657</w:t>
+            </w:r>
+          </w:p>
+        </w:tc>
+        <w:tc>
+          <w:tcPr>
+            <w:tcW w:type="dxa" w:w="1701"/>
+          </w:tcPr>
+          <w:p>
+            <w:pPr>
+              <w:jc w:val="center"/>
+            </w:pPr>
+            <w:r/>
+            <w:r>
+              <w:rPr>
+                <w:rFonts w:ascii="Arial" w:hAnsi="Arial" w:cs="Arial"/>
+                <w:b w:val="0"/>
+                <w:i w:val="0"/>
+                <w:sz w:val="18"/>
+              </w:rPr>
+              <w:t>3</w:t>
+            </w:r>
+          </w:p>
+        </w:tc>
+        <w:tc>
+          <w:tcPr>
+            <w:tcW w:type="dxa" w:w="1701"/>
+          </w:tcPr>
+          <w:p>
+            <w:pPr>
+              <w:jc w:val="center"/>
+            </w:pPr>
+            <w:r/>
+            <w:r>
+              <w:rPr>
+                <w:rFonts w:ascii="Arial" w:hAnsi="Arial" w:cs="Arial"/>
+                <w:b w:val="0"/>
+                <w:i w:val="0"/>
+                <w:sz w:val="18"/>
+              </w:rPr>
+              <w:t>10</w:t>
+            </w:r>
+          </w:p>
+        </w:tc>
+        <w:tc>
+          <w:tcPr>
+            <w:tcW w:type="dxa" w:w="1701"/>
+          </w:tcPr>
+          <w:p>
+            <w:pPr>
+              <w:jc w:val="center"/>
+            </w:pPr>
+            <w:r/>
+            <w:r>
+              <w:rPr>
+                <w:rFonts w:ascii="Arial" w:hAnsi="Arial" w:cs="Arial"/>
+                <w:b w:val="0"/>
+                <w:i w:val="0"/>
+                <w:sz w:val="18"/>
+              </w:rPr>
+              <w:t>11.01.2026</w:t>
+            </w:r>
+          </w:p>
+        </w:tc>
+        <w:tc>
+          <w:tcPr>
+            <w:tcW w:type="dxa" w:w="1701"/>
+          </w:tcPr>
+          <w:p>
+            <w:pPr>
+              <w:jc w:val="center"/>
+            </w:pPr>
+            <w:r/>
+            <w:r>
+              <w:rPr>
+                <w:rFonts w:ascii="Arial" w:hAnsi="Arial" w:cs="Arial"/>
+                <w:b w:val="0"/>
+                <w:i w:val="0"/>
+                <w:sz w:val="18"/>
+              </w:rPr>
+              <w:t>09.03.2026</w:t>
+            </w:r>
+          </w:p>
+        </w:tc>
+      </w:tr>
+      <w:tr>
+        <w:tc>
+          <w:tcPr>
+            <w:tcW w:type="dxa" w:w="1701"/>
+          </w:tcPr>
+          <w:p>
+            <w:pPr>
+              <w:jc w:val="center"/>
+            </w:pPr>
+            <w:r/>
+            <w:r>
+              <w:rPr>
+                <w:rFonts w:ascii="Arial" w:hAnsi="Arial" w:cs="Arial"/>
+                <w:b w:val="0"/>
+                <w:i w:val="0"/>
+                <w:sz w:val="18"/>
+              </w:rPr>
+              <w:t>6</w:t>
+            </w:r>
+          </w:p>
+        </w:tc>
+        <w:tc>
+          <w:tcPr>
+            <w:tcW w:type="dxa" w:w="1701"/>
+          </w:tcPr>
+          <w:p>
+            <w:pPr>
+              <w:jc w:val="center"/>
+            </w:pPr>
+            <w:r/>
+            <w:r>
+              <w:rPr>
+                <w:rFonts w:ascii="Arial" w:hAnsi="Arial" w:cs="Arial"/>
+                <w:b w:val="0"/>
+                <w:i w:val="0"/>
+                <w:sz w:val="18"/>
+              </w:rPr>
+              <w:t>1658</w:t>
+            </w:r>
+          </w:p>
+        </w:tc>
+        <w:tc>
+          <w:tcPr>
+            <w:tcW w:type="dxa" w:w="1701"/>
+          </w:tcPr>
+          <w:p>
+            <w:pPr>
+              <w:jc w:val="center"/>
+            </w:pPr>
+            <w:r/>
+            <w:r>
+              <w:rPr>
+                <w:rFonts w:ascii="Arial" w:hAnsi="Arial" w:cs="Arial"/>
+                <w:b w:val="0"/>
+                <w:i w:val="0"/>
+                <w:sz w:val="18"/>
+              </w:rPr>
+              <w:t>2</w:t>
+            </w:r>
+          </w:p>
+        </w:tc>
+        <w:tc>
+          <w:tcPr>
+            <w:tcW w:type="dxa" w:w="1701"/>
+          </w:tcPr>
+          <w:p>
+            <w:pPr>
+              <w:jc w:val="center"/>
+            </w:pPr>
+            <w:r/>
+            <w:r>
+              <w:rPr>
+                <w:rFonts w:ascii="Arial" w:hAnsi="Arial" w:cs="Arial"/>
+                <w:b w:val="0"/>
+                <w:i w:val="0"/>
+                <w:sz w:val="18"/>
+              </w:rPr>
+              <w:t>9</w:t>
+            </w:r>
+          </w:p>
+        </w:tc>
+        <w:tc>
+          <w:tcPr>
+            <w:tcW w:type="dxa" w:w="1701"/>
+          </w:tcPr>
+          <w:p>
+            <w:pPr>
+              <w:jc w:val="center"/>
+            </w:pPr>
+            <w:r/>
+            <w:r>
+              <w:rPr>
+                <w:rFonts w:ascii="Arial" w:hAnsi="Arial" w:cs="Arial"/>
+                <w:b w:val="0"/>
+                <w:i w:val="0"/>
+                <w:sz w:val="18"/>
+              </w:rPr>
+              <w:t>20.03.2026</w:t>
+            </w:r>
+          </w:p>
+        </w:tc>
+        <w:tc>
+          <w:tcPr>
+            <w:tcW w:type="dxa" w:w="1701"/>
+          </w:tcPr>
+          <w:p>
+            <w:pPr>
+              <w:jc w:val="center"/>
+            </w:pPr>
+            <w:r/>
+            <w:r>
+              <w:rPr>
+                <w:rFonts w:ascii="Arial" w:hAnsi="Arial" w:cs="Arial"/>
+                <w:b w:val="0"/>
+                <w:i w:val="0"/>
+                <w:sz w:val="18"/>
+              </w:rPr>
+              <w:t>16.04.2026</w:t>
+            </w:r>
+          </w:p>
+        </w:tc>
+      </w:tr>
+      <w:tr>
+        <w:tc>
+          <w:tcPr>
+            <w:tcW w:type="dxa" w:w="1701"/>
+          </w:tcPr>
+          <w:p>
+            <w:pPr>
+              <w:jc w:val="center"/>
+            </w:pPr>
+            <w:r/>
+            <w:r>
+              <w:rPr>
+                <w:rFonts w:ascii="Arial" w:hAnsi="Arial" w:cs="Arial"/>
+                <w:b w:val="0"/>
+                <w:i w:val="0"/>
+                <w:sz w:val="18"/>
+              </w:rPr>
+              <w:t>7</w:t>
+            </w:r>
+          </w:p>
+        </w:tc>
+        <w:tc>
+          <w:tcPr>
+            <w:tcW w:type="dxa" w:w="1701"/>
+          </w:tcPr>
+          <w:p>
+            <w:pPr>
+              <w:jc w:val="center"/>
+            </w:pPr>
+            <w:r/>
+            <w:r>
+              <w:rPr>
+                <w:rFonts w:ascii="Arial" w:hAnsi="Arial" w:cs="Arial"/>
+                <w:b w:val="0"/>
+                <w:i w:val="0"/>
+                <w:sz w:val="18"/>
+              </w:rPr>
+              <w:t>1659</w:t>
+            </w:r>
+          </w:p>
+        </w:tc>
+        <w:tc>
+          <w:tcPr>
+            <w:tcW w:type="dxa" w:w="1701"/>
+          </w:tcPr>
+          <w:p>
+            <w:pPr>
+              <w:jc w:val="center"/>
+            </w:pPr>
+            <w:r/>
+            <w:r>
+              <w:rPr>
+                <w:rFonts w:ascii="Arial" w:hAnsi="Arial" w:cs="Arial"/>
+                <w:b w:val="0"/>
+                <w:i w:val="0"/>
+                <w:sz w:val="18"/>
+              </w:rPr>
+              <w:t>3</w:t>
+            </w:r>
+          </w:p>
+        </w:tc>
+        <w:tc>
+          <w:tcPr>
+            <w:tcW w:type="dxa" w:w="1701"/>
+          </w:tcPr>
+          <w:p>
+            <w:pPr>
+              <w:jc w:val="center"/>
+            </w:pPr>
+            <w:r/>
+            <w:r>
+              <w:rPr>
+                <w:rFonts w:ascii="Arial" w:hAnsi="Arial" w:cs="Arial"/>
+                <w:b w:val="0"/>
+                <w:i w:val="0"/>
+                <w:sz w:val="18"/>
+              </w:rPr>
+              <w:t>11</w:t>
+            </w:r>
+          </w:p>
+        </w:tc>
+        <w:tc>
+          <w:tcPr>
+            <w:tcW w:type="dxa" w:w="1701"/>
+          </w:tcPr>
+          <w:p>
+            <w:pPr>
+              <w:jc w:val="center"/>
+            </w:pPr>
+            <w:r/>
+            <w:r>
+              <w:rPr>
+                <w:rFonts w:ascii="Arial" w:hAnsi="Arial" w:cs="Arial"/>
+                <w:b w:val="0"/>
+                <w:i w:val="0"/>
+                <w:sz w:val="18"/>
+              </w:rPr>
+              <w:t>09.01.2026</w:t>
+            </w:r>
+          </w:p>
+        </w:tc>
+        <w:tc>
+          <w:tcPr>
+            <w:tcW w:type="dxa" w:w="1701"/>
+          </w:tcPr>
+          <w:p>
+            <w:pPr>
+              <w:jc w:val="center"/>
+            </w:pPr>
+            <w:r/>
+            <w:r>
+              <w:rPr>
+                <w:rFonts w:ascii="Arial" w:hAnsi="Arial" w:cs="Arial"/>
+                <w:b w:val="0"/>
+                <w:i w:val="0"/>
+                <w:sz w:val="18"/>
+              </w:rPr>
+              <w:t>02.04.2026</w:t>
+            </w:r>
+          </w:p>
+        </w:tc>
+      </w:tr>
+      <w:tr>
+        <w:tc>
+          <w:tcPr>
+            <w:tcW w:type="dxa" w:w="1701"/>
+          </w:tcPr>
+          <w:p>
+            <w:pPr>
+              <w:jc w:val="center"/>
+            </w:pPr>
+            <w:r/>
+            <w:r>
+              <w:rPr>
+                <w:rFonts w:ascii="Arial" w:hAnsi="Arial" w:cs="Arial"/>
+                <w:b w:val="0"/>
+                <w:i w:val="0"/>
+                <w:sz w:val="18"/>
+              </w:rPr>
+              <w:t>8</w:t>
+            </w:r>
+          </w:p>
+        </w:tc>
+        <w:tc>
+          <w:tcPr>
+            <w:tcW w:type="dxa" w:w="1701"/>
+          </w:tcPr>
+          <w:p>
+            <w:pPr>
+              <w:jc w:val="center"/>
+            </w:pPr>
+            <w:r/>
+            <w:r>
+              <w:rPr>
+                <w:rFonts w:ascii="Arial" w:hAnsi="Arial" w:cs="Arial"/>
+                <w:b w:val="0"/>
+                <w:i w:val="0"/>
+                <w:sz w:val="18"/>
+              </w:rPr>
+              <w:t>1660</w:t>
+            </w:r>
+          </w:p>
+        </w:tc>
+        <w:tc>
+          <w:tcPr>
+            <w:tcW w:type="dxa" w:w="1701"/>
+          </w:tcPr>
+          <w:p>
+            <w:pPr>
+              <w:jc w:val="center"/>
+            </w:pPr>
+            <w:r/>
+            <w:r>
+              <w:rPr>
+                <w:rFonts w:ascii="Arial" w:hAnsi="Arial" w:cs="Arial"/>
+                <w:b w:val="0"/>
+                <w:i w:val="0"/>
+                <w:sz w:val="18"/>
+              </w:rPr>
+              <w:t>1</w:t>
+            </w:r>
+          </w:p>
+        </w:tc>
+        <w:tc>
+          <w:tcPr>
+            <w:tcW w:type="dxa" w:w="1701"/>
+          </w:tcPr>
+          <w:p>
+            <w:pPr>
+              <w:jc w:val="center"/>
+            </w:pPr>
+            <w:r/>
+            <w:r>
+              <w:rPr>
+                <w:rFonts w:ascii="Arial" w:hAnsi="Arial" w:cs="Arial"/>
+                <w:b w:val="0"/>
+                <w:i w:val="0"/>
+                <w:sz w:val="18"/>
+              </w:rPr>
+              <w:t>8</w:t>
+            </w:r>
+          </w:p>
+        </w:tc>
+        <w:tc>
+          <w:tcPr>
+            <w:tcW w:type="dxa" w:w="1701"/>
+          </w:tcPr>
+          <w:p>
+            <w:pPr>
+              <w:jc w:val="center"/>
+            </w:pPr>
+            <w:r/>
+            <w:r>
+              <w:rPr>
+                <w:rFonts w:ascii="Arial" w:hAnsi="Arial" w:cs="Arial"/>
+                <w:b w:val="0"/>
+                <w:i w:val="0"/>
+                <w:sz w:val="18"/>
+              </w:rPr>
+              <w:t>17.03.2026</w:t>
+            </w:r>
+          </w:p>
+        </w:tc>
+        <w:tc>
+          <w:tcPr>
+            <w:tcW w:type="dxa" w:w="1701"/>
+          </w:tcPr>
+          <w:p>
+            <w:pPr>
+              <w:jc w:val="center"/>
+            </w:pPr>
+            <w:r/>
+            <w:r>
+              <w:rPr>
+                <w:rFonts w:ascii="Arial" w:hAnsi="Arial" w:cs="Arial"/>
+                <w:b w:val="0"/>
+                <w:i w:val="0"/>
+                <w:sz w:val="18"/>
+              </w:rPr>
+              <w:t>17.03.2026</w:t>
+            </w:r>
+          </w:p>
+        </w:tc>
+      </w:tr>
+      <w:tr>
+        <w:tc>
+          <w:tcPr>
+            <w:tcW w:type="dxa" w:w="1701"/>
+          </w:tcPr>
+          <w:p>
+            <w:pPr>
+              <w:jc w:val="center"/>
+            </w:pPr>
+            <w:r/>
+            <w:r>
+              <w:rPr>
+                <w:rFonts w:ascii="Arial" w:hAnsi="Arial" w:cs="Arial"/>
+                <w:b w:val="0"/>
+                <w:i w:val="0"/>
+                <w:sz w:val="18"/>
+              </w:rPr>
+              <w:t>9</w:t>
+            </w:r>
+          </w:p>
+        </w:tc>
+        <w:tc>
+          <w:tcPr>
+            <w:tcW w:type="dxa" w:w="1701"/>
+          </w:tcPr>
+          <w:p>
+            <w:pPr>
+              <w:jc w:val="center"/>
+            </w:pPr>
+            <w:r/>
+            <w:r>
+              <w:rPr>
+                <w:rFonts w:ascii="Arial" w:hAnsi="Arial" w:cs="Arial"/>
+                <w:b w:val="0"/>
+                <w:i w:val="0"/>
+                <w:sz w:val="18"/>
+              </w:rPr>
+              <w:t>1661</w:t>
+            </w:r>
+          </w:p>
+        </w:tc>
+        <w:tc>
+          <w:tcPr>
+            <w:tcW w:type="dxa" w:w="1701"/>
+          </w:tcPr>
+          <w:p>
+            <w:pPr>
+              <w:jc w:val="center"/>
+            </w:pPr>
+            <w:r/>
+            <w:r>
+              <w:rPr>
+                <w:rFonts w:ascii="Arial" w:hAnsi="Arial" w:cs="Arial"/>
+                <w:b w:val="0"/>
+                <w:i w:val="0"/>
+                <w:sz w:val="18"/>
+              </w:rPr>
+              <w:t>1</w:t>
+            </w:r>
+          </w:p>
+        </w:tc>
+        <w:tc>
+          <w:tcPr>
+            <w:tcW w:type="dxa" w:w="1701"/>
+          </w:tcPr>
+          <w:p>
+            <w:pPr>
+              <w:jc w:val="center"/>
+            </w:pPr>
+            <w:r/>
+            <w:r>
+              <w:rPr>
+                <w:rFonts w:ascii="Arial" w:hAnsi="Arial" w:cs="Arial"/>
+                <w:b w:val="0"/>
+                <w:i w:val="0"/>
+                <w:sz w:val="18"/>
+              </w:rPr>
+              <w:t>3</w:t>
+            </w:r>
+          </w:p>
+        </w:tc>
+        <w:tc>
+          <w:tcPr>
+            <w:tcW w:type="dxa" w:w="1701"/>
+          </w:tcPr>
+          <w:p>
+            <w:pPr>
+              <w:jc w:val="center"/>
+            </w:pPr>
+            <w:r/>
+            <w:r>
+              <w:rPr>
+                <w:rFonts w:ascii="Arial" w:hAnsi="Arial" w:cs="Arial"/>
+                <w:b w:val="0"/>
+                <w:i w:val="0"/>
+                <w:sz w:val="18"/>
+              </w:rPr>
+              <w:t>23.06.2026</w:t>
+            </w:r>
+          </w:p>
+        </w:tc>
+        <w:tc>
+          <w:tcPr>
+            <w:tcW w:type="dxa" w:w="1701"/>
+          </w:tcPr>
+          <w:p>
+            <w:pPr>
+              <w:jc w:val="center"/>
+            </w:pPr>
+            <w:r/>
+            <w:r>
+              <w:rPr>
+                <w:rFonts w:ascii="Arial" w:hAnsi="Arial" w:cs="Arial"/>
+                <w:b w:val="0"/>
+                <w:i w:val="0"/>
+                <w:sz w:val="18"/>
+              </w:rPr>
+              <w:t>23.06.2026</w:t>
+            </w:r>
+          </w:p>
+        </w:tc>
+      </w:tr>
+      <w:tr>
+        <w:tc>
+          <w:tcPr>
+            <w:tcW w:type="dxa" w:w="1701"/>
+          </w:tcPr>
+          <w:p>
+            <w:pPr>
+              <w:jc w:val="center"/>
+            </w:pPr>
+            <w:r/>
+            <w:r>
+              <w:rPr>
+                <w:rFonts w:ascii="Arial" w:hAnsi="Arial" w:cs="Arial"/>
+                <w:b w:val="0"/>
+                <w:i w:val="0"/>
+                <w:sz w:val="18"/>
+              </w:rPr>
+              <w:t>10</w:t>
+            </w:r>
+          </w:p>
+        </w:tc>
+        <w:tc>
+          <w:tcPr>
+            <w:tcW w:type="dxa" w:w="1701"/>
+          </w:tcPr>
+          <w:p>
+            <w:pPr>
+              <w:jc w:val="center"/>
+            </w:pPr>
+            <w:r/>
+            <w:r>
+              <w:rPr>
+                <w:rFonts w:ascii="Arial" w:hAnsi="Arial" w:cs="Arial"/>
+                <w:b w:val="0"/>
+                <w:i w:val="0"/>
+                <w:sz w:val="18"/>
+              </w:rPr>
+              <w:t>1662</w:t>
+            </w:r>
+          </w:p>
+        </w:tc>
+        <w:tc>
+          <w:tcPr>
+            <w:tcW w:type="dxa" w:w="1701"/>
+          </w:tcPr>
+          <w:p>
+            <w:pPr>
+              <w:jc w:val="center"/>
+            </w:pPr>
+            <w:r/>
+            <w:r>
+              <w:rPr>
+                <w:rFonts w:ascii="Arial" w:hAnsi="Arial" w:cs="Arial"/>
+                <w:b w:val="0"/>
+                <w:i w:val="0"/>
+                <w:sz w:val="18"/>
+              </w:rPr>
+              <w:t>3</w:t>
+            </w:r>
+          </w:p>
+        </w:tc>
+        <w:tc>
+          <w:tcPr>
+            <w:tcW w:type="dxa" w:w="1701"/>
+          </w:tcPr>
+          <w:p>
+            <w:pPr>
+              <w:jc w:val="center"/>
+            </w:pPr>
+            <w:r/>
+            <w:r>
+              <w:rPr>
+                <w:rFonts w:ascii="Arial" w:hAnsi="Arial" w:cs="Arial"/>
+                <w:b w:val="0"/>
+                <w:i w:val="0"/>
+                <w:sz w:val="18"/>
+              </w:rPr>
+              <w:t>8</w:t>
+            </w:r>
+          </w:p>
+        </w:tc>
+        <w:tc>
+          <w:tcPr>
+            <w:tcW w:type="dxa" w:w="1701"/>
+          </w:tcPr>
+          <w:p>
+            <w:pPr>
+              <w:jc w:val="center"/>
+            </w:pPr>
+            <w:r/>
+            <w:r>
+              <w:rPr>
+                <w:rFonts w:ascii="Arial" w:hAnsi="Arial" w:cs="Arial"/>
+                <w:b w:val="0"/>
+                <w:i w:val="0"/>
+                <w:sz w:val="18"/>
+              </w:rPr>
+              <w:t>21.06.2026</w:t>
+            </w:r>
+          </w:p>
+        </w:tc>
+        <w:tc>
+          <w:tcPr>
+            <w:tcW w:type="dxa" w:w="1701"/>
+          </w:tcPr>
+          <w:p>
+            <w:pPr>
+              <w:jc w:val="center"/>
+            </w:pPr>
+            <w:r/>
+            <w:r>
+              <w:rPr>
+                <w:rFonts w:ascii="Arial" w:hAnsi="Arial" w:cs="Arial"/>
+                <w:b w:val="0"/>
+                <w:i w:val="0"/>
+                <w:sz w:val="18"/>
+              </w:rPr>
+              <w:t>29.06.2026</w:t>
+            </w:r>
+          </w:p>
+        </w:tc>
+      </w:tr>
+      <w:tr>
+        <w:tc>
+          <w:tcPr>
+            <w:tcW w:type="dxa" w:w="1701"/>
+          </w:tcPr>
+          <w:p>
+            <w:pPr>
+              <w:jc w:val="center"/>
+            </w:pPr>
+            <w:r/>
+            <w:r>
+              <w:rPr>
+                <w:rFonts w:ascii="Arial" w:hAnsi="Arial" w:cs="Arial"/>
+                <w:b w:val="0"/>
+                <w:i w:val="0"/>
+                <w:sz w:val="18"/>
+              </w:rPr>
+            </w:r>
+          </w:p>
+        </w:tc>
+        <w:tc>
+          <w:tcPr>
+            <w:tcW w:type="dxa" w:w="1701"/>
+          </w:tcPr>
+          <w:p>
+            <w:pPr>
+              <w:jc w:val="center"/>
+            </w:pPr>
+            <w:r/>
+            <w:r>
+              <w:rPr>
+                <w:rFonts w:ascii="Arial" w:hAnsi="Arial" w:cs="Arial"/>
+                <w:b w:val="0"/>
+                <w:i w:val="0"/>
+                <w:sz w:val="18"/>
+              </w:rPr>
+              <w:t>ИТОГО</w:t>
+            </w:r>
+          </w:p>
+        </w:tc>
+        <w:tc>
+          <w:tcPr>
+            <w:tcW w:type="dxa" w:w="1701"/>
+          </w:tcPr>
+          <w:p>
+            <w:pPr>
+              <w:jc w:val="center"/>
+            </w:pPr>
+            <w:r/>
+            <w:r>
+              <w:rPr>
+                <w:rFonts w:ascii="Arial" w:hAnsi="Arial" w:cs="Arial"/>
+                <w:b w:val="0"/>
+                <w:i w:val="0"/>
+                <w:sz w:val="18"/>
+              </w:rPr>
+              <w:t>35</w:t>
+            </w:r>
+          </w:p>
+        </w:tc>
+        <w:tc>
+          <w:tcPr>
+            <w:tcW w:type="dxa" w:w="1701"/>
+          </w:tcPr>
+          <w:p>
+            <w:pPr>
+              <w:jc w:val="center"/>
+            </w:pPr>
+            <w:r/>
+            <w:r>
+              <w:rPr>
+                <w:rFonts w:ascii="Arial" w:hAnsi="Arial" w:cs="Arial"/>
+                <w:b w:val="0"/>
+                <w:i w:val="0"/>
+                <w:sz w:val="18"/>
+              </w:rPr>
+              <w:t>119</w:t>
+            </w:r>
+          </w:p>
+        </w:tc>
+        <w:tc>
+          <w:tcPr>
+            <w:tcW w:type="dxa" w:w="1701"/>
+          </w:tcPr>
+          <w:p>
+            <w:pPr>
+              <w:jc w:val="center"/>
+            </w:pPr>
+            <w:r/>
+            <w:r>
+              <w:rPr>
+                <w:rFonts w:ascii="Arial" w:hAnsi="Arial" w:cs="Arial"/>
+                <w:b w:val="0"/>
+                <w:i w:val="0"/>
+                <w:sz w:val="18"/>
+              </w:rPr>
+              <w:t>05.01.2026</w:t>
+            </w:r>
+          </w:p>
+        </w:tc>
+        <w:tc>
+          <w:tcPr>
+            <w:tcW w:type="dxa" w:w="1701"/>
+          </w:tcPr>
+          <w:p>
+            <w:pPr>
+              <w:jc w:val="center"/>
+            </w:pPr>
+            <w:r/>
+            <w:r>
+              <w:rPr>
+                <w:rFonts w:ascii="Arial" w:hAnsi="Arial" w:cs="Arial"/>
+                <w:b w:val="0"/>
+                <w:i w:val="0"/>
+                <w:sz w:val="18"/>
+              </w:rPr>
+              <w:t>29.06.2026</w:t>
+            </w:r>
+          </w:p>
+        </w:tc>
+      </w:tr>
+    </w:tbl>
+    <w:p>
+      <w:pPr>
+        <w:spacing w:after="120"/>
+      </w:pPr>
+      <w:r>
+        <w:rPr>
+          <w:rFonts w:ascii="Arial" w:hAnsi="Arial" w:cs="Arial"/>
+          <w:b w:val="0"/>
+          <w:i w:val="0"/>
+          <w:sz w:val="20"/>
+        </w:rPr>
+        <w:t>С января по июнь 2026г. зафиксировано 35 отдельных случаев выхода из строя секций резисторов УВТР на 10 из 11 машин парка, заменено 119 секций — то есть фактически полный комплект секций (8 шт.) на каждой машине заменён более одного раза за полугодие.</w:t>
       </w:r>
     </w:p>
     <w:sectPr>

</xml_diff>

<commit_message>
Swap per-site failure data: Sukhoy Log (GPFK) shows the larger 119-section journal, Krasnoyarsk (BTL) the recall-campaign figures
</commit_message>
<xml_diff>
--- a/Письма/Письмо в БЕЛАЗ - ускорение поставки и модернизации УВТР.docx
+++ b/Письма/Письмо в БЕЛАЗ - ускорение поставки и модернизации УВТР.docx
@@ -800,7 +800,7 @@
           <w:bCs/>
           <w:color w:val="000000"/>
         </w:rPr>
-        <w:t>Вынуждены констатировать, что по состоянию на сегодняшний день проблема сохраняет массовый и системный характер уже на двух предприятиях, эксплуатирующих самосвалы БЕЛАЗ-7513Т: ООО «Полюс Сухой Лог» (11 машин, сервисная организация — АО «ГПФК») и АО «Полюс Красноярск» (11 машин, сервисная организация — БТЛ). На ООО «Полюс Сухой Лог», несмотря на проведённую в марте–апреле 2026г. отзывную кампанию с полной заменой секций резисторов на всех 11 машинах (по 8 шт. на каждую), уже на 5 из 11 машин (Б-302, Б-303, Б-304, Б-307, Б-309) зафиксирован повторный выход секций из строя. На АО «Полюс Красноярск» с января по июнь 2026г. по 10 из 11 машин зафиксировано 35 отдельных случаев выхода из строя секций резисторов УВТР с заменой 119 секций — то есть фактически полный комплект секций на каждой машине заменён более одного раза за полугодие.</w:t>
+        <w:t>Вынуждены констатировать, что по состоянию на сегодняшний день проблема сохраняет массовый и системный характер уже на двух предприятиях, эксплуатирующих самосвалы БЕЛАЗ-7513Т: ООО «Полюс Сухой Лог» (11 машин, сервисная организация — АО «ГПФК») и АО «Полюс Красноярск» (11 машин, сервисная организация — БТЛ). На ООО «Полюс Сухой Лог» с января по июнь 2026г. по 10 из 11 машин зафиксировано 35 отдельных случаев выхода из строя секций резисторов УВТР с заменой 119 секций — то есть фактически полный комплект секций на каждой машине заменён более одного раза за полугодие. На АО «Полюс Красноярск», несмотря на проведённую в марте–апреле 2026г. отзывную кампанию с полной заменой секций резисторов на всех 11 машинах (по 8 шт. на каждую, всего 88 секций), уже на 5 из 11 машин (Б-302, Б-303, Б-304, Б-307, Б-309) зафиксирован повторный выход секций из строя (ещё 18 секций).</w:t>
       </w:r>
     </w:p>
     <w:p>
@@ -1193,7 +1193,7 @@
                 <w:i w:val="0"/>
                 <w:sz w:val="18"/>
               </w:rPr>
-              <w:t>Гаражный №</w:t>
+              <w:t>Машина №</w:t>
             </w:r>
           </w:p>
         </w:tc>
@@ -1213,9 +1213,9 @@
                 <w:i w:val="0"/>
                 <w:sz w:val="18"/>
               </w:rPr>
-              <w:t>Замена по отзывной</w:t>
+              <w:t>Кол-во замен</w:t>
               <w:br/>
-              <w:t>кампании, дата</w:t>
+              <w:t>(событий)</w:t>
             </w:r>
           </w:p>
         </w:tc>
@@ -1235,9 +1235,9 @@
                 <w:i w:val="0"/>
                 <w:sz w:val="18"/>
               </w:rPr>
-              <w:t>Секций,</w:t>
+              <w:t>Секций</w:t>
               <w:br/>
-              <w:t>шт</w:t>
+              <w:t>заменено, шт</w:t>
             </w:r>
           </w:p>
         </w:tc>
@@ -1257,9 +1257,7 @@
                 <w:i w:val="0"/>
                 <w:sz w:val="18"/>
               </w:rPr>
-              <w:t>Повторная замена</w:t>
-              <w:br/>
-              <w:t>после кампании, дата</w:t>
+              <w:t>Первая замена</w:t>
             </w:r>
           </w:p>
         </w:tc>
@@ -1279,9 +1277,7 @@
                 <w:i w:val="0"/>
                 <w:sz w:val="18"/>
               </w:rPr>
-              <w:t>Секций,</w:t>
-              <w:br/>
-              <w:t>шт</w:t>
+              <w:t>Последняя замена</w:t>
             </w:r>
           </w:p>
         </w:tc>
@@ -1323,87 +1319,87 @@
                 <w:i w:val="0"/>
                 <w:sz w:val="18"/>
               </w:rPr>
-              <w:t>Б-301</w:t>
-            </w:r>
-          </w:p>
-        </w:tc>
-        <w:tc>
-          <w:tcPr>
-            <w:tcW w:type="dxa" w:w="1701"/>
-          </w:tcPr>
-          <w:p>
-            <w:pPr>
-              <w:jc w:val="center"/>
-            </w:pPr>
-            <w:r/>
-            <w:r>
-              <w:rPr>
-                <w:rFonts w:ascii="Arial" w:hAnsi="Arial" w:cs="Arial"/>
-                <w:b w:val="0"/>
-                <w:i w:val="0"/>
-                <w:sz w:val="18"/>
-              </w:rPr>
-              <w:t>13.04.2026</w:t>
-            </w:r>
-          </w:p>
-        </w:tc>
-        <w:tc>
-          <w:tcPr>
-            <w:tcW w:type="dxa" w:w="1701"/>
-          </w:tcPr>
-          <w:p>
-            <w:pPr>
-              <w:jc w:val="center"/>
-            </w:pPr>
-            <w:r/>
-            <w:r>
-              <w:rPr>
-                <w:rFonts w:ascii="Arial" w:hAnsi="Arial" w:cs="Arial"/>
-                <w:b w:val="0"/>
-                <w:i w:val="0"/>
-                <w:sz w:val="18"/>
-              </w:rPr>
-              <w:t>8</w:t>
-            </w:r>
-          </w:p>
-        </w:tc>
-        <w:tc>
-          <w:tcPr>
-            <w:tcW w:type="dxa" w:w="1701"/>
-          </w:tcPr>
-          <w:p>
-            <w:pPr>
-              <w:jc w:val="center"/>
-            </w:pPr>
-            <w:r/>
-            <w:r>
-              <w:rPr>
-                <w:rFonts w:ascii="Arial" w:hAnsi="Arial" w:cs="Arial"/>
-                <w:b w:val="0"/>
-                <w:i w:val="0"/>
-                <w:sz w:val="18"/>
-              </w:rPr>
-              <w:t>—</w:t>
-            </w:r>
-          </w:p>
-        </w:tc>
-        <w:tc>
-          <w:tcPr>
-            <w:tcW w:type="dxa" w:w="1701"/>
-          </w:tcPr>
-          <w:p>
-            <w:pPr>
-              <w:jc w:val="center"/>
-            </w:pPr>
-            <w:r/>
-            <w:r>
-              <w:rPr>
-                <w:rFonts w:ascii="Arial" w:hAnsi="Arial" w:cs="Arial"/>
-                <w:b w:val="0"/>
-                <w:i w:val="0"/>
-                <w:sz w:val="18"/>
-              </w:rPr>
-              <w:t>—</w:t>
+              <w:t>1653</w:t>
+            </w:r>
+          </w:p>
+        </w:tc>
+        <w:tc>
+          <w:tcPr>
+            <w:tcW w:type="dxa" w:w="1701"/>
+          </w:tcPr>
+          <w:p>
+            <w:pPr>
+              <w:jc w:val="center"/>
+            </w:pPr>
+            <w:r/>
+            <w:r>
+              <w:rPr>
+                <w:rFonts w:ascii="Arial" w:hAnsi="Arial" w:cs="Arial"/>
+                <w:b w:val="0"/>
+                <w:i w:val="0"/>
+                <w:sz w:val="18"/>
+              </w:rPr>
+              <w:t>7</w:t>
+            </w:r>
+          </w:p>
+        </w:tc>
+        <w:tc>
+          <w:tcPr>
+            <w:tcW w:type="dxa" w:w="1701"/>
+          </w:tcPr>
+          <w:p>
+            <w:pPr>
+              <w:jc w:val="center"/>
+            </w:pPr>
+            <w:r/>
+            <w:r>
+              <w:rPr>
+                <w:rFonts w:ascii="Arial" w:hAnsi="Arial" w:cs="Arial"/>
+                <w:b w:val="0"/>
+                <w:i w:val="0"/>
+                <w:sz w:val="18"/>
+              </w:rPr>
+              <w:t>20</w:t>
+            </w:r>
+          </w:p>
+        </w:tc>
+        <w:tc>
+          <w:tcPr>
+            <w:tcW w:type="dxa" w:w="1701"/>
+          </w:tcPr>
+          <w:p>
+            <w:pPr>
+              <w:jc w:val="center"/>
+            </w:pPr>
+            <w:r/>
+            <w:r>
+              <w:rPr>
+                <w:rFonts w:ascii="Arial" w:hAnsi="Arial" w:cs="Arial"/>
+                <w:b w:val="0"/>
+                <w:i w:val="0"/>
+                <w:sz w:val="18"/>
+              </w:rPr>
+              <w:t>17.01.2026</w:t>
+            </w:r>
+          </w:p>
+        </w:tc>
+        <w:tc>
+          <w:tcPr>
+            <w:tcW w:type="dxa" w:w="1701"/>
+          </w:tcPr>
+          <w:p>
+            <w:pPr>
+              <w:jc w:val="center"/>
+            </w:pPr>
+            <w:r/>
+            <w:r>
+              <w:rPr>
+                <w:rFonts w:ascii="Arial" w:hAnsi="Arial" w:cs="Arial"/>
+                <w:b w:val="0"/>
+                <w:i w:val="0"/>
+                <w:sz w:val="18"/>
+              </w:rPr>
+              <w:t>27.06.2026</w:t>
             </w:r>
           </w:p>
         </w:tc>
@@ -1445,87 +1441,87 @@
                 <w:i w:val="0"/>
                 <w:sz w:val="18"/>
               </w:rPr>
-              <w:t>Б-302</w:t>
-            </w:r>
-          </w:p>
-        </w:tc>
-        <w:tc>
-          <w:tcPr>
-            <w:tcW w:type="dxa" w:w="1701"/>
-          </w:tcPr>
-          <w:p>
-            <w:pPr>
-              <w:jc w:val="center"/>
-            </w:pPr>
-            <w:r/>
-            <w:r>
-              <w:rPr>
-                <w:rFonts w:ascii="Arial" w:hAnsi="Arial" w:cs="Arial"/>
-                <w:b w:val="0"/>
-                <w:i w:val="0"/>
-                <w:sz w:val="18"/>
-              </w:rPr>
-              <w:t>31.03.2026</w:t>
-            </w:r>
-          </w:p>
-        </w:tc>
-        <w:tc>
-          <w:tcPr>
-            <w:tcW w:type="dxa" w:w="1701"/>
-          </w:tcPr>
-          <w:p>
-            <w:pPr>
-              <w:jc w:val="center"/>
-            </w:pPr>
-            <w:r/>
-            <w:r>
-              <w:rPr>
-                <w:rFonts w:ascii="Arial" w:hAnsi="Arial" w:cs="Arial"/>
-                <w:b w:val="0"/>
-                <w:i w:val="0"/>
-                <w:sz w:val="18"/>
-              </w:rPr>
-              <w:t>8</w:t>
-            </w:r>
-          </w:p>
-        </w:tc>
-        <w:tc>
-          <w:tcPr>
-            <w:tcW w:type="dxa" w:w="1701"/>
-          </w:tcPr>
-          <w:p>
-            <w:pPr>
-              <w:jc w:val="center"/>
-            </w:pPr>
-            <w:r/>
-            <w:r>
-              <w:rPr>
-                <w:rFonts w:ascii="Arial" w:hAnsi="Arial" w:cs="Arial"/>
-                <w:b w:val="0"/>
-                <w:i w:val="0"/>
-                <w:sz w:val="18"/>
-              </w:rPr>
-              <w:t>11.06.2026</w:t>
-            </w:r>
-          </w:p>
-        </w:tc>
-        <w:tc>
-          <w:tcPr>
-            <w:tcW w:type="dxa" w:w="1701"/>
-          </w:tcPr>
-          <w:p>
-            <w:pPr>
-              <w:jc w:val="center"/>
-            </w:pPr>
-            <w:r/>
-            <w:r>
-              <w:rPr>
-                <w:rFonts w:ascii="Arial" w:hAnsi="Arial" w:cs="Arial"/>
-                <w:b w:val="0"/>
-                <w:i w:val="0"/>
-                <w:sz w:val="18"/>
-              </w:rPr>
-              <w:t>4</w:t>
+              <w:t>1654</w:t>
+            </w:r>
+          </w:p>
+        </w:tc>
+        <w:tc>
+          <w:tcPr>
+            <w:tcW w:type="dxa" w:w="1701"/>
+          </w:tcPr>
+          <w:p>
+            <w:pPr>
+              <w:jc w:val="center"/>
+            </w:pPr>
+            <w:r/>
+            <w:r>
+              <w:rPr>
+                <w:rFonts w:ascii="Arial" w:hAnsi="Arial" w:cs="Arial"/>
+                <w:b w:val="0"/>
+                <w:i w:val="0"/>
+                <w:sz w:val="18"/>
+              </w:rPr>
+              <w:t>3</w:t>
+            </w:r>
+          </w:p>
+        </w:tc>
+        <w:tc>
+          <w:tcPr>
+            <w:tcW w:type="dxa" w:w="1701"/>
+          </w:tcPr>
+          <w:p>
+            <w:pPr>
+              <w:jc w:val="center"/>
+            </w:pPr>
+            <w:r/>
+            <w:r>
+              <w:rPr>
+                <w:rFonts w:ascii="Arial" w:hAnsi="Arial" w:cs="Arial"/>
+                <w:b w:val="0"/>
+                <w:i w:val="0"/>
+                <w:sz w:val="18"/>
+              </w:rPr>
+              <w:t>13</w:t>
+            </w:r>
+          </w:p>
+        </w:tc>
+        <w:tc>
+          <w:tcPr>
+            <w:tcW w:type="dxa" w:w="1701"/>
+          </w:tcPr>
+          <w:p>
+            <w:pPr>
+              <w:jc w:val="center"/>
+            </w:pPr>
+            <w:r/>
+            <w:r>
+              <w:rPr>
+                <w:rFonts w:ascii="Arial" w:hAnsi="Arial" w:cs="Arial"/>
+                <w:b w:val="0"/>
+                <w:i w:val="0"/>
+                <w:sz w:val="18"/>
+              </w:rPr>
+              <w:t>07.01.2026</w:t>
+            </w:r>
+          </w:p>
+        </w:tc>
+        <w:tc>
+          <w:tcPr>
+            <w:tcW w:type="dxa" w:w="1701"/>
+          </w:tcPr>
+          <w:p>
+            <w:pPr>
+              <w:jc w:val="center"/>
+            </w:pPr>
+            <w:r/>
+            <w:r>
+              <w:rPr>
+                <w:rFonts w:ascii="Arial" w:hAnsi="Arial" w:cs="Arial"/>
+                <w:b w:val="0"/>
+                <w:i w:val="0"/>
+                <w:sz w:val="18"/>
+              </w:rPr>
+              <w:t>21.03.2026</w:t>
             </w:r>
           </w:p>
         </w:tc>
@@ -1567,27 +1563,7 @@
                 <w:i w:val="0"/>
                 <w:sz w:val="18"/>
               </w:rPr>
-              <w:t>Б-303</w:t>
-            </w:r>
-          </w:p>
-        </w:tc>
-        <w:tc>
-          <w:tcPr>
-            <w:tcW w:type="dxa" w:w="1701"/>
-          </w:tcPr>
-          <w:p>
-            <w:pPr>
-              <w:jc w:val="center"/>
-            </w:pPr>
-            <w:r/>
-            <w:r>
-              <w:rPr>
-                <w:rFonts w:ascii="Arial" w:hAnsi="Arial" w:cs="Arial"/>
-                <w:b w:val="0"/>
-                <w:i w:val="0"/>
-                <w:sz w:val="18"/>
-              </w:rPr>
-              <w:t>08.04.2026</w:t>
+              <w:t>1655</w:t>
             </w:r>
           </w:p>
         </w:tc>
@@ -1627,27 +1603,47 @@
                 <w:i w:val="0"/>
                 <w:sz w:val="18"/>
               </w:rPr>
-              <w:t>23–25.05.2026</w:t>
-            </w:r>
-          </w:p>
-        </w:tc>
-        <w:tc>
-          <w:tcPr>
-            <w:tcW w:type="dxa" w:w="1701"/>
-          </w:tcPr>
-          <w:p>
-            <w:pPr>
-              <w:jc w:val="center"/>
-            </w:pPr>
-            <w:r/>
-            <w:r>
-              <w:rPr>
-                <w:rFonts w:ascii="Arial" w:hAnsi="Arial" w:cs="Arial"/>
-                <w:b w:val="0"/>
-                <w:i w:val="0"/>
-                <w:sz w:val="18"/>
-              </w:rPr>
-              <w:t>8</w:t>
+              <w:t>21</w:t>
+            </w:r>
+          </w:p>
+        </w:tc>
+        <w:tc>
+          <w:tcPr>
+            <w:tcW w:type="dxa" w:w="1701"/>
+          </w:tcPr>
+          <w:p>
+            <w:pPr>
+              <w:jc w:val="center"/>
+            </w:pPr>
+            <w:r/>
+            <w:r>
+              <w:rPr>
+                <w:rFonts w:ascii="Arial" w:hAnsi="Arial" w:cs="Arial"/>
+                <w:b w:val="0"/>
+                <w:i w:val="0"/>
+                <w:sz w:val="18"/>
+              </w:rPr>
+              <w:t>05.01.2026</w:t>
+            </w:r>
+          </w:p>
+        </w:tc>
+        <w:tc>
+          <w:tcPr>
+            <w:tcW w:type="dxa" w:w="1701"/>
+          </w:tcPr>
+          <w:p>
+            <w:pPr>
+              <w:jc w:val="center"/>
+            </w:pPr>
+            <w:r/>
+            <w:r>
+              <w:rPr>
+                <w:rFonts w:ascii="Arial" w:hAnsi="Arial" w:cs="Arial"/>
+                <w:b w:val="0"/>
+                <w:i w:val="0"/>
+                <w:sz w:val="18"/>
+              </w:rPr>
+              <w:t>26.06.2026</w:t>
             </w:r>
           </w:p>
         </w:tc>
@@ -1689,87 +1685,87 @@
                 <w:i w:val="0"/>
                 <w:sz w:val="18"/>
               </w:rPr>
-              <w:t>Б-304</w:t>
-            </w:r>
-          </w:p>
-        </w:tc>
-        <w:tc>
-          <w:tcPr>
-            <w:tcW w:type="dxa" w:w="1701"/>
-          </w:tcPr>
-          <w:p>
-            <w:pPr>
-              <w:jc w:val="center"/>
-            </w:pPr>
-            <w:r/>
-            <w:r>
-              <w:rPr>
-                <w:rFonts w:ascii="Arial" w:hAnsi="Arial" w:cs="Arial"/>
-                <w:b w:val="0"/>
-                <w:i w:val="0"/>
-                <w:sz w:val="18"/>
-              </w:rPr>
-              <w:t>02.04.2026</w:t>
-            </w:r>
-          </w:p>
-        </w:tc>
-        <w:tc>
-          <w:tcPr>
-            <w:tcW w:type="dxa" w:w="1701"/>
-          </w:tcPr>
-          <w:p>
-            <w:pPr>
-              <w:jc w:val="center"/>
-            </w:pPr>
-            <w:r/>
-            <w:r>
-              <w:rPr>
-                <w:rFonts w:ascii="Arial" w:hAnsi="Arial" w:cs="Arial"/>
-                <w:b w:val="0"/>
-                <w:i w:val="0"/>
-                <w:sz w:val="18"/>
-              </w:rPr>
-              <w:t>8</w:t>
-            </w:r>
-          </w:p>
-        </w:tc>
-        <w:tc>
-          <w:tcPr>
-            <w:tcW w:type="dxa" w:w="1701"/>
-          </w:tcPr>
-          <w:p>
-            <w:pPr>
-              <w:jc w:val="center"/>
-            </w:pPr>
-            <w:r/>
-            <w:r>
-              <w:rPr>
-                <w:rFonts w:ascii="Arial" w:hAnsi="Arial" w:cs="Arial"/>
-                <w:b w:val="0"/>
-                <w:i w:val="0"/>
-                <w:sz w:val="18"/>
-              </w:rPr>
-              <w:t>21.06.2026</w:t>
-            </w:r>
-          </w:p>
-        </w:tc>
-        <w:tc>
-          <w:tcPr>
-            <w:tcW w:type="dxa" w:w="1701"/>
-          </w:tcPr>
-          <w:p>
-            <w:pPr>
-              <w:jc w:val="center"/>
-            </w:pPr>
-            <w:r/>
-            <w:r>
-              <w:rPr>
-                <w:rFonts w:ascii="Arial" w:hAnsi="Arial" w:cs="Arial"/>
-                <w:b w:val="0"/>
-                <w:i w:val="0"/>
-                <w:sz w:val="18"/>
-              </w:rPr>
-              <w:t>1</w:t>
+              <w:t>1656</w:t>
+            </w:r>
+          </w:p>
+        </w:tc>
+        <w:tc>
+          <w:tcPr>
+            <w:tcW w:type="dxa" w:w="1701"/>
+          </w:tcPr>
+          <w:p>
+            <w:pPr>
+              <w:jc w:val="center"/>
+            </w:pPr>
+            <w:r/>
+            <w:r>
+              <w:rPr>
+                <w:rFonts w:ascii="Arial" w:hAnsi="Arial" w:cs="Arial"/>
+                <w:b w:val="0"/>
+                <w:i w:val="0"/>
+                <w:sz w:val="18"/>
+              </w:rPr>
+              <w:t>4</w:t>
+            </w:r>
+          </w:p>
+        </w:tc>
+        <w:tc>
+          <w:tcPr>
+            <w:tcW w:type="dxa" w:w="1701"/>
+          </w:tcPr>
+          <w:p>
+            <w:pPr>
+              <w:jc w:val="center"/>
+            </w:pPr>
+            <w:r/>
+            <w:r>
+              <w:rPr>
+                <w:rFonts w:ascii="Arial" w:hAnsi="Arial" w:cs="Arial"/>
+                <w:b w:val="0"/>
+                <w:i w:val="0"/>
+                <w:sz w:val="18"/>
+              </w:rPr>
+              <w:t>16</w:t>
+            </w:r>
+          </w:p>
+        </w:tc>
+        <w:tc>
+          <w:tcPr>
+            <w:tcW w:type="dxa" w:w="1701"/>
+          </w:tcPr>
+          <w:p>
+            <w:pPr>
+              <w:jc w:val="center"/>
+            </w:pPr>
+            <w:r/>
+            <w:r>
+              <w:rPr>
+                <w:rFonts w:ascii="Arial" w:hAnsi="Arial" w:cs="Arial"/>
+                <w:b w:val="0"/>
+                <w:i w:val="0"/>
+                <w:sz w:val="18"/>
+              </w:rPr>
+              <w:t>13.01.2026</w:t>
+            </w:r>
+          </w:p>
+        </w:tc>
+        <w:tc>
+          <w:tcPr>
+            <w:tcW w:type="dxa" w:w="1701"/>
+          </w:tcPr>
+          <w:p>
+            <w:pPr>
+              <w:jc w:val="center"/>
+            </w:pPr>
+            <w:r/>
+            <w:r>
+              <w:rPr>
+                <w:rFonts w:ascii="Arial" w:hAnsi="Arial" w:cs="Arial"/>
+                <w:b w:val="0"/>
+                <w:i w:val="0"/>
+                <w:sz w:val="18"/>
+              </w:rPr>
+              <w:t>14.04.2026</w:t>
             </w:r>
           </w:p>
         </w:tc>
@@ -1811,87 +1807,87 @@
                 <w:i w:val="0"/>
                 <w:sz w:val="18"/>
               </w:rPr>
-              <w:t>Б-305</w:t>
-            </w:r>
-          </w:p>
-        </w:tc>
-        <w:tc>
-          <w:tcPr>
-            <w:tcW w:type="dxa" w:w="1701"/>
-          </w:tcPr>
-          <w:p>
-            <w:pPr>
-              <w:jc w:val="center"/>
-            </w:pPr>
-            <w:r/>
-            <w:r>
-              <w:rPr>
-                <w:rFonts w:ascii="Arial" w:hAnsi="Arial" w:cs="Arial"/>
-                <w:b w:val="0"/>
-                <w:i w:val="0"/>
-                <w:sz w:val="18"/>
-              </w:rPr>
-              <w:t>02.04.2026</w:t>
-            </w:r>
-          </w:p>
-        </w:tc>
-        <w:tc>
-          <w:tcPr>
-            <w:tcW w:type="dxa" w:w="1701"/>
-          </w:tcPr>
-          <w:p>
-            <w:pPr>
-              <w:jc w:val="center"/>
-            </w:pPr>
-            <w:r/>
-            <w:r>
-              <w:rPr>
-                <w:rFonts w:ascii="Arial" w:hAnsi="Arial" w:cs="Arial"/>
-                <w:b w:val="0"/>
-                <w:i w:val="0"/>
-                <w:sz w:val="18"/>
-              </w:rPr>
-              <w:t>8</w:t>
-            </w:r>
-          </w:p>
-        </w:tc>
-        <w:tc>
-          <w:tcPr>
-            <w:tcW w:type="dxa" w:w="1701"/>
-          </w:tcPr>
-          <w:p>
-            <w:pPr>
-              <w:jc w:val="center"/>
-            </w:pPr>
-            <w:r/>
-            <w:r>
-              <w:rPr>
-                <w:rFonts w:ascii="Arial" w:hAnsi="Arial" w:cs="Arial"/>
-                <w:b w:val="0"/>
-                <w:i w:val="0"/>
-                <w:sz w:val="18"/>
-              </w:rPr>
-              <w:t>—</w:t>
-            </w:r>
-          </w:p>
-        </w:tc>
-        <w:tc>
-          <w:tcPr>
-            <w:tcW w:type="dxa" w:w="1701"/>
-          </w:tcPr>
-          <w:p>
-            <w:pPr>
-              <w:jc w:val="center"/>
-            </w:pPr>
-            <w:r/>
-            <w:r>
-              <w:rPr>
-                <w:rFonts w:ascii="Arial" w:hAnsi="Arial" w:cs="Arial"/>
-                <w:b w:val="0"/>
-                <w:i w:val="0"/>
-                <w:sz w:val="18"/>
-              </w:rPr>
-              <w:t>—</w:t>
+              <w:t>1657</w:t>
+            </w:r>
+          </w:p>
+        </w:tc>
+        <w:tc>
+          <w:tcPr>
+            <w:tcW w:type="dxa" w:w="1701"/>
+          </w:tcPr>
+          <w:p>
+            <w:pPr>
+              <w:jc w:val="center"/>
+            </w:pPr>
+            <w:r/>
+            <w:r>
+              <w:rPr>
+                <w:rFonts w:ascii="Arial" w:hAnsi="Arial" w:cs="Arial"/>
+                <w:b w:val="0"/>
+                <w:i w:val="0"/>
+                <w:sz w:val="18"/>
+              </w:rPr>
+              <w:t>3</w:t>
+            </w:r>
+          </w:p>
+        </w:tc>
+        <w:tc>
+          <w:tcPr>
+            <w:tcW w:type="dxa" w:w="1701"/>
+          </w:tcPr>
+          <w:p>
+            <w:pPr>
+              <w:jc w:val="center"/>
+            </w:pPr>
+            <w:r/>
+            <w:r>
+              <w:rPr>
+                <w:rFonts w:ascii="Arial" w:hAnsi="Arial" w:cs="Arial"/>
+                <w:b w:val="0"/>
+                <w:i w:val="0"/>
+                <w:sz w:val="18"/>
+              </w:rPr>
+              <w:t>10</w:t>
+            </w:r>
+          </w:p>
+        </w:tc>
+        <w:tc>
+          <w:tcPr>
+            <w:tcW w:type="dxa" w:w="1701"/>
+          </w:tcPr>
+          <w:p>
+            <w:pPr>
+              <w:jc w:val="center"/>
+            </w:pPr>
+            <w:r/>
+            <w:r>
+              <w:rPr>
+                <w:rFonts w:ascii="Arial" w:hAnsi="Arial" w:cs="Arial"/>
+                <w:b w:val="0"/>
+                <w:i w:val="0"/>
+                <w:sz w:val="18"/>
+              </w:rPr>
+              <w:t>11.01.2026</w:t>
+            </w:r>
+          </w:p>
+        </w:tc>
+        <w:tc>
+          <w:tcPr>
+            <w:tcW w:type="dxa" w:w="1701"/>
+          </w:tcPr>
+          <w:p>
+            <w:pPr>
+              <w:jc w:val="center"/>
+            </w:pPr>
+            <w:r/>
+            <w:r>
+              <w:rPr>
+                <w:rFonts w:ascii="Arial" w:hAnsi="Arial" w:cs="Arial"/>
+                <w:b w:val="0"/>
+                <w:i w:val="0"/>
+                <w:sz w:val="18"/>
+              </w:rPr>
+              <w:t>09.03.2026</w:t>
             </w:r>
           </w:p>
         </w:tc>
@@ -1933,87 +1929,87 @@
                 <w:i w:val="0"/>
                 <w:sz w:val="18"/>
               </w:rPr>
-              <w:t>Б-306</w:t>
-            </w:r>
-          </w:p>
-        </w:tc>
-        <w:tc>
-          <w:tcPr>
-            <w:tcW w:type="dxa" w:w="1701"/>
-          </w:tcPr>
-          <w:p>
-            <w:pPr>
-              <w:jc w:val="center"/>
-            </w:pPr>
-            <w:r/>
-            <w:r>
-              <w:rPr>
-                <w:rFonts w:ascii="Arial" w:hAnsi="Arial" w:cs="Arial"/>
-                <w:b w:val="0"/>
-                <w:i w:val="0"/>
-                <w:sz w:val="18"/>
-              </w:rPr>
-              <w:t>07.04.2026</w:t>
-            </w:r>
-          </w:p>
-        </w:tc>
-        <w:tc>
-          <w:tcPr>
-            <w:tcW w:type="dxa" w:w="1701"/>
-          </w:tcPr>
-          <w:p>
-            <w:pPr>
-              <w:jc w:val="center"/>
-            </w:pPr>
-            <w:r/>
-            <w:r>
-              <w:rPr>
-                <w:rFonts w:ascii="Arial" w:hAnsi="Arial" w:cs="Arial"/>
-                <w:b w:val="0"/>
-                <w:i w:val="0"/>
-                <w:sz w:val="18"/>
-              </w:rPr>
-              <w:t>8</w:t>
-            </w:r>
-          </w:p>
-        </w:tc>
-        <w:tc>
-          <w:tcPr>
-            <w:tcW w:type="dxa" w:w="1701"/>
-          </w:tcPr>
-          <w:p>
-            <w:pPr>
-              <w:jc w:val="center"/>
-            </w:pPr>
-            <w:r/>
-            <w:r>
-              <w:rPr>
-                <w:rFonts w:ascii="Arial" w:hAnsi="Arial" w:cs="Arial"/>
-                <w:b w:val="0"/>
-                <w:i w:val="0"/>
-                <w:sz w:val="18"/>
-              </w:rPr>
-              <w:t>—</w:t>
-            </w:r>
-          </w:p>
-        </w:tc>
-        <w:tc>
-          <w:tcPr>
-            <w:tcW w:type="dxa" w:w="1701"/>
-          </w:tcPr>
-          <w:p>
-            <w:pPr>
-              <w:jc w:val="center"/>
-            </w:pPr>
-            <w:r/>
-            <w:r>
-              <w:rPr>
-                <w:rFonts w:ascii="Arial" w:hAnsi="Arial" w:cs="Arial"/>
-                <w:b w:val="0"/>
-                <w:i w:val="0"/>
-                <w:sz w:val="18"/>
-              </w:rPr>
-              <w:t>—</w:t>
+              <w:t>1658</w:t>
+            </w:r>
+          </w:p>
+        </w:tc>
+        <w:tc>
+          <w:tcPr>
+            <w:tcW w:type="dxa" w:w="1701"/>
+          </w:tcPr>
+          <w:p>
+            <w:pPr>
+              <w:jc w:val="center"/>
+            </w:pPr>
+            <w:r/>
+            <w:r>
+              <w:rPr>
+                <w:rFonts w:ascii="Arial" w:hAnsi="Arial" w:cs="Arial"/>
+                <w:b w:val="0"/>
+                <w:i w:val="0"/>
+                <w:sz w:val="18"/>
+              </w:rPr>
+              <w:t>2</w:t>
+            </w:r>
+          </w:p>
+        </w:tc>
+        <w:tc>
+          <w:tcPr>
+            <w:tcW w:type="dxa" w:w="1701"/>
+          </w:tcPr>
+          <w:p>
+            <w:pPr>
+              <w:jc w:val="center"/>
+            </w:pPr>
+            <w:r/>
+            <w:r>
+              <w:rPr>
+                <w:rFonts w:ascii="Arial" w:hAnsi="Arial" w:cs="Arial"/>
+                <w:b w:val="0"/>
+                <w:i w:val="0"/>
+                <w:sz w:val="18"/>
+              </w:rPr>
+              <w:t>9</w:t>
+            </w:r>
+          </w:p>
+        </w:tc>
+        <w:tc>
+          <w:tcPr>
+            <w:tcW w:type="dxa" w:w="1701"/>
+          </w:tcPr>
+          <w:p>
+            <w:pPr>
+              <w:jc w:val="center"/>
+            </w:pPr>
+            <w:r/>
+            <w:r>
+              <w:rPr>
+                <w:rFonts w:ascii="Arial" w:hAnsi="Arial" w:cs="Arial"/>
+                <w:b w:val="0"/>
+                <w:i w:val="0"/>
+                <w:sz w:val="18"/>
+              </w:rPr>
+              <w:t>20.03.2026</w:t>
+            </w:r>
+          </w:p>
+        </w:tc>
+        <w:tc>
+          <w:tcPr>
+            <w:tcW w:type="dxa" w:w="1701"/>
+          </w:tcPr>
+          <w:p>
+            <w:pPr>
+              <w:jc w:val="center"/>
+            </w:pPr>
+            <w:r/>
+            <w:r>
+              <w:rPr>
+                <w:rFonts w:ascii="Arial" w:hAnsi="Arial" w:cs="Arial"/>
+                <w:b w:val="0"/>
+                <w:i w:val="0"/>
+                <w:sz w:val="18"/>
+              </w:rPr>
+              <w:t>16.04.2026</w:t>
             </w:r>
           </w:p>
         </w:tc>
@@ -2055,67 +2051,7 @@
                 <w:i w:val="0"/>
                 <w:sz w:val="18"/>
               </w:rPr>
-              <w:t>Б-307</w:t>
-            </w:r>
-          </w:p>
-        </w:tc>
-        <w:tc>
-          <w:tcPr>
-            <w:tcW w:type="dxa" w:w="1701"/>
-          </w:tcPr>
-          <w:p>
-            <w:pPr>
-              <w:jc w:val="center"/>
-            </w:pPr>
-            <w:r/>
-            <w:r>
-              <w:rPr>
-                <w:rFonts w:ascii="Arial" w:hAnsi="Arial" w:cs="Arial"/>
-                <w:b w:val="0"/>
-                <w:i w:val="0"/>
-                <w:sz w:val="18"/>
-              </w:rPr>
-              <w:t>30.03.2026</w:t>
-            </w:r>
-          </w:p>
-        </w:tc>
-        <w:tc>
-          <w:tcPr>
-            <w:tcW w:type="dxa" w:w="1701"/>
-          </w:tcPr>
-          <w:p>
-            <w:pPr>
-              <w:jc w:val="center"/>
-            </w:pPr>
-            <w:r/>
-            <w:r>
-              <w:rPr>
-                <w:rFonts w:ascii="Arial" w:hAnsi="Arial" w:cs="Arial"/>
-                <w:b w:val="0"/>
-                <w:i w:val="0"/>
-                <w:sz w:val="18"/>
-              </w:rPr>
-              <w:t>8</w:t>
-            </w:r>
-          </w:p>
-        </w:tc>
-        <w:tc>
-          <w:tcPr>
-            <w:tcW w:type="dxa" w:w="1701"/>
-          </w:tcPr>
-          <w:p>
-            <w:pPr>
-              <w:jc w:val="center"/>
-            </w:pPr>
-            <w:r/>
-            <w:r>
-              <w:rPr>
-                <w:rFonts w:ascii="Arial" w:hAnsi="Arial" w:cs="Arial"/>
-                <w:b w:val="0"/>
-                <w:i w:val="0"/>
-                <w:sz w:val="18"/>
-              </w:rPr>
-              <w:t>18.05.2026</w:t>
+              <w:t>1659</w:t>
             </w:r>
           </w:p>
         </w:tc>
@@ -2136,6 +2072,66 @@
                 <w:sz w:val="18"/>
               </w:rPr>
               <w:t>3</w:t>
+            </w:r>
+          </w:p>
+        </w:tc>
+        <w:tc>
+          <w:tcPr>
+            <w:tcW w:type="dxa" w:w="1701"/>
+          </w:tcPr>
+          <w:p>
+            <w:pPr>
+              <w:jc w:val="center"/>
+            </w:pPr>
+            <w:r/>
+            <w:r>
+              <w:rPr>
+                <w:rFonts w:ascii="Arial" w:hAnsi="Arial" w:cs="Arial"/>
+                <w:b w:val="0"/>
+                <w:i w:val="0"/>
+                <w:sz w:val="18"/>
+              </w:rPr>
+              <w:t>11</w:t>
+            </w:r>
+          </w:p>
+        </w:tc>
+        <w:tc>
+          <w:tcPr>
+            <w:tcW w:type="dxa" w:w="1701"/>
+          </w:tcPr>
+          <w:p>
+            <w:pPr>
+              <w:jc w:val="center"/>
+            </w:pPr>
+            <w:r/>
+            <w:r>
+              <w:rPr>
+                <w:rFonts w:ascii="Arial" w:hAnsi="Arial" w:cs="Arial"/>
+                <w:b w:val="0"/>
+                <w:i w:val="0"/>
+                <w:sz w:val="18"/>
+              </w:rPr>
+              <w:t>09.01.2026</w:t>
+            </w:r>
+          </w:p>
+        </w:tc>
+        <w:tc>
+          <w:tcPr>
+            <w:tcW w:type="dxa" w:w="1701"/>
+          </w:tcPr>
+          <w:p>
+            <w:pPr>
+              <w:jc w:val="center"/>
+            </w:pPr>
+            <w:r/>
+            <w:r>
+              <w:rPr>
+                <w:rFonts w:ascii="Arial" w:hAnsi="Arial" w:cs="Arial"/>
+                <w:b w:val="0"/>
+                <w:i w:val="0"/>
+                <w:sz w:val="18"/>
+              </w:rPr>
+              <w:t>02.04.2026</w:t>
             </w:r>
           </w:p>
         </w:tc>
@@ -2177,27 +2173,27 @@
                 <w:i w:val="0"/>
                 <w:sz w:val="18"/>
               </w:rPr>
-              <w:t>Б-308</w:t>
-            </w:r>
-          </w:p>
-        </w:tc>
-        <w:tc>
-          <w:tcPr>
-            <w:tcW w:type="dxa" w:w="1701"/>
-          </w:tcPr>
-          <w:p>
-            <w:pPr>
-              <w:jc w:val="center"/>
-            </w:pPr>
-            <w:r/>
-            <w:r>
-              <w:rPr>
-                <w:rFonts w:ascii="Arial" w:hAnsi="Arial" w:cs="Arial"/>
-                <w:b w:val="0"/>
-                <w:i w:val="0"/>
-                <w:sz w:val="18"/>
-              </w:rPr>
-              <w:t>06.04.2026</w:t>
+              <w:t>1660</w:t>
+            </w:r>
+          </w:p>
+        </w:tc>
+        <w:tc>
+          <w:tcPr>
+            <w:tcW w:type="dxa" w:w="1701"/>
+          </w:tcPr>
+          <w:p>
+            <w:pPr>
+              <w:jc w:val="center"/>
+            </w:pPr>
+            <w:r/>
+            <w:r>
+              <w:rPr>
+                <w:rFonts w:ascii="Arial" w:hAnsi="Arial" w:cs="Arial"/>
+                <w:b w:val="0"/>
+                <w:i w:val="0"/>
+                <w:sz w:val="18"/>
+              </w:rPr>
+              <w:t>1</w:t>
             </w:r>
           </w:p>
         </w:tc>
@@ -2237,27 +2233,27 @@
                 <w:i w:val="0"/>
                 <w:sz w:val="18"/>
               </w:rPr>
-              <w:t>—</w:t>
-            </w:r>
-          </w:p>
-        </w:tc>
-        <w:tc>
-          <w:tcPr>
-            <w:tcW w:type="dxa" w:w="1701"/>
-          </w:tcPr>
-          <w:p>
-            <w:pPr>
-              <w:jc w:val="center"/>
-            </w:pPr>
-            <w:r/>
-            <w:r>
-              <w:rPr>
-                <w:rFonts w:ascii="Arial" w:hAnsi="Arial" w:cs="Arial"/>
-                <w:b w:val="0"/>
-                <w:i w:val="0"/>
-                <w:sz w:val="18"/>
-              </w:rPr>
-              <w:t>—</w:t>
+              <w:t>17.03.2026</w:t>
+            </w:r>
+          </w:p>
+        </w:tc>
+        <w:tc>
+          <w:tcPr>
+            <w:tcW w:type="dxa" w:w="1701"/>
+          </w:tcPr>
+          <w:p>
+            <w:pPr>
+              <w:jc w:val="center"/>
+            </w:pPr>
+            <w:r/>
+            <w:r>
+              <w:rPr>
+                <w:rFonts w:ascii="Arial" w:hAnsi="Arial" w:cs="Arial"/>
+                <w:b w:val="0"/>
+                <w:i w:val="0"/>
+                <w:sz w:val="18"/>
+              </w:rPr>
+              <w:t>17.03.2026</w:t>
             </w:r>
           </w:p>
         </w:tc>
@@ -2299,47 +2295,47 @@
                 <w:i w:val="0"/>
                 <w:sz w:val="18"/>
               </w:rPr>
-              <w:t>Б-309</w:t>
-            </w:r>
-          </w:p>
-        </w:tc>
-        <w:tc>
-          <w:tcPr>
-            <w:tcW w:type="dxa" w:w="1701"/>
-          </w:tcPr>
-          <w:p>
-            <w:pPr>
-              <w:jc w:val="center"/>
-            </w:pPr>
-            <w:r/>
-            <w:r>
-              <w:rPr>
-                <w:rFonts w:ascii="Arial" w:hAnsi="Arial" w:cs="Arial"/>
-                <w:b w:val="0"/>
-                <w:i w:val="0"/>
-                <w:sz w:val="18"/>
-              </w:rPr>
-              <w:t>16.04.2026</w:t>
-            </w:r>
-          </w:p>
-        </w:tc>
-        <w:tc>
-          <w:tcPr>
-            <w:tcW w:type="dxa" w:w="1701"/>
-          </w:tcPr>
-          <w:p>
-            <w:pPr>
-              <w:jc w:val="center"/>
-            </w:pPr>
-            <w:r/>
-            <w:r>
-              <w:rPr>
-                <w:rFonts w:ascii="Arial" w:hAnsi="Arial" w:cs="Arial"/>
-                <w:b w:val="0"/>
-                <w:i w:val="0"/>
-                <w:sz w:val="18"/>
-              </w:rPr>
-              <w:t>8</w:t>
+              <w:t>1661</w:t>
+            </w:r>
+          </w:p>
+        </w:tc>
+        <w:tc>
+          <w:tcPr>
+            <w:tcW w:type="dxa" w:w="1701"/>
+          </w:tcPr>
+          <w:p>
+            <w:pPr>
+              <w:jc w:val="center"/>
+            </w:pPr>
+            <w:r/>
+            <w:r>
+              <w:rPr>
+                <w:rFonts w:ascii="Arial" w:hAnsi="Arial" w:cs="Arial"/>
+                <w:b w:val="0"/>
+                <w:i w:val="0"/>
+                <w:sz w:val="18"/>
+              </w:rPr>
+              <w:t>1</w:t>
+            </w:r>
+          </w:p>
+        </w:tc>
+        <w:tc>
+          <w:tcPr>
+            <w:tcW w:type="dxa" w:w="1701"/>
+          </w:tcPr>
+          <w:p>
+            <w:pPr>
+              <w:jc w:val="center"/>
+            </w:pPr>
+            <w:r/>
+            <w:r>
+              <w:rPr>
+                <w:rFonts w:ascii="Arial" w:hAnsi="Arial" w:cs="Arial"/>
+                <w:b w:val="0"/>
+                <w:i w:val="0"/>
+                <w:sz w:val="18"/>
+              </w:rPr>
+              <w:t>3</w:t>
             </w:r>
           </w:p>
         </w:tc>
@@ -2379,7 +2375,7 @@
                 <w:i w:val="0"/>
                 <w:sz w:val="18"/>
               </w:rPr>
-              <w:t>2</w:t>
+              <w:t>23.06.2026</w:t>
             </w:r>
           </w:p>
         </w:tc>
@@ -2421,27 +2417,27 @@
                 <w:i w:val="0"/>
                 <w:sz w:val="18"/>
               </w:rPr>
-              <w:t>Б-310</w:t>
-            </w:r>
-          </w:p>
-        </w:tc>
-        <w:tc>
-          <w:tcPr>
-            <w:tcW w:type="dxa" w:w="1701"/>
-          </w:tcPr>
-          <w:p>
-            <w:pPr>
-              <w:jc w:val="center"/>
-            </w:pPr>
-            <w:r/>
-            <w:r>
-              <w:rPr>
-                <w:rFonts w:ascii="Arial" w:hAnsi="Arial" w:cs="Arial"/>
-                <w:b w:val="0"/>
-                <w:i w:val="0"/>
-                <w:sz w:val="18"/>
-              </w:rPr>
-              <w:t>09.04.2026</w:t>
+              <w:t>1662</w:t>
+            </w:r>
+          </w:p>
+        </w:tc>
+        <w:tc>
+          <w:tcPr>
+            <w:tcW w:type="dxa" w:w="1701"/>
+          </w:tcPr>
+          <w:p>
+            <w:pPr>
+              <w:jc w:val="center"/>
+            </w:pPr>
+            <w:r/>
+            <w:r>
+              <w:rPr>
+                <w:rFonts w:ascii="Arial" w:hAnsi="Arial" w:cs="Arial"/>
+                <w:b w:val="0"/>
+                <w:i w:val="0"/>
+                <w:sz w:val="18"/>
+              </w:rPr>
+              <w:t>3</w:t>
             </w:r>
           </w:p>
         </w:tc>
@@ -2481,27 +2477,27 @@
                 <w:i w:val="0"/>
                 <w:sz w:val="18"/>
               </w:rPr>
-              <w:t>—</w:t>
-            </w:r>
-          </w:p>
-        </w:tc>
-        <w:tc>
-          <w:tcPr>
-            <w:tcW w:type="dxa" w:w="1701"/>
-          </w:tcPr>
-          <w:p>
-            <w:pPr>
-              <w:jc w:val="center"/>
-            </w:pPr>
-            <w:r/>
-            <w:r>
-              <w:rPr>
-                <w:rFonts w:ascii="Arial" w:hAnsi="Arial" w:cs="Arial"/>
-                <w:b w:val="0"/>
-                <w:i w:val="0"/>
-                <w:sz w:val="18"/>
-              </w:rPr>
-              <w:t>—</w:t>
+              <w:t>21.06.2026</w:t>
+            </w:r>
+          </w:p>
+        </w:tc>
+        <w:tc>
+          <w:tcPr>
+            <w:tcW w:type="dxa" w:w="1701"/>
+          </w:tcPr>
+          <w:p>
+            <w:pPr>
+              <w:jc w:val="center"/>
+            </w:pPr>
+            <w:r/>
+            <w:r>
+              <w:rPr>
+                <w:rFonts w:ascii="Arial" w:hAnsi="Arial" w:cs="Arial"/>
+                <w:b w:val="0"/>
+                <w:i w:val="0"/>
+                <w:sz w:val="18"/>
+              </w:rPr>
+              <w:t>29.06.2026</w:t>
             </w:r>
           </w:p>
         </w:tc>
@@ -2523,227 +2519,106 @@
                 <w:i w:val="0"/>
                 <w:sz w:val="18"/>
               </w:rPr>
-              <w:t>11</w:t>
-            </w:r>
-          </w:p>
-        </w:tc>
-        <w:tc>
-          <w:tcPr>
-            <w:tcW w:type="dxa" w:w="1701"/>
-          </w:tcPr>
-          <w:p>
-            <w:pPr>
-              <w:jc w:val="center"/>
-            </w:pPr>
-            <w:r/>
-            <w:r>
-              <w:rPr>
-                <w:rFonts w:ascii="Arial" w:hAnsi="Arial" w:cs="Arial"/>
-                <w:b w:val="0"/>
-                <w:i w:val="0"/>
-                <w:sz w:val="18"/>
-              </w:rPr>
-              <w:t>Б-313</w:t>
-            </w:r>
-          </w:p>
-        </w:tc>
-        <w:tc>
-          <w:tcPr>
-            <w:tcW w:type="dxa" w:w="1701"/>
-          </w:tcPr>
-          <w:p>
-            <w:pPr>
-              <w:jc w:val="center"/>
-            </w:pPr>
-            <w:r/>
-            <w:r>
-              <w:rPr>
-                <w:rFonts w:ascii="Arial" w:hAnsi="Arial" w:cs="Arial"/>
-                <w:b w:val="0"/>
-                <w:i w:val="0"/>
-                <w:sz w:val="18"/>
-              </w:rPr>
-              <w:t>01.04.2026</w:t>
-            </w:r>
-          </w:p>
-        </w:tc>
-        <w:tc>
-          <w:tcPr>
-            <w:tcW w:type="dxa" w:w="1701"/>
-          </w:tcPr>
-          <w:p>
-            <w:pPr>
-              <w:jc w:val="center"/>
-            </w:pPr>
-            <w:r/>
-            <w:r>
-              <w:rPr>
-                <w:rFonts w:ascii="Arial" w:hAnsi="Arial" w:cs="Arial"/>
-                <w:b w:val="0"/>
-                <w:i w:val="0"/>
-                <w:sz w:val="18"/>
-              </w:rPr>
-              <w:t>8</w:t>
-            </w:r>
-          </w:p>
-        </w:tc>
-        <w:tc>
-          <w:tcPr>
-            <w:tcW w:type="dxa" w:w="1701"/>
-          </w:tcPr>
-          <w:p>
-            <w:pPr>
-              <w:jc w:val="center"/>
-            </w:pPr>
-            <w:r/>
-            <w:r>
-              <w:rPr>
-                <w:rFonts w:ascii="Arial" w:hAnsi="Arial" w:cs="Arial"/>
-                <w:b w:val="0"/>
-                <w:i w:val="0"/>
-                <w:sz w:val="18"/>
-              </w:rPr>
-              <w:t>—</w:t>
-            </w:r>
-          </w:p>
-        </w:tc>
-        <w:tc>
-          <w:tcPr>
-            <w:tcW w:type="dxa" w:w="1701"/>
-          </w:tcPr>
-          <w:p>
-            <w:pPr>
-              <w:jc w:val="center"/>
-            </w:pPr>
-            <w:r/>
-            <w:r>
-              <w:rPr>
-                <w:rFonts w:ascii="Arial" w:hAnsi="Arial" w:cs="Arial"/>
-                <w:b w:val="0"/>
-                <w:i w:val="0"/>
-                <w:sz w:val="18"/>
-              </w:rPr>
-              <w:t>—</w:t>
-            </w:r>
-          </w:p>
-        </w:tc>
-      </w:tr>
-      <w:tr>
-        <w:tc>
-          <w:tcPr>
-            <w:tcW w:type="dxa" w:w="1701"/>
-          </w:tcPr>
-          <w:p>
-            <w:pPr>
-              <w:jc w:val="center"/>
-            </w:pPr>
-            <w:r/>
-            <w:r>
-              <w:rPr>
-                <w:rFonts w:ascii="Arial" w:hAnsi="Arial" w:cs="Arial"/>
-                <w:b w:val="0"/>
-                <w:i w:val="0"/>
-                <w:sz w:val="18"/>
-              </w:rPr>
-            </w:r>
-          </w:p>
-        </w:tc>
-        <w:tc>
-          <w:tcPr>
-            <w:tcW w:type="dxa" w:w="1701"/>
-          </w:tcPr>
-          <w:p>
-            <w:pPr>
-              <w:jc w:val="center"/>
-            </w:pPr>
-            <w:r/>
-            <w:r>
-              <w:rPr>
-                <w:rFonts w:ascii="Arial" w:hAnsi="Arial" w:cs="Arial"/>
-                <w:b w:val="0"/>
-                <w:i w:val="0"/>
-                <w:sz w:val="18"/>
-              </w:rPr>
-              <w:t>ИТОГО</w:t>
-            </w:r>
-          </w:p>
-        </w:tc>
-        <w:tc>
-          <w:tcPr>
-            <w:tcW w:type="dxa" w:w="1701"/>
-          </w:tcPr>
-          <w:p>
-            <w:pPr>
-              <w:jc w:val="center"/>
-            </w:pPr>
-            <w:r/>
-            <w:r>
-              <w:rPr>
-                <w:rFonts w:ascii="Arial" w:hAnsi="Arial" w:cs="Arial"/>
-                <w:b w:val="0"/>
-                <w:i w:val="0"/>
-                <w:sz w:val="18"/>
-              </w:rPr>
-            </w:r>
-          </w:p>
-        </w:tc>
-        <w:tc>
-          <w:tcPr>
-            <w:tcW w:type="dxa" w:w="1701"/>
-          </w:tcPr>
-          <w:p>
-            <w:pPr>
-              <w:jc w:val="center"/>
-            </w:pPr>
-            <w:r/>
-            <w:r>
-              <w:rPr>
-                <w:rFonts w:ascii="Arial" w:hAnsi="Arial" w:cs="Arial"/>
-                <w:b w:val="0"/>
-                <w:i w:val="0"/>
-                <w:sz w:val="18"/>
-              </w:rPr>
-              <w:t>88</w:t>
-            </w:r>
-          </w:p>
-        </w:tc>
-        <w:tc>
-          <w:tcPr>
-            <w:tcW w:type="dxa" w:w="1701"/>
-          </w:tcPr>
-          <w:p>
-            <w:pPr>
-              <w:jc w:val="center"/>
-            </w:pPr>
-            <w:r/>
-            <w:r>
-              <w:rPr>
-                <w:rFonts w:ascii="Arial" w:hAnsi="Arial" w:cs="Arial"/>
-                <w:b w:val="0"/>
-                <w:i w:val="0"/>
-                <w:sz w:val="18"/>
-              </w:rPr>
-              <w:t>5 из 11 машин</w:t>
-            </w:r>
-          </w:p>
-        </w:tc>
-        <w:tc>
-          <w:tcPr>
-            <w:tcW w:type="dxa" w:w="1701"/>
-          </w:tcPr>
-          <w:p>
-            <w:pPr>
-              <w:jc w:val="center"/>
-            </w:pPr>
-            <w:r/>
-            <w:r>
-              <w:rPr>
-                <w:rFonts w:ascii="Arial" w:hAnsi="Arial" w:cs="Arial"/>
-                <w:b w:val="0"/>
-                <w:i w:val="0"/>
-                <w:sz w:val="18"/>
-              </w:rPr>
-              <w:t>18</w:t>
+            </w:r>
+          </w:p>
+        </w:tc>
+        <w:tc>
+          <w:tcPr>
+            <w:tcW w:type="dxa" w:w="1701"/>
+          </w:tcPr>
+          <w:p>
+            <w:pPr>
+              <w:jc w:val="center"/>
+            </w:pPr>
+            <w:r/>
+            <w:r>
+              <w:rPr>
+                <w:rFonts w:ascii="Arial" w:hAnsi="Arial" w:cs="Arial"/>
+                <w:b w:val="0"/>
+                <w:i w:val="0"/>
+                <w:sz w:val="18"/>
+              </w:rPr>
+              <w:t>ИТОГО (10 из 11 машин)</w:t>
+            </w:r>
+          </w:p>
+        </w:tc>
+        <w:tc>
+          <w:tcPr>
+            <w:tcW w:type="dxa" w:w="1701"/>
+          </w:tcPr>
+          <w:p>
+            <w:pPr>
+              <w:jc w:val="center"/>
+            </w:pPr>
+            <w:r/>
+            <w:r>
+              <w:rPr>
+                <w:rFonts w:ascii="Arial" w:hAnsi="Arial" w:cs="Arial"/>
+                <w:b w:val="0"/>
+                <w:i w:val="0"/>
+                <w:sz w:val="18"/>
+              </w:rPr>
+              <w:t>35</w:t>
+            </w:r>
+          </w:p>
+        </w:tc>
+        <w:tc>
+          <w:tcPr>
+            <w:tcW w:type="dxa" w:w="1701"/>
+          </w:tcPr>
+          <w:p>
+            <w:pPr>
+              <w:jc w:val="center"/>
+            </w:pPr>
+            <w:r/>
+            <w:r>
+              <w:rPr>
+                <w:rFonts w:ascii="Arial" w:hAnsi="Arial" w:cs="Arial"/>
+                <w:b w:val="0"/>
+                <w:i w:val="0"/>
+                <w:sz w:val="18"/>
+              </w:rPr>
+              <w:t>119</w:t>
+            </w:r>
+          </w:p>
+        </w:tc>
+        <w:tc>
+          <w:tcPr>
+            <w:tcW w:type="dxa" w:w="1701"/>
+          </w:tcPr>
+          <w:p>
+            <w:pPr>
+              <w:jc w:val="center"/>
+            </w:pPr>
+            <w:r/>
+            <w:r>
+              <w:rPr>
+                <w:rFonts w:ascii="Arial" w:hAnsi="Arial" w:cs="Arial"/>
+                <w:b w:val="0"/>
+                <w:i w:val="0"/>
+                <w:sz w:val="18"/>
+              </w:rPr>
+              <w:t>05.01.2026</w:t>
+            </w:r>
+          </w:p>
+        </w:tc>
+        <w:tc>
+          <w:tcPr>
+            <w:tcW w:type="dxa" w:w="1701"/>
+          </w:tcPr>
+          <w:p>
+            <w:pPr>
+              <w:jc w:val="center"/>
+            </w:pPr>
+            <w:r/>
+            <w:r>
+              <w:rPr>
+                <w:rFonts w:ascii="Arial" w:hAnsi="Arial" w:cs="Arial"/>
+                <w:b w:val="0"/>
+                <w:i w:val="0"/>
+                <w:sz w:val="18"/>
+              </w:rPr>
+              <w:t>29.06.2026</w:t>
             </w:r>
           </w:p>
         </w:tc>
@@ -2760,7 +2635,7 @@
           <w:i w:val="0"/>
           <w:sz w:val="20"/>
         </w:rPr>
-        <w:t>Несмотря на полную замену секций резисторов на всех 11 машинах в рамках отзывной кампании (март–апрель 2026г., 88 секций), уже на 5 из 11 машин зафиксирован повторный выход секций из строя (ещё 18 секций) в течение 1–3 месяцев после замены.</w:t>
+        <w:t>С января по июнь 2026г. на 10 из 11 машин зафиксировано 35 отдельных случаев выхода из строя секций резисторов УВТР, заменено 119 секций — то есть фактически полный комплект секций (8 шт.) на каждой машине заменён более одного раза за полугодие.</w:t>
       </w:r>
     </w:p>
     <w:p>
@@ -2828,7 +2703,7 @@
                 <w:i w:val="0"/>
                 <w:sz w:val="18"/>
               </w:rPr>
-              <w:t>Машина №</w:t>
+              <w:t>Гаражный №</w:t>
             </w:r>
           </w:p>
         </w:tc>
@@ -2848,9 +2723,9 @@
                 <w:i w:val="0"/>
                 <w:sz w:val="18"/>
               </w:rPr>
-              <w:t>Кол-во замен</w:t>
+              <w:t>Замена по отзывной</w:t>
               <w:br/>
-              <w:t>(событий)</w:t>
+              <w:t>кампании, дата</w:t>
             </w:r>
           </w:p>
         </w:tc>
@@ -2870,9 +2745,9 @@
                 <w:i w:val="0"/>
                 <w:sz w:val="18"/>
               </w:rPr>
-              <w:t>Секций</w:t>
+              <w:t>Секций,</w:t>
               <w:br/>
-              <w:t>заменено, шт</w:t>
+              <w:t>шт</w:t>
             </w:r>
           </w:p>
         </w:tc>
@@ -2892,7 +2767,9 @@
                 <w:i w:val="0"/>
                 <w:sz w:val="18"/>
               </w:rPr>
-              <w:t>Первая замена</w:t>
+              <w:t>Повторная замена</w:t>
+              <w:br/>
+              <w:t>после кампании, дата</w:t>
             </w:r>
           </w:p>
         </w:tc>
@@ -2912,7 +2789,9 @@
                 <w:i w:val="0"/>
                 <w:sz w:val="18"/>
               </w:rPr>
-              <w:t>Последняя замена</w:t>
+              <w:t>Секций,</w:t>
+              <w:br/>
+              <w:t>шт</w:t>
             </w:r>
           </w:p>
         </w:tc>
@@ -2954,87 +2833,87 @@
                 <w:i w:val="0"/>
                 <w:sz w:val="18"/>
               </w:rPr>
-              <w:t>1653</w:t>
-            </w:r>
-          </w:p>
-        </w:tc>
-        <w:tc>
-          <w:tcPr>
-            <w:tcW w:type="dxa" w:w="1701"/>
-          </w:tcPr>
-          <w:p>
-            <w:pPr>
-              <w:jc w:val="center"/>
-            </w:pPr>
-            <w:r/>
-            <w:r>
-              <w:rPr>
-                <w:rFonts w:ascii="Arial" w:hAnsi="Arial" w:cs="Arial"/>
-                <w:b w:val="0"/>
-                <w:i w:val="0"/>
-                <w:sz w:val="18"/>
-              </w:rPr>
-              <w:t>7</w:t>
-            </w:r>
-          </w:p>
-        </w:tc>
-        <w:tc>
-          <w:tcPr>
-            <w:tcW w:type="dxa" w:w="1701"/>
-          </w:tcPr>
-          <w:p>
-            <w:pPr>
-              <w:jc w:val="center"/>
-            </w:pPr>
-            <w:r/>
-            <w:r>
-              <w:rPr>
-                <w:rFonts w:ascii="Arial" w:hAnsi="Arial" w:cs="Arial"/>
-                <w:b w:val="0"/>
-                <w:i w:val="0"/>
-                <w:sz w:val="18"/>
-              </w:rPr>
-              <w:t>20</w:t>
-            </w:r>
-          </w:p>
-        </w:tc>
-        <w:tc>
-          <w:tcPr>
-            <w:tcW w:type="dxa" w:w="1701"/>
-          </w:tcPr>
-          <w:p>
-            <w:pPr>
-              <w:jc w:val="center"/>
-            </w:pPr>
-            <w:r/>
-            <w:r>
-              <w:rPr>
-                <w:rFonts w:ascii="Arial" w:hAnsi="Arial" w:cs="Arial"/>
-                <w:b w:val="0"/>
-                <w:i w:val="0"/>
-                <w:sz w:val="18"/>
-              </w:rPr>
-              <w:t>17.01.2026</w:t>
-            </w:r>
-          </w:p>
-        </w:tc>
-        <w:tc>
-          <w:tcPr>
-            <w:tcW w:type="dxa" w:w="1701"/>
-          </w:tcPr>
-          <w:p>
-            <w:pPr>
-              <w:jc w:val="center"/>
-            </w:pPr>
-            <w:r/>
-            <w:r>
-              <w:rPr>
-                <w:rFonts w:ascii="Arial" w:hAnsi="Arial" w:cs="Arial"/>
-                <w:b w:val="0"/>
-                <w:i w:val="0"/>
-                <w:sz w:val="18"/>
-              </w:rPr>
-              <w:t>27.06.2026</w:t>
+              <w:t>Б-301</w:t>
+            </w:r>
+          </w:p>
+        </w:tc>
+        <w:tc>
+          <w:tcPr>
+            <w:tcW w:type="dxa" w:w="1701"/>
+          </w:tcPr>
+          <w:p>
+            <w:pPr>
+              <w:jc w:val="center"/>
+            </w:pPr>
+            <w:r/>
+            <w:r>
+              <w:rPr>
+                <w:rFonts w:ascii="Arial" w:hAnsi="Arial" w:cs="Arial"/>
+                <w:b w:val="0"/>
+                <w:i w:val="0"/>
+                <w:sz w:val="18"/>
+              </w:rPr>
+              <w:t>13.04.2026</w:t>
+            </w:r>
+          </w:p>
+        </w:tc>
+        <w:tc>
+          <w:tcPr>
+            <w:tcW w:type="dxa" w:w="1701"/>
+          </w:tcPr>
+          <w:p>
+            <w:pPr>
+              <w:jc w:val="center"/>
+            </w:pPr>
+            <w:r/>
+            <w:r>
+              <w:rPr>
+                <w:rFonts w:ascii="Arial" w:hAnsi="Arial" w:cs="Arial"/>
+                <w:b w:val="0"/>
+                <w:i w:val="0"/>
+                <w:sz w:val="18"/>
+              </w:rPr>
+              <w:t>8</w:t>
+            </w:r>
+          </w:p>
+        </w:tc>
+        <w:tc>
+          <w:tcPr>
+            <w:tcW w:type="dxa" w:w="1701"/>
+          </w:tcPr>
+          <w:p>
+            <w:pPr>
+              <w:jc w:val="center"/>
+            </w:pPr>
+            <w:r/>
+            <w:r>
+              <w:rPr>
+                <w:rFonts w:ascii="Arial" w:hAnsi="Arial" w:cs="Arial"/>
+                <w:b w:val="0"/>
+                <w:i w:val="0"/>
+                <w:sz w:val="18"/>
+              </w:rPr>
+              <w:t>—</w:t>
+            </w:r>
+          </w:p>
+        </w:tc>
+        <w:tc>
+          <w:tcPr>
+            <w:tcW w:type="dxa" w:w="1701"/>
+          </w:tcPr>
+          <w:p>
+            <w:pPr>
+              <w:jc w:val="center"/>
+            </w:pPr>
+            <w:r/>
+            <w:r>
+              <w:rPr>
+                <w:rFonts w:ascii="Arial" w:hAnsi="Arial" w:cs="Arial"/>
+                <w:b w:val="0"/>
+                <w:i w:val="0"/>
+                <w:sz w:val="18"/>
+              </w:rPr>
+              <w:t>—</w:t>
             </w:r>
           </w:p>
         </w:tc>
@@ -3076,87 +2955,87 @@
                 <w:i w:val="0"/>
                 <w:sz w:val="18"/>
               </w:rPr>
-              <w:t>1654</w:t>
-            </w:r>
-          </w:p>
-        </w:tc>
-        <w:tc>
-          <w:tcPr>
-            <w:tcW w:type="dxa" w:w="1701"/>
-          </w:tcPr>
-          <w:p>
-            <w:pPr>
-              <w:jc w:val="center"/>
-            </w:pPr>
-            <w:r/>
-            <w:r>
-              <w:rPr>
-                <w:rFonts w:ascii="Arial" w:hAnsi="Arial" w:cs="Arial"/>
-                <w:b w:val="0"/>
-                <w:i w:val="0"/>
-                <w:sz w:val="18"/>
-              </w:rPr>
-              <w:t>3</w:t>
-            </w:r>
-          </w:p>
-        </w:tc>
-        <w:tc>
-          <w:tcPr>
-            <w:tcW w:type="dxa" w:w="1701"/>
-          </w:tcPr>
-          <w:p>
-            <w:pPr>
-              <w:jc w:val="center"/>
-            </w:pPr>
-            <w:r/>
-            <w:r>
-              <w:rPr>
-                <w:rFonts w:ascii="Arial" w:hAnsi="Arial" w:cs="Arial"/>
-                <w:b w:val="0"/>
-                <w:i w:val="0"/>
-                <w:sz w:val="18"/>
-              </w:rPr>
-              <w:t>13</w:t>
-            </w:r>
-          </w:p>
-        </w:tc>
-        <w:tc>
-          <w:tcPr>
-            <w:tcW w:type="dxa" w:w="1701"/>
-          </w:tcPr>
-          <w:p>
-            <w:pPr>
-              <w:jc w:val="center"/>
-            </w:pPr>
-            <w:r/>
-            <w:r>
-              <w:rPr>
-                <w:rFonts w:ascii="Arial" w:hAnsi="Arial" w:cs="Arial"/>
-                <w:b w:val="0"/>
-                <w:i w:val="0"/>
-                <w:sz w:val="18"/>
-              </w:rPr>
-              <w:t>07.01.2026</w:t>
-            </w:r>
-          </w:p>
-        </w:tc>
-        <w:tc>
-          <w:tcPr>
-            <w:tcW w:type="dxa" w:w="1701"/>
-          </w:tcPr>
-          <w:p>
-            <w:pPr>
-              <w:jc w:val="center"/>
-            </w:pPr>
-            <w:r/>
-            <w:r>
-              <w:rPr>
-                <w:rFonts w:ascii="Arial" w:hAnsi="Arial" w:cs="Arial"/>
-                <w:b w:val="0"/>
-                <w:i w:val="0"/>
-                <w:sz w:val="18"/>
-              </w:rPr>
-              <w:t>21.03.2026</w:t>
+              <w:t>Б-302</w:t>
+            </w:r>
+          </w:p>
+        </w:tc>
+        <w:tc>
+          <w:tcPr>
+            <w:tcW w:type="dxa" w:w="1701"/>
+          </w:tcPr>
+          <w:p>
+            <w:pPr>
+              <w:jc w:val="center"/>
+            </w:pPr>
+            <w:r/>
+            <w:r>
+              <w:rPr>
+                <w:rFonts w:ascii="Arial" w:hAnsi="Arial" w:cs="Arial"/>
+                <w:b w:val="0"/>
+                <w:i w:val="0"/>
+                <w:sz w:val="18"/>
+              </w:rPr>
+              <w:t>31.03.2026</w:t>
+            </w:r>
+          </w:p>
+        </w:tc>
+        <w:tc>
+          <w:tcPr>
+            <w:tcW w:type="dxa" w:w="1701"/>
+          </w:tcPr>
+          <w:p>
+            <w:pPr>
+              <w:jc w:val="center"/>
+            </w:pPr>
+            <w:r/>
+            <w:r>
+              <w:rPr>
+                <w:rFonts w:ascii="Arial" w:hAnsi="Arial" w:cs="Arial"/>
+                <w:b w:val="0"/>
+                <w:i w:val="0"/>
+                <w:sz w:val="18"/>
+              </w:rPr>
+              <w:t>8</w:t>
+            </w:r>
+          </w:p>
+        </w:tc>
+        <w:tc>
+          <w:tcPr>
+            <w:tcW w:type="dxa" w:w="1701"/>
+          </w:tcPr>
+          <w:p>
+            <w:pPr>
+              <w:jc w:val="center"/>
+            </w:pPr>
+            <w:r/>
+            <w:r>
+              <w:rPr>
+                <w:rFonts w:ascii="Arial" w:hAnsi="Arial" w:cs="Arial"/>
+                <w:b w:val="0"/>
+                <w:i w:val="0"/>
+                <w:sz w:val="18"/>
+              </w:rPr>
+              <w:t>11.06.2026</w:t>
+            </w:r>
+          </w:p>
+        </w:tc>
+        <w:tc>
+          <w:tcPr>
+            <w:tcW w:type="dxa" w:w="1701"/>
+          </w:tcPr>
+          <w:p>
+            <w:pPr>
+              <w:jc w:val="center"/>
+            </w:pPr>
+            <w:r/>
+            <w:r>
+              <w:rPr>
+                <w:rFonts w:ascii="Arial" w:hAnsi="Arial" w:cs="Arial"/>
+                <w:b w:val="0"/>
+                <w:i w:val="0"/>
+                <w:sz w:val="18"/>
+              </w:rPr>
+              <w:t>4</w:t>
             </w:r>
           </w:p>
         </w:tc>
@@ -3198,7 +3077,27 @@
                 <w:i w:val="0"/>
                 <w:sz w:val="18"/>
               </w:rPr>
-              <w:t>1655</w:t>
+              <w:t>Б-303</w:t>
+            </w:r>
+          </w:p>
+        </w:tc>
+        <w:tc>
+          <w:tcPr>
+            <w:tcW w:type="dxa" w:w="1701"/>
+          </w:tcPr>
+          <w:p>
+            <w:pPr>
+              <w:jc w:val="center"/>
+            </w:pPr>
+            <w:r/>
+            <w:r>
+              <w:rPr>
+                <w:rFonts w:ascii="Arial" w:hAnsi="Arial" w:cs="Arial"/>
+                <w:b w:val="0"/>
+                <w:i w:val="0"/>
+                <w:sz w:val="18"/>
+              </w:rPr>
+              <w:t>08.04.2026</w:t>
             </w:r>
           </w:p>
         </w:tc>
@@ -3238,47 +3137,27 @@
                 <w:i w:val="0"/>
                 <w:sz w:val="18"/>
               </w:rPr>
-              <w:t>21</w:t>
-            </w:r>
-          </w:p>
-        </w:tc>
-        <w:tc>
-          <w:tcPr>
-            <w:tcW w:type="dxa" w:w="1701"/>
-          </w:tcPr>
-          <w:p>
-            <w:pPr>
-              <w:jc w:val="center"/>
-            </w:pPr>
-            <w:r/>
-            <w:r>
-              <w:rPr>
-                <w:rFonts w:ascii="Arial" w:hAnsi="Arial" w:cs="Arial"/>
-                <w:b w:val="0"/>
-                <w:i w:val="0"/>
-                <w:sz w:val="18"/>
-              </w:rPr>
-              <w:t>05.01.2026</w:t>
-            </w:r>
-          </w:p>
-        </w:tc>
-        <w:tc>
-          <w:tcPr>
-            <w:tcW w:type="dxa" w:w="1701"/>
-          </w:tcPr>
-          <w:p>
-            <w:pPr>
-              <w:jc w:val="center"/>
-            </w:pPr>
-            <w:r/>
-            <w:r>
-              <w:rPr>
-                <w:rFonts w:ascii="Arial" w:hAnsi="Arial" w:cs="Arial"/>
-                <w:b w:val="0"/>
-                <w:i w:val="0"/>
-                <w:sz w:val="18"/>
-              </w:rPr>
-              <w:t>26.06.2026</w:t>
+              <w:t>23–25.05.2026</w:t>
+            </w:r>
+          </w:p>
+        </w:tc>
+        <w:tc>
+          <w:tcPr>
+            <w:tcW w:type="dxa" w:w="1701"/>
+          </w:tcPr>
+          <w:p>
+            <w:pPr>
+              <w:jc w:val="center"/>
+            </w:pPr>
+            <w:r/>
+            <w:r>
+              <w:rPr>
+                <w:rFonts w:ascii="Arial" w:hAnsi="Arial" w:cs="Arial"/>
+                <w:b w:val="0"/>
+                <w:i w:val="0"/>
+                <w:sz w:val="18"/>
+              </w:rPr>
+              <w:t>8</w:t>
             </w:r>
           </w:p>
         </w:tc>
@@ -3320,87 +3199,87 @@
                 <w:i w:val="0"/>
                 <w:sz w:val="18"/>
               </w:rPr>
-              <w:t>1656</w:t>
-            </w:r>
-          </w:p>
-        </w:tc>
-        <w:tc>
-          <w:tcPr>
-            <w:tcW w:type="dxa" w:w="1701"/>
-          </w:tcPr>
-          <w:p>
-            <w:pPr>
-              <w:jc w:val="center"/>
-            </w:pPr>
-            <w:r/>
-            <w:r>
-              <w:rPr>
-                <w:rFonts w:ascii="Arial" w:hAnsi="Arial" w:cs="Arial"/>
-                <w:b w:val="0"/>
-                <w:i w:val="0"/>
-                <w:sz w:val="18"/>
-              </w:rPr>
-              <w:t>4</w:t>
-            </w:r>
-          </w:p>
-        </w:tc>
-        <w:tc>
-          <w:tcPr>
-            <w:tcW w:type="dxa" w:w="1701"/>
-          </w:tcPr>
-          <w:p>
-            <w:pPr>
-              <w:jc w:val="center"/>
-            </w:pPr>
-            <w:r/>
-            <w:r>
-              <w:rPr>
-                <w:rFonts w:ascii="Arial" w:hAnsi="Arial" w:cs="Arial"/>
-                <w:b w:val="0"/>
-                <w:i w:val="0"/>
-                <w:sz w:val="18"/>
-              </w:rPr>
-              <w:t>16</w:t>
-            </w:r>
-          </w:p>
-        </w:tc>
-        <w:tc>
-          <w:tcPr>
-            <w:tcW w:type="dxa" w:w="1701"/>
-          </w:tcPr>
-          <w:p>
-            <w:pPr>
-              <w:jc w:val="center"/>
-            </w:pPr>
-            <w:r/>
-            <w:r>
-              <w:rPr>
-                <w:rFonts w:ascii="Arial" w:hAnsi="Arial" w:cs="Arial"/>
-                <w:b w:val="0"/>
-                <w:i w:val="0"/>
-                <w:sz w:val="18"/>
-              </w:rPr>
-              <w:t>13.01.2026</w:t>
-            </w:r>
-          </w:p>
-        </w:tc>
-        <w:tc>
-          <w:tcPr>
-            <w:tcW w:type="dxa" w:w="1701"/>
-          </w:tcPr>
-          <w:p>
-            <w:pPr>
-              <w:jc w:val="center"/>
-            </w:pPr>
-            <w:r/>
-            <w:r>
-              <w:rPr>
-                <w:rFonts w:ascii="Arial" w:hAnsi="Arial" w:cs="Arial"/>
-                <w:b w:val="0"/>
-                <w:i w:val="0"/>
-                <w:sz w:val="18"/>
-              </w:rPr>
-              <w:t>14.04.2026</w:t>
+              <w:t>Б-304</w:t>
+            </w:r>
+          </w:p>
+        </w:tc>
+        <w:tc>
+          <w:tcPr>
+            <w:tcW w:type="dxa" w:w="1701"/>
+          </w:tcPr>
+          <w:p>
+            <w:pPr>
+              <w:jc w:val="center"/>
+            </w:pPr>
+            <w:r/>
+            <w:r>
+              <w:rPr>
+                <w:rFonts w:ascii="Arial" w:hAnsi="Arial" w:cs="Arial"/>
+                <w:b w:val="0"/>
+                <w:i w:val="0"/>
+                <w:sz w:val="18"/>
+              </w:rPr>
+              <w:t>02.04.2026</w:t>
+            </w:r>
+          </w:p>
+        </w:tc>
+        <w:tc>
+          <w:tcPr>
+            <w:tcW w:type="dxa" w:w="1701"/>
+          </w:tcPr>
+          <w:p>
+            <w:pPr>
+              <w:jc w:val="center"/>
+            </w:pPr>
+            <w:r/>
+            <w:r>
+              <w:rPr>
+                <w:rFonts w:ascii="Arial" w:hAnsi="Arial" w:cs="Arial"/>
+                <w:b w:val="0"/>
+                <w:i w:val="0"/>
+                <w:sz w:val="18"/>
+              </w:rPr>
+              <w:t>8</w:t>
+            </w:r>
+          </w:p>
+        </w:tc>
+        <w:tc>
+          <w:tcPr>
+            <w:tcW w:type="dxa" w:w="1701"/>
+          </w:tcPr>
+          <w:p>
+            <w:pPr>
+              <w:jc w:val="center"/>
+            </w:pPr>
+            <w:r/>
+            <w:r>
+              <w:rPr>
+                <w:rFonts w:ascii="Arial" w:hAnsi="Arial" w:cs="Arial"/>
+                <w:b w:val="0"/>
+                <w:i w:val="0"/>
+                <w:sz w:val="18"/>
+              </w:rPr>
+              <w:t>21.06.2026</w:t>
+            </w:r>
+          </w:p>
+        </w:tc>
+        <w:tc>
+          <w:tcPr>
+            <w:tcW w:type="dxa" w:w="1701"/>
+          </w:tcPr>
+          <w:p>
+            <w:pPr>
+              <w:jc w:val="center"/>
+            </w:pPr>
+            <w:r/>
+            <w:r>
+              <w:rPr>
+                <w:rFonts w:ascii="Arial" w:hAnsi="Arial" w:cs="Arial"/>
+                <w:b w:val="0"/>
+                <w:i w:val="0"/>
+                <w:sz w:val="18"/>
+              </w:rPr>
+              <w:t>1</w:t>
             </w:r>
           </w:p>
         </w:tc>
@@ -3442,87 +3321,87 @@
                 <w:i w:val="0"/>
                 <w:sz w:val="18"/>
               </w:rPr>
-              <w:t>1657</w:t>
-            </w:r>
-          </w:p>
-        </w:tc>
-        <w:tc>
-          <w:tcPr>
-            <w:tcW w:type="dxa" w:w="1701"/>
-          </w:tcPr>
-          <w:p>
-            <w:pPr>
-              <w:jc w:val="center"/>
-            </w:pPr>
-            <w:r/>
-            <w:r>
-              <w:rPr>
-                <w:rFonts w:ascii="Arial" w:hAnsi="Arial" w:cs="Arial"/>
-                <w:b w:val="0"/>
-                <w:i w:val="0"/>
-                <w:sz w:val="18"/>
-              </w:rPr>
-              <w:t>3</w:t>
-            </w:r>
-          </w:p>
-        </w:tc>
-        <w:tc>
-          <w:tcPr>
-            <w:tcW w:type="dxa" w:w="1701"/>
-          </w:tcPr>
-          <w:p>
-            <w:pPr>
-              <w:jc w:val="center"/>
-            </w:pPr>
-            <w:r/>
-            <w:r>
-              <w:rPr>
-                <w:rFonts w:ascii="Arial" w:hAnsi="Arial" w:cs="Arial"/>
-                <w:b w:val="0"/>
-                <w:i w:val="0"/>
-                <w:sz w:val="18"/>
-              </w:rPr>
-              <w:t>10</w:t>
-            </w:r>
-          </w:p>
-        </w:tc>
-        <w:tc>
-          <w:tcPr>
-            <w:tcW w:type="dxa" w:w="1701"/>
-          </w:tcPr>
-          <w:p>
-            <w:pPr>
-              <w:jc w:val="center"/>
-            </w:pPr>
-            <w:r/>
-            <w:r>
-              <w:rPr>
-                <w:rFonts w:ascii="Arial" w:hAnsi="Arial" w:cs="Arial"/>
-                <w:b w:val="0"/>
-                <w:i w:val="0"/>
-                <w:sz w:val="18"/>
-              </w:rPr>
-              <w:t>11.01.2026</w:t>
-            </w:r>
-          </w:p>
-        </w:tc>
-        <w:tc>
-          <w:tcPr>
-            <w:tcW w:type="dxa" w:w="1701"/>
-          </w:tcPr>
-          <w:p>
-            <w:pPr>
-              <w:jc w:val="center"/>
-            </w:pPr>
-            <w:r/>
-            <w:r>
-              <w:rPr>
-                <w:rFonts w:ascii="Arial" w:hAnsi="Arial" w:cs="Arial"/>
-                <w:b w:val="0"/>
-                <w:i w:val="0"/>
-                <w:sz w:val="18"/>
-              </w:rPr>
-              <w:t>09.03.2026</w:t>
+              <w:t>Б-305</w:t>
+            </w:r>
+          </w:p>
+        </w:tc>
+        <w:tc>
+          <w:tcPr>
+            <w:tcW w:type="dxa" w:w="1701"/>
+          </w:tcPr>
+          <w:p>
+            <w:pPr>
+              <w:jc w:val="center"/>
+            </w:pPr>
+            <w:r/>
+            <w:r>
+              <w:rPr>
+                <w:rFonts w:ascii="Arial" w:hAnsi="Arial" w:cs="Arial"/>
+                <w:b w:val="0"/>
+                <w:i w:val="0"/>
+                <w:sz w:val="18"/>
+              </w:rPr>
+              <w:t>02.04.2026</w:t>
+            </w:r>
+          </w:p>
+        </w:tc>
+        <w:tc>
+          <w:tcPr>
+            <w:tcW w:type="dxa" w:w="1701"/>
+          </w:tcPr>
+          <w:p>
+            <w:pPr>
+              <w:jc w:val="center"/>
+            </w:pPr>
+            <w:r/>
+            <w:r>
+              <w:rPr>
+                <w:rFonts w:ascii="Arial" w:hAnsi="Arial" w:cs="Arial"/>
+                <w:b w:val="0"/>
+                <w:i w:val="0"/>
+                <w:sz w:val="18"/>
+              </w:rPr>
+              <w:t>8</w:t>
+            </w:r>
+          </w:p>
+        </w:tc>
+        <w:tc>
+          <w:tcPr>
+            <w:tcW w:type="dxa" w:w="1701"/>
+          </w:tcPr>
+          <w:p>
+            <w:pPr>
+              <w:jc w:val="center"/>
+            </w:pPr>
+            <w:r/>
+            <w:r>
+              <w:rPr>
+                <w:rFonts w:ascii="Arial" w:hAnsi="Arial" w:cs="Arial"/>
+                <w:b w:val="0"/>
+                <w:i w:val="0"/>
+                <w:sz w:val="18"/>
+              </w:rPr>
+              <w:t>—</w:t>
+            </w:r>
+          </w:p>
+        </w:tc>
+        <w:tc>
+          <w:tcPr>
+            <w:tcW w:type="dxa" w:w="1701"/>
+          </w:tcPr>
+          <w:p>
+            <w:pPr>
+              <w:jc w:val="center"/>
+            </w:pPr>
+            <w:r/>
+            <w:r>
+              <w:rPr>
+                <w:rFonts w:ascii="Arial" w:hAnsi="Arial" w:cs="Arial"/>
+                <w:b w:val="0"/>
+                <w:i w:val="0"/>
+                <w:sz w:val="18"/>
+              </w:rPr>
+              <w:t>—</w:t>
             </w:r>
           </w:p>
         </w:tc>
@@ -3564,87 +3443,87 @@
                 <w:i w:val="0"/>
                 <w:sz w:val="18"/>
               </w:rPr>
-              <w:t>1658</w:t>
-            </w:r>
-          </w:p>
-        </w:tc>
-        <w:tc>
-          <w:tcPr>
-            <w:tcW w:type="dxa" w:w="1701"/>
-          </w:tcPr>
-          <w:p>
-            <w:pPr>
-              <w:jc w:val="center"/>
-            </w:pPr>
-            <w:r/>
-            <w:r>
-              <w:rPr>
-                <w:rFonts w:ascii="Arial" w:hAnsi="Arial" w:cs="Arial"/>
-                <w:b w:val="0"/>
-                <w:i w:val="0"/>
-                <w:sz w:val="18"/>
-              </w:rPr>
-              <w:t>2</w:t>
-            </w:r>
-          </w:p>
-        </w:tc>
-        <w:tc>
-          <w:tcPr>
-            <w:tcW w:type="dxa" w:w="1701"/>
-          </w:tcPr>
-          <w:p>
-            <w:pPr>
-              <w:jc w:val="center"/>
-            </w:pPr>
-            <w:r/>
-            <w:r>
-              <w:rPr>
-                <w:rFonts w:ascii="Arial" w:hAnsi="Arial" w:cs="Arial"/>
-                <w:b w:val="0"/>
-                <w:i w:val="0"/>
-                <w:sz w:val="18"/>
-              </w:rPr>
-              <w:t>9</w:t>
-            </w:r>
-          </w:p>
-        </w:tc>
-        <w:tc>
-          <w:tcPr>
-            <w:tcW w:type="dxa" w:w="1701"/>
-          </w:tcPr>
-          <w:p>
-            <w:pPr>
-              <w:jc w:val="center"/>
-            </w:pPr>
-            <w:r/>
-            <w:r>
-              <w:rPr>
-                <w:rFonts w:ascii="Arial" w:hAnsi="Arial" w:cs="Arial"/>
-                <w:b w:val="0"/>
-                <w:i w:val="0"/>
-                <w:sz w:val="18"/>
-              </w:rPr>
-              <w:t>20.03.2026</w:t>
-            </w:r>
-          </w:p>
-        </w:tc>
-        <w:tc>
-          <w:tcPr>
-            <w:tcW w:type="dxa" w:w="1701"/>
-          </w:tcPr>
-          <w:p>
-            <w:pPr>
-              <w:jc w:val="center"/>
-            </w:pPr>
-            <w:r/>
-            <w:r>
-              <w:rPr>
-                <w:rFonts w:ascii="Arial" w:hAnsi="Arial" w:cs="Arial"/>
-                <w:b w:val="0"/>
-                <w:i w:val="0"/>
-                <w:sz w:val="18"/>
-              </w:rPr>
-              <w:t>16.04.2026</w:t>
+              <w:t>Б-306</w:t>
+            </w:r>
+          </w:p>
+        </w:tc>
+        <w:tc>
+          <w:tcPr>
+            <w:tcW w:type="dxa" w:w="1701"/>
+          </w:tcPr>
+          <w:p>
+            <w:pPr>
+              <w:jc w:val="center"/>
+            </w:pPr>
+            <w:r/>
+            <w:r>
+              <w:rPr>
+                <w:rFonts w:ascii="Arial" w:hAnsi="Arial" w:cs="Arial"/>
+                <w:b w:val="0"/>
+                <w:i w:val="0"/>
+                <w:sz w:val="18"/>
+              </w:rPr>
+              <w:t>07.04.2026</w:t>
+            </w:r>
+          </w:p>
+        </w:tc>
+        <w:tc>
+          <w:tcPr>
+            <w:tcW w:type="dxa" w:w="1701"/>
+          </w:tcPr>
+          <w:p>
+            <w:pPr>
+              <w:jc w:val="center"/>
+            </w:pPr>
+            <w:r/>
+            <w:r>
+              <w:rPr>
+                <w:rFonts w:ascii="Arial" w:hAnsi="Arial" w:cs="Arial"/>
+                <w:b w:val="0"/>
+                <w:i w:val="0"/>
+                <w:sz w:val="18"/>
+              </w:rPr>
+              <w:t>8</w:t>
+            </w:r>
+          </w:p>
+        </w:tc>
+        <w:tc>
+          <w:tcPr>
+            <w:tcW w:type="dxa" w:w="1701"/>
+          </w:tcPr>
+          <w:p>
+            <w:pPr>
+              <w:jc w:val="center"/>
+            </w:pPr>
+            <w:r/>
+            <w:r>
+              <w:rPr>
+                <w:rFonts w:ascii="Arial" w:hAnsi="Arial" w:cs="Arial"/>
+                <w:b w:val="0"/>
+                <w:i w:val="0"/>
+                <w:sz w:val="18"/>
+              </w:rPr>
+              <w:t>—</w:t>
+            </w:r>
+          </w:p>
+        </w:tc>
+        <w:tc>
+          <w:tcPr>
+            <w:tcW w:type="dxa" w:w="1701"/>
+          </w:tcPr>
+          <w:p>
+            <w:pPr>
+              <w:jc w:val="center"/>
+            </w:pPr>
+            <w:r/>
+            <w:r>
+              <w:rPr>
+                <w:rFonts w:ascii="Arial" w:hAnsi="Arial" w:cs="Arial"/>
+                <w:b w:val="0"/>
+                <w:i w:val="0"/>
+                <w:sz w:val="18"/>
+              </w:rPr>
+              <w:t>—</w:t>
             </w:r>
           </w:p>
         </w:tc>
@@ -3686,7 +3565,67 @@
                 <w:i w:val="0"/>
                 <w:sz w:val="18"/>
               </w:rPr>
-              <w:t>1659</w:t>
+              <w:t>Б-307</w:t>
+            </w:r>
+          </w:p>
+        </w:tc>
+        <w:tc>
+          <w:tcPr>
+            <w:tcW w:type="dxa" w:w="1701"/>
+          </w:tcPr>
+          <w:p>
+            <w:pPr>
+              <w:jc w:val="center"/>
+            </w:pPr>
+            <w:r/>
+            <w:r>
+              <w:rPr>
+                <w:rFonts w:ascii="Arial" w:hAnsi="Arial" w:cs="Arial"/>
+                <w:b w:val="0"/>
+                <w:i w:val="0"/>
+                <w:sz w:val="18"/>
+              </w:rPr>
+              <w:t>30.03.2026</w:t>
+            </w:r>
+          </w:p>
+        </w:tc>
+        <w:tc>
+          <w:tcPr>
+            <w:tcW w:type="dxa" w:w="1701"/>
+          </w:tcPr>
+          <w:p>
+            <w:pPr>
+              <w:jc w:val="center"/>
+            </w:pPr>
+            <w:r/>
+            <w:r>
+              <w:rPr>
+                <w:rFonts w:ascii="Arial" w:hAnsi="Arial" w:cs="Arial"/>
+                <w:b w:val="0"/>
+                <w:i w:val="0"/>
+                <w:sz w:val="18"/>
+              </w:rPr>
+              <w:t>8</w:t>
+            </w:r>
+          </w:p>
+        </w:tc>
+        <w:tc>
+          <w:tcPr>
+            <w:tcW w:type="dxa" w:w="1701"/>
+          </w:tcPr>
+          <w:p>
+            <w:pPr>
+              <w:jc w:val="center"/>
+            </w:pPr>
+            <w:r/>
+            <w:r>
+              <w:rPr>
+                <w:rFonts w:ascii="Arial" w:hAnsi="Arial" w:cs="Arial"/>
+                <w:b w:val="0"/>
+                <w:i w:val="0"/>
+                <w:sz w:val="18"/>
+              </w:rPr>
+              <w:t>18.05.2026</w:t>
             </w:r>
           </w:p>
         </w:tc>
@@ -3707,66 +3646,6 @@
                 <w:sz w:val="18"/>
               </w:rPr>
               <w:t>3</w:t>
-            </w:r>
-          </w:p>
-        </w:tc>
-        <w:tc>
-          <w:tcPr>
-            <w:tcW w:type="dxa" w:w="1701"/>
-          </w:tcPr>
-          <w:p>
-            <w:pPr>
-              <w:jc w:val="center"/>
-            </w:pPr>
-            <w:r/>
-            <w:r>
-              <w:rPr>
-                <w:rFonts w:ascii="Arial" w:hAnsi="Arial" w:cs="Arial"/>
-                <w:b w:val="0"/>
-                <w:i w:val="0"/>
-                <w:sz w:val="18"/>
-              </w:rPr>
-              <w:t>11</w:t>
-            </w:r>
-          </w:p>
-        </w:tc>
-        <w:tc>
-          <w:tcPr>
-            <w:tcW w:type="dxa" w:w="1701"/>
-          </w:tcPr>
-          <w:p>
-            <w:pPr>
-              <w:jc w:val="center"/>
-            </w:pPr>
-            <w:r/>
-            <w:r>
-              <w:rPr>
-                <w:rFonts w:ascii="Arial" w:hAnsi="Arial" w:cs="Arial"/>
-                <w:b w:val="0"/>
-                <w:i w:val="0"/>
-                <w:sz w:val="18"/>
-              </w:rPr>
-              <w:t>09.01.2026</w:t>
-            </w:r>
-          </w:p>
-        </w:tc>
-        <w:tc>
-          <w:tcPr>
-            <w:tcW w:type="dxa" w:w="1701"/>
-          </w:tcPr>
-          <w:p>
-            <w:pPr>
-              <w:jc w:val="center"/>
-            </w:pPr>
-            <w:r/>
-            <w:r>
-              <w:rPr>
-                <w:rFonts w:ascii="Arial" w:hAnsi="Arial" w:cs="Arial"/>
-                <w:b w:val="0"/>
-                <w:i w:val="0"/>
-                <w:sz w:val="18"/>
-              </w:rPr>
-              <w:t>02.04.2026</w:t>
             </w:r>
           </w:p>
         </w:tc>
@@ -3808,27 +3687,27 @@
                 <w:i w:val="0"/>
                 <w:sz w:val="18"/>
               </w:rPr>
-              <w:t>1660</w:t>
-            </w:r>
-          </w:p>
-        </w:tc>
-        <w:tc>
-          <w:tcPr>
-            <w:tcW w:type="dxa" w:w="1701"/>
-          </w:tcPr>
-          <w:p>
-            <w:pPr>
-              <w:jc w:val="center"/>
-            </w:pPr>
-            <w:r/>
-            <w:r>
-              <w:rPr>
-                <w:rFonts w:ascii="Arial" w:hAnsi="Arial" w:cs="Arial"/>
-                <w:b w:val="0"/>
-                <w:i w:val="0"/>
-                <w:sz w:val="18"/>
-              </w:rPr>
-              <w:t>1</w:t>
+              <w:t>Б-308</w:t>
+            </w:r>
+          </w:p>
+        </w:tc>
+        <w:tc>
+          <w:tcPr>
+            <w:tcW w:type="dxa" w:w="1701"/>
+          </w:tcPr>
+          <w:p>
+            <w:pPr>
+              <w:jc w:val="center"/>
+            </w:pPr>
+            <w:r/>
+            <w:r>
+              <w:rPr>
+                <w:rFonts w:ascii="Arial" w:hAnsi="Arial" w:cs="Arial"/>
+                <w:b w:val="0"/>
+                <w:i w:val="0"/>
+                <w:sz w:val="18"/>
+              </w:rPr>
+              <w:t>06.04.2026</w:t>
             </w:r>
           </w:p>
         </w:tc>
@@ -3868,27 +3747,27 @@
                 <w:i w:val="0"/>
                 <w:sz w:val="18"/>
               </w:rPr>
-              <w:t>17.03.2026</w:t>
-            </w:r>
-          </w:p>
-        </w:tc>
-        <w:tc>
-          <w:tcPr>
-            <w:tcW w:type="dxa" w:w="1701"/>
-          </w:tcPr>
-          <w:p>
-            <w:pPr>
-              <w:jc w:val="center"/>
-            </w:pPr>
-            <w:r/>
-            <w:r>
-              <w:rPr>
-                <w:rFonts w:ascii="Arial" w:hAnsi="Arial" w:cs="Arial"/>
-                <w:b w:val="0"/>
-                <w:i w:val="0"/>
-                <w:sz w:val="18"/>
-              </w:rPr>
-              <w:t>17.03.2026</w:t>
+              <w:t>—</w:t>
+            </w:r>
+          </w:p>
+        </w:tc>
+        <w:tc>
+          <w:tcPr>
+            <w:tcW w:type="dxa" w:w="1701"/>
+          </w:tcPr>
+          <w:p>
+            <w:pPr>
+              <w:jc w:val="center"/>
+            </w:pPr>
+            <w:r/>
+            <w:r>
+              <w:rPr>
+                <w:rFonts w:ascii="Arial" w:hAnsi="Arial" w:cs="Arial"/>
+                <w:b w:val="0"/>
+                <w:i w:val="0"/>
+                <w:sz w:val="18"/>
+              </w:rPr>
+              <w:t>—</w:t>
             </w:r>
           </w:p>
         </w:tc>
@@ -3930,47 +3809,47 @@
                 <w:i w:val="0"/>
                 <w:sz w:val="18"/>
               </w:rPr>
-              <w:t>1661</w:t>
-            </w:r>
-          </w:p>
-        </w:tc>
-        <w:tc>
-          <w:tcPr>
-            <w:tcW w:type="dxa" w:w="1701"/>
-          </w:tcPr>
-          <w:p>
-            <w:pPr>
-              <w:jc w:val="center"/>
-            </w:pPr>
-            <w:r/>
-            <w:r>
-              <w:rPr>
-                <w:rFonts w:ascii="Arial" w:hAnsi="Arial" w:cs="Arial"/>
-                <w:b w:val="0"/>
-                <w:i w:val="0"/>
-                <w:sz w:val="18"/>
-              </w:rPr>
-              <w:t>1</w:t>
-            </w:r>
-          </w:p>
-        </w:tc>
-        <w:tc>
-          <w:tcPr>
-            <w:tcW w:type="dxa" w:w="1701"/>
-          </w:tcPr>
-          <w:p>
-            <w:pPr>
-              <w:jc w:val="center"/>
-            </w:pPr>
-            <w:r/>
-            <w:r>
-              <w:rPr>
-                <w:rFonts w:ascii="Arial" w:hAnsi="Arial" w:cs="Arial"/>
-                <w:b w:val="0"/>
-                <w:i w:val="0"/>
-                <w:sz w:val="18"/>
-              </w:rPr>
-              <w:t>3</w:t>
+              <w:t>Б-309</w:t>
+            </w:r>
+          </w:p>
+        </w:tc>
+        <w:tc>
+          <w:tcPr>
+            <w:tcW w:type="dxa" w:w="1701"/>
+          </w:tcPr>
+          <w:p>
+            <w:pPr>
+              <w:jc w:val="center"/>
+            </w:pPr>
+            <w:r/>
+            <w:r>
+              <w:rPr>
+                <w:rFonts w:ascii="Arial" w:hAnsi="Arial" w:cs="Arial"/>
+                <w:b w:val="0"/>
+                <w:i w:val="0"/>
+                <w:sz w:val="18"/>
+              </w:rPr>
+              <w:t>16.04.2026</w:t>
+            </w:r>
+          </w:p>
+        </w:tc>
+        <w:tc>
+          <w:tcPr>
+            <w:tcW w:type="dxa" w:w="1701"/>
+          </w:tcPr>
+          <w:p>
+            <w:pPr>
+              <w:jc w:val="center"/>
+            </w:pPr>
+            <w:r/>
+            <w:r>
+              <w:rPr>
+                <w:rFonts w:ascii="Arial" w:hAnsi="Arial" w:cs="Arial"/>
+                <w:b w:val="0"/>
+                <w:i w:val="0"/>
+                <w:sz w:val="18"/>
+              </w:rPr>
+              <w:t>8</w:t>
             </w:r>
           </w:p>
         </w:tc>
@@ -4010,7 +3889,7 @@
                 <w:i w:val="0"/>
                 <w:sz w:val="18"/>
               </w:rPr>
-              <w:t>23.06.2026</w:t>
+              <w:t>2</w:t>
             </w:r>
           </w:p>
         </w:tc>
@@ -4052,27 +3931,27 @@
                 <w:i w:val="0"/>
                 <w:sz w:val="18"/>
               </w:rPr>
-              <w:t>1662</w:t>
-            </w:r>
-          </w:p>
-        </w:tc>
-        <w:tc>
-          <w:tcPr>
-            <w:tcW w:type="dxa" w:w="1701"/>
-          </w:tcPr>
-          <w:p>
-            <w:pPr>
-              <w:jc w:val="center"/>
-            </w:pPr>
-            <w:r/>
-            <w:r>
-              <w:rPr>
-                <w:rFonts w:ascii="Arial" w:hAnsi="Arial" w:cs="Arial"/>
-                <w:b w:val="0"/>
-                <w:i w:val="0"/>
-                <w:sz w:val="18"/>
-              </w:rPr>
-              <w:t>3</w:t>
+              <w:t>Б-310</w:t>
+            </w:r>
+          </w:p>
+        </w:tc>
+        <w:tc>
+          <w:tcPr>
+            <w:tcW w:type="dxa" w:w="1701"/>
+          </w:tcPr>
+          <w:p>
+            <w:pPr>
+              <w:jc w:val="center"/>
+            </w:pPr>
+            <w:r/>
+            <w:r>
+              <w:rPr>
+                <w:rFonts w:ascii="Arial" w:hAnsi="Arial" w:cs="Arial"/>
+                <w:b w:val="0"/>
+                <w:i w:val="0"/>
+                <w:sz w:val="18"/>
+              </w:rPr>
+              <w:t>09.04.2026</w:t>
             </w:r>
           </w:p>
         </w:tc>
@@ -4112,27 +3991,27 @@
                 <w:i w:val="0"/>
                 <w:sz w:val="18"/>
               </w:rPr>
-              <w:t>21.06.2026</w:t>
-            </w:r>
-          </w:p>
-        </w:tc>
-        <w:tc>
-          <w:tcPr>
-            <w:tcW w:type="dxa" w:w="1701"/>
-          </w:tcPr>
-          <w:p>
-            <w:pPr>
-              <w:jc w:val="center"/>
-            </w:pPr>
-            <w:r/>
-            <w:r>
-              <w:rPr>
-                <w:rFonts w:ascii="Arial" w:hAnsi="Arial" w:cs="Arial"/>
-                <w:b w:val="0"/>
-                <w:i w:val="0"/>
-                <w:sz w:val="18"/>
-              </w:rPr>
-              <w:t>29.06.2026</w:t>
+              <w:t>—</w:t>
+            </w:r>
+          </w:p>
+        </w:tc>
+        <w:tc>
+          <w:tcPr>
+            <w:tcW w:type="dxa" w:w="1701"/>
+          </w:tcPr>
+          <w:p>
+            <w:pPr>
+              <w:jc w:val="center"/>
+            </w:pPr>
+            <w:r/>
+            <w:r>
+              <w:rPr>
+                <w:rFonts w:ascii="Arial" w:hAnsi="Arial" w:cs="Arial"/>
+                <w:b w:val="0"/>
+                <w:i w:val="0"/>
+                <w:sz w:val="18"/>
+              </w:rPr>
+              <w:t>—</w:t>
             </w:r>
           </w:p>
         </w:tc>
@@ -4154,6 +4033,128 @@
                 <w:i w:val="0"/>
                 <w:sz w:val="18"/>
               </w:rPr>
+              <w:t>11</w:t>
+            </w:r>
+          </w:p>
+        </w:tc>
+        <w:tc>
+          <w:tcPr>
+            <w:tcW w:type="dxa" w:w="1701"/>
+          </w:tcPr>
+          <w:p>
+            <w:pPr>
+              <w:jc w:val="center"/>
+            </w:pPr>
+            <w:r/>
+            <w:r>
+              <w:rPr>
+                <w:rFonts w:ascii="Arial" w:hAnsi="Arial" w:cs="Arial"/>
+                <w:b w:val="0"/>
+                <w:i w:val="0"/>
+                <w:sz w:val="18"/>
+              </w:rPr>
+              <w:t>Б-313</w:t>
+            </w:r>
+          </w:p>
+        </w:tc>
+        <w:tc>
+          <w:tcPr>
+            <w:tcW w:type="dxa" w:w="1701"/>
+          </w:tcPr>
+          <w:p>
+            <w:pPr>
+              <w:jc w:val="center"/>
+            </w:pPr>
+            <w:r/>
+            <w:r>
+              <w:rPr>
+                <w:rFonts w:ascii="Arial" w:hAnsi="Arial" w:cs="Arial"/>
+                <w:b w:val="0"/>
+                <w:i w:val="0"/>
+                <w:sz w:val="18"/>
+              </w:rPr>
+              <w:t>01.04.2026</w:t>
+            </w:r>
+          </w:p>
+        </w:tc>
+        <w:tc>
+          <w:tcPr>
+            <w:tcW w:type="dxa" w:w="1701"/>
+          </w:tcPr>
+          <w:p>
+            <w:pPr>
+              <w:jc w:val="center"/>
+            </w:pPr>
+            <w:r/>
+            <w:r>
+              <w:rPr>
+                <w:rFonts w:ascii="Arial" w:hAnsi="Arial" w:cs="Arial"/>
+                <w:b w:val="0"/>
+                <w:i w:val="0"/>
+                <w:sz w:val="18"/>
+              </w:rPr>
+              <w:t>8</w:t>
+            </w:r>
+          </w:p>
+        </w:tc>
+        <w:tc>
+          <w:tcPr>
+            <w:tcW w:type="dxa" w:w="1701"/>
+          </w:tcPr>
+          <w:p>
+            <w:pPr>
+              <w:jc w:val="center"/>
+            </w:pPr>
+            <w:r/>
+            <w:r>
+              <w:rPr>
+                <w:rFonts w:ascii="Arial" w:hAnsi="Arial" w:cs="Arial"/>
+                <w:b w:val="0"/>
+                <w:i w:val="0"/>
+                <w:sz w:val="18"/>
+              </w:rPr>
+              <w:t>—</w:t>
+            </w:r>
+          </w:p>
+        </w:tc>
+        <w:tc>
+          <w:tcPr>
+            <w:tcW w:type="dxa" w:w="1701"/>
+          </w:tcPr>
+          <w:p>
+            <w:pPr>
+              <w:jc w:val="center"/>
+            </w:pPr>
+            <w:r/>
+            <w:r>
+              <w:rPr>
+                <w:rFonts w:ascii="Arial" w:hAnsi="Arial" w:cs="Arial"/>
+                <w:b w:val="0"/>
+                <w:i w:val="0"/>
+                <w:sz w:val="18"/>
+              </w:rPr>
+              <w:t>—</w:t>
+            </w:r>
+          </w:p>
+        </w:tc>
+      </w:tr>
+      <w:tr>
+        <w:tc>
+          <w:tcPr>
+            <w:tcW w:type="dxa" w:w="1701"/>
+          </w:tcPr>
+          <w:p>
+            <w:pPr>
+              <w:jc w:val="center"/>
+            </w:pPr>
+            <w:r/>
+            <w:r>
+              <w:rPr>
+                <w:rFonts w:ascii="Arial" w:hAnsi="Arial" w:cs="Arial"/>
+                <w:b w:val="0"/>
+                <w:i w:val="0"/>
+                <w:sz w:val="18"/>
+              </w:rPr>
             </w:r>
           </w:p>
         </w:tc>
@@ -4193,67 +4194,66 @@
                 <w:i w:val="0"/>
                 <w:sz w:val="18"/>
               </w:rPr>
-              <w:t>35</w:t>
-            </w:r>
-          </w:p>
-        </w:tc>
-        <w:tc>
-          <w:tcPr>
-            <w:tcW w:type="dxa" w:w="1701"/>
-          </w:tcPr>
-          <w:p>
-            <w:pPr>
-              <w:jc w:val="center"/>
-            </w:pPr>
-            <w:r/>
-            <w:r>
-              <w:rPr>
-                <w:rFonts w:ascii="Arial" w:hAnsi="Arial" w:cs="Arial"/>
-                <w:b w:val="0"/>
-                <w:i w:val="0"/>
-                <w:sz w:val="18"/>
-              </w:rPr>
-              <w:t>119</w:t>
-            </w:r>
-          </w:p>
-        </w:tc>
-        <w:tc>
-          <w:tcPr>
-            <w:tcW w:type="dxa" w:w="1701"/>
-          </w:tcPr>
-          <w:p>
-            <w:pPr>
-              <w:jc w:val="center"/>
-            </w:pPr>
-            <w:r/>
-            <w:r>
-              <w:rPr>
-                <w:rFonts w:ascii="Arial" w:hAnsi="Arial" w:cs="Arial"/>
-                <w:b w:val="0"/>
-                <w:i w:val="0"/>
-                <w:sz w:val="18"/>
-              </w:rPr>
-              <w:t>05.01.2026</w:t>
-            </w:r>
-          </w:p>
-        </w:tc>
-        <w:tc>
-          <w:tcPr>
-            <w:tcW w:type="dxa" w:w="1701"/>
-          </w:tcPr>
-          <w:p>
-            <w:pPr>
-              <w:jc w:val="center"/>
-            </w:pPr>
-            <w:r/>
-            <w:r>
-              <w:rPr>
-                <w:rFonts w:ascii="Arial" w:hAnsi="Arial" w:cs="Arial"/>
-                <w:b w:val="0"/>
-                <w:i w:val="0"/>
-                <w:sz w:val="18"/>
-              </w:rPr>
-              <w:t>29.06.2026</w:t>
+            </w:r>
+          </w:p>
+        </w:tc>
+        <w:tc>
+          <w:tcPr>
+            <w:tcW w:type="dxa" w:w="1701"/>
+          </w:tcPr>
+          <w:p>
+            <w:pPr>
+              <w:jc w:val="center"/>
+            </w:pPr>
+            <w:r/>
+            <w:r>
+              <w:rPr>
+                <w:rFonts w:ascii="Arial" w:hAnsi="Arial" w:cs="Arial"/>
+                <w:b w:val="0"/>
+                <w:i w:val="0"/>
+                <w:sz w:val="18"/>
+              </w:rPr>
+              <w:t>88</w:t>
+            </w:r>
+          </w:p>
+        </w:tc>
+        <w:tc>
+          <w:tcPr>
+            <w:tcW w:type="dxa" w:w="1701"/>
+          </w:tcPr>
+          <w:p>
+            <w:pPr>
+              <w:jc w:val="center"/>
+            </w:pPr>
+            <w:r/>
+            <w:r>
+              <w:rPr>
+                <w:rFonts w:ascii="Arial" w:hAnsi="Arial" w:cs="Arial"/>
+                <w:b w:val="0"/>
+                <w:i w:val="0"/>
+                <w:sz w:val="18"/>
+              </w:rPr>
+              <w:t>5 из 11 машин</w:t>
+            </w:r>
+          </w:p>
+        </w:tc>
+        <w:tc>
+          <w:tcPr>
+            <w:tcW w:type="dxa" w:w="1701"/>
+          </w:tcPr>
+          <w:p>
+            <w:pPr>
+              <w:jc w:val="center"/>
+            </w:pPr>
+            <w:r/>
+            <w:r>
+              <w:rPr>
+                <w:rFonts w:ascii="Arial" w:hAnsi="Arial" w:cs="Arial"/>
+                <w:b w:val="0"/>
+                <w:i w:val="0"/>
+                <w:sz w:val="18"/>
+              </w:rPr>
+              <w:t>18</w:t>
             </w:r>
           </w:p>
         </w:tc>
@@ -4270,7 +4270,7 @@
           <w:i w:val="0"/>
           <w:sz w:val="20"/>
         </w:rPr>
-        <w:t>С января по июнь 2026г. зафиксировано 35 отдельных случаев выхода из строя секций резисторов УВТР на 10 из 11 машин парка, заменено 119 секций — то есть фактически полный комплект секций (8 шт.) на каждой машине заменён более одного раза за полугодие.</w:t>
+        <w:t>Несмотря на полную замену секций резисторов на всех 11 машинах в рамках отзывной кампании (март–апрель 2026г., 88 секций), уже на 5 из 11 машин зафиксирован повторный выход секций из строя (ещё 18 секций) в течение 1–3 месяцев после замены.</w:t>
       </w:r>
     </w:p>
     <w:sectPr>

</xml_diff>